<commit_message>
Edits to first lecture
</commit_message>
<xml_diff>
--- a/Lecture 00 - Intro/Spring2025_DATASCI_530_Syllabus.docx
+++ b/Lecture 00 - Intro/Spring2025_DATASCI_530_Syllabus.docx
@@ -1,6 +1,6 @@
 
 <file path=word/document.xml><?xml version="1.0" encoding="utf-8"?>
-<w:document xmlns:wpc="http://schemas.microsoft.com/office/word/2010/wordprocessingCanvas" xmlns:cx="http://schemas.microsoft.com/office/drawing/2014/chartex" xmlns:cx1="http://schemas.microsoft.com/office/drawing/2015/9/8/chartex" xmlns:cx2="http://schemas.microsoft.com/office/drawing/2015/10/21/chartex" xmlns:cx3="http://schemas.microsoft.com/office/drawing/2016/5/9/chartex" xmlns:cx4="http://schemas.microsoft.com/office/drawing/2016/5/10/chartex" xmlns:cx5="http://schemas.microsoft.com/office/drawing/2016/5/11/chartex" xmlns:cx6="http://schemas.microsoft.com/office/drawing/2016/5/12/chartex" xmlns:cx7="http://schemas.microsoft.com/office/drawing/2016/5/13/chartex" xmlns:cx8="http://schemas.microsoft.com/office/drawing/2016/5/14/chartex" xmlns:mc="http://schemas.openxmlformats.org/markup-compatibility/2006" xmlns:aink="http://schemas.microsoft.com/office/drawing/2016/ink" xmlns:am3d="http://schemas.microsoft.com/office/drawing/2017/model3d" xmlns:o="urn:schemas-microsoft-com:office:office" xmlns:oel="http://schemas.microsoft.com/office/2019/extlst" xmlns:r="http://schemas.openxmlformats.org/officeDocument/2006/relationships" xmlns:m="http://schemas.openxmlformats.org/officeDocument/2006/math" xmlns:v="urn:schemas-microsoft-com:vml" xmlns:wp14="http://schemas.microsoft.com/office/word/2010/wordprocessingDrawing" xmlns:wp="http://schemas.openxmlformats.org/drawingml/2006/wordprocessingDrawing" xmlns:w10="urn:schemas-microsoft-com:office:word" xmlns:w="http://schemas.openxmlformats.org/wordprocessingml/2006/main" xmlns:w14="http://schemas.microsoft.com/office/word/2010/wordml" xmlns:w15="http://schemas.microsoft.com/office/word/2012/wordml" xmlns:w16cex="http://schemas.microsoft.com/office/word/2018/wordml/cex" xmlns:w16cid="http://schemas.microsoft.com/office/word/2016/wordml/cid" xmlns:w16="http://schemas.microsoft.com/office/word/2018/wordml" xmlns:w16du="http://schemas.microsoft.com/office/word/2023/wordml/word16du" xmlns:w16sdtdh="http://schemas.microsoft.com/office/word/2020/wordml/sdtdatahash" xmlns:w16se="http://schemas.microsoft.com/office/word/2015/wordml/symex" xmlns:wpg="http://schemas.microsoft.com/office/word/2010/wordprocessingGroup" xmlns:wpi="http://schemas.microsoft.com/office/word/2010/wordprocessingInk" xmlns:wne="http://schemas.microsoft.com/office/word/2006/wordml" xmlns:wps="http://schemas.microsoft.com/office/word/2010/wordprocessingShape" mc:Ignorable="w14 w15 w16se w16cid w16 w16cex w16sdtdh w16du wp14">
+<w:document xmlns:wpc="http://schemas.microsoft.com/office/word/2010/wordprocessingCanvas" xmlns:cx="http://schemas.microsoft.com/office/drawing/2014/chartex" xmlns:cx1="http://schemas.microsoft.com/office/drawing/2015/9/8/chartex" xmlns:cx2="http://schemas.microsoft.com/office/drawing/2015/10/21/chartex" xmlns:cx3="http://schemas.microsoft.com/office/drawing/2016/5/9/chartex" xmlns:cx4="http://schemas.microsoft.com/office/drawing/2016/5/10/chartex" xmlns:cx5="http://schemas.microsoft.com/office/drawing/2016/5/11/chartex" xmlns:cx6="http://schemas.microsoft.com/office/drawing/2016/5/12/chartex" xmlns:cx7="http://schemas.microsoft.com/office/drawing/2016/5/13/chartex" xmlns:cx8="http://schemas.microsoft.com/office/drawing/2016/5/14/chartex" xmlns:mc="http://schemas.openxmlformats.org/markup-compatibility/2006" xmlns:aink="http://schemas.microsoft.com/office/drawing/2016/ink" xmlns:am3d="http://schemas.microsoft.com/office/drawing/2017/model3d" xmlns:o="urn:schemas-microsoft-com:office:office" xmlns:oel="http://schemas.microsoft.com/office/2019/extlst" xmlns:r="http://schemas.openxmlformats.org/officeDocument/2006/relationships" xmlns:m="http://schemas.openxmlformats.org/officeDocument/2006/math" xmlns:v="urn:schemas-microsoft-com:vml" xmlns:wp14="http://schemas.microsoft.com/office/word/2010/wordprocessingDrawing" xmlns:wp="http://schemas.openxmlformats.org/drawingml/2006/wordprocessingDrawing" xmlns:w10="urn:schemas-microsoft-com:office:word" xmlns:w="http://schemas.openxmlformats.org/wordprocessingml/2006/main" xmlns:w14="http://schemas.microsoft.com/office/word/2010/wordml" xmlns:w15="http://schemas.microsoft.com/office/word/2012/wordml" xmlns:w16cex="http://schemas.microsoft.com/office/word/2018/wordml/cex" xmlns:w16cid="http://schemas.microsoft.com/office/word/2016/wordml/cid" xmlns:w16="http://schemas.microsoft.com/office/word/2018/wordml" xmlns:w16du="http://schemas.microsoft.com/office/word/2023/wordml/word16du" xmlns:w16sdtdh="http://schemas.microsoft.com/office/word/2020/wordml/sdtdatahash" xmlns:w16sdtfl="http://schemas.microsoft.com/office/word/2024/wordml/sdtformatlock" xmlns:w16se="http://schemas.microsoft.com/office/word/2015/wordml/symex" xmlns:wpg="http://schemas.microsoft.com/office/word/2010/wordprocessingGroup" xmlns:wpi="http://schemas.microsoft.com/office/word/2010/wordprocessingInk" xmlns:wne="http://schemas.microsoft.com/office/word/2006/wordml" xmlns:wps="http://schemas.microsoft.com/office/word/2010/wordprocessingShape" mc:Ignorable="w14 w15 w16se w16cid w16 w16cex w16sdtdh w16sdtfl w16du wp14">
   <w:body>
     <w:p>
       <w:pPr>
@@ -104,7 +104,7 @@
           <w:sz w:val="22"/>
           <w:szCs w:val="22"/>
         </w:rPr>
-        <w:t>5</w:t>
+        <w:t>6</w:t>
       </w:r>
     </w:p>
     <w:p>
@@ -191,21 +191,12 @@
           <w:lang w:val="fr-FR"/>
         </w:rPr>
       </w:pPr>
-      <w:proofErr w:type="gramStart"/>
       <w:r>
         <w:rPr>
           <w:rFonts w:ascii="Segoe UI Light" w:hAnsi="Segoe UI Light" w:cs="Segoe UI Light"/>
           <w:lang w:val="fr-FR"/>
         </w:rPr>
-        <w:t>Office:</w:t>
-      </w:r>
-      <w:proofErr w:type="gramEnd"/>
-      <w:r>
-        <w:rPr>
-          <w:rFonts w:ascii="Segoe UI Light" w:hAnsi="Segoe UI Light" w:cs="Segoe UI Light"/>
-          <w:lang w:val="fr-FR"/>
-        </w:rPr>
-        <w:t xml:space="preserve"> Psychology and </w:t>
+        <w:t xml:space="preserve">Office: Psychology and </w:t>
       </w:r>
       <w:proofErr w:type="spellStart"/>
       <w:r>
@@ -483,25 +474,7 @@
           <w:sz w:val="22"/>
           <w:szCs w:val="22"/>
         </w:rPr>
-        <w:t xml:space="preserve">) know how to </w:t>
-      </w:r>
-      <w:proofErr w:type="gramStart"/>
-      <w:r>
-        <w:rPr>
-          <w:rFonts w:ascii="Segoe UI Light" w:hAnsi="Segoe UI Light" w:cs="Segoe UI Light"/>
-          <w:sz w:val="22"/>
-          <w:szCs w:val="22"/>
-        </w:rPr>
-        <w:t>make  reproducible</w:t>
-      </w:r>
-      <w:proofErr w:type="gramEnd"/>
-      <w:r>
-        <w:rPr>
-          <w:rFonts w:ascii="Segoe UI Light" w:hAnsi="Segoe UI Light" w:cs="Segoe UI Light"/>
-          <w:sz w:val="22"/>
-          <w:szCs w:val="22"/>
-        </w:rPr>
-        <w:t xml:space="preserve"> </w:t>
+        <w:t xml:space="preserve">) know how to make  reproducible </w:t>
       </w:r>
       <w:r>
         <w:rPr>
@@ -517,25 +490,7 @@
           <w:sz w:val="22"/>
           <w:szCs w:val="22"/>
         </w:rPr>
-        <w:t xml:space="preserve">by understanding from the development and source control to the deployment. Students would primarily write code in </w:t>
-      </w:r>
-      <w:proofErr w:type="spellStart"/>
-      <w:r>
-        <w:rPr>
-          <w:rFonts w:ascii="Segoe UI Light" w:hAnsi="Segoe UI Light" w:cs="Segoe UI Light"/>
-          <w:sz w:val="22"/>
-          <w:szCs w:val="22"/>
-        </w:rPr>
-        <w:t>Jupyter</w:t>
-      </w:r>
-      <w:proofErr w:type="spellEnd"/>
-      <w:r>
-        <w:rPr>
-          <w:rFonts w:ascii="Segoe UI Light" w:hAnsi="Segoe UI Light" w:cs="Segoe UI Light"/>
-          <w:sz w:val="22"/>
-          <w:szCs w:val="22"/>
-        </w:rPr>
-        <w:t>/</w:t>
+        <w:t>by understanding from the development and source control to the deployment. Students would primarily write code in Jupyter/</w:t>
       </w:r>
       <w:proofErr w:type="spellStart"/>
       <w:r>
@@ -606,21 +561,7 @@
         <w:rPr>
           <w:rFonts w:ascii="Segoe UI Light" w:hAnsi="Segoe UI Light" w:cs="Segoe UI Light"/>
         </w:rPr>
-        <w:t xml:space="preserve">The class will be entirely based </w:t>
-      </w:r>
-      <w:proofErr w:type="gramStart"/>
-      <w:r>
-        <w:rPr>
-          <w:rFonts w:ascii="Segoe UI Light" w:hAnsi="Segoe UI Light" w:cs="Segoe UI Light"/>
-        </w:rPr>
-        <w:t>off of</w:t>
-      </w:r>
-      <w:proofErr w:type="gramEnd"/>
-      <w:r>
-        <w:rPr>
-          <w:rFonts w:ascii="Segoe UI Light" w:hAnsi="Segoe UI Light" w:cs="Segoe UI Light"/>
-        </w:rPr>
-        <w:t xml:space="preserve"> lectures provided by the instructor for each class and stored in the following </w:t>
+        <w:t xml:space="preserve">The class will be entirely based off of lectures provided by the instructor for each class and stored in the following </w:t>
       </w:r>
       <w:proofErr w:type="spellStart"/>
       <w:r>
@@ -851,33 +792,15 @@
           <w:sz w:val="22"/>
           <w:szCs w:val="22"/>
         </w:rPr>
-        <w:t xml:space="preserve">[FPP] Foundations of Python </w:t>
-      </w:r>
-      <w:proofErr w:type="gramStart"/>
-      <w:r>
-        <w:rPr>
-          <w:rFonts w:ascii="Segoe UI Light" w:hAnsi="Segoe UI Light" w:cs="Segoe UI Light"/>
-          <w:sz w:val="22"/>
-          <w:szCs w:val="22"/>
-        </w:rPr>
-        <w:t xml:space="preserve">Programming </w:t>
-      </w:r>
-      <w:r>
-        <w:rPr>
-          <w:rFonts w:ascii="Segoe UI Light" w:hAnsi="Segoe UI Light" w:cs="Segoe UI Light"/>
-          <w:sz w:val="22"/>
-          <w:szCs w:val="22"/>
-        </w:rPr>
-        <w:t xml:space="preserve"> --------</w:t>
-      </w:r>
-      <w:proofErr w:type="gramEnd"/>
-      <w:r>
-        <w:rPr>
-          <w:rFonts w:ascii="Segoe UI Light" w:hAnsi="Segoe UI Light" w:cs="Segoe UI Light"/>
-          <w:sz w:val="22"/>
-          <w:szCs w:val="22"/>
-        </w:rPr>
-        <w:t xml:space="preserve"> </w:t>
+        <w:t xml:space="preserve">[FPP] Foundations of Python Programming </w:t>
+      </w:r>
+      <w:r>
+        <w:rPr>
+          <w:rFonts w:ascii="Segoe UI Light" w:hAnsi="Segoe UI Light" w:cs="Segoe UI Light"/>
+          <w:sz w:val="22"/>
+          <w:szCs w:val="22"/>
+        </w:rPr>
+        <w:t xml:space="preserve"> -------- </w:t>
       </w:r>
     </w:p>
     <w:p>
@@ -1106,43 +1029,7 @@
           <w:sz w:val="22"/>
           <w:szCs w:val="22"/>
         </w:rPr>
-        <w:t xml:space="preserve">[BB] Bash for Beginners [BB], by </w:t>
-      </w:r>
-      <w:proofErr w:type="spellStart"/>
-      <w:r>
-        <w:rPr>
-          <w:rFonts w:ascii="Segoe UI Light" w:hAnsi="Segoe UI Light" w:cs="Segoe UI Light"/>
-          <w:sz w:val="22"/>
-          <w:szCs w:val="22"/>
-        </w:rPr>
-        <w:t>Machtelt</w:t>
-      </w:r>
-      <w:proofErr w:type="spellEnd"/>
-      <w:r>
-        <w:rPr>
-          <w:rFonts w:ascii="Segoe UI Light" w:hAnsi="Segoe UI Light" w:cs="Segoe UI Light"/>
-          <w:sz w:val="22"/>
-          <w:szCs w:val="22"/>
-        </w:rPr>
-        <w:t xml:space="preserve"> </w:t>
-      </w:r>
-      <w:proofErr w:type="spellStart"/>
-      <w:r>
-        <w:rPr>
-          <w:rFonts w:ascii="Segoe UI Light" w:hAnsi="Segoe UI Light" w:cs="Segoe UI Light"/>
-          <w:sz w:val="22"/>
-          <w:szCs w:val="22"/>
-        </w:rPr>
-        <w:t>Garrels</w:t>
-      </w:r>
-      <w:proofErr w:type="spellEnd"/>
-      <w:r>
-        <w:rPr>
-          <w:rFonts w:ascii="Segoe UI Light" w:hAnsi="Segoe UI Light" w:cs="Segoe UI Light"/>
-          <w:sz w:val="22"/>
-          <w:szCs w:val="22"/>
-        </w:rPr>
-        <w:t>,</w:t>
+        <w:t>[BB] Bash for Beginners [BB], by Machtelt Garrels,</w:t>
       </w:r>
     </w:p>
     <w:p>
@@ -1179,43 +1066,7 @@
           <w:sz w:val="22"/>
           <w:szCs w:val="22"/>
         </w:rPr>
-        <w:t xml:space="preserve">[IL] Introduction to Linux [IL], by </w:t>
-      </w:r>
-      <w:proofErr w:type="spellStart"/>
-      <w:r>
-        <w:rPr>
-          <w:rFonts w:ascii="Segoe UI Light" w:hAnsi="Segoe UI Light" w:cs="Segoe UI Light"/>
-          <w:sz w:val="22"/>
-          <w:szCs w:val="22"/>
-        </w:rPr>
-        <w:t>Machtelt</w:t>
-      </w:r>
-      <w:proofErr w:type="spellEnd"/>
-      <w:r>
-        <w:rPr>
-          <w:rFonts w:ascii="Segoe UI Light" w:hAnsi="Segoe UI Light" w:cs="Segoe UI Light"/>
-          <w:sz w:val="22"/>
-          <w:szCs w:val="22"/>
-        </w:rPr>
-        <w:t xml:space="preserve"> </w:t>
-      </w:r>
-      <w:proofErr w:type="spellStart"/>
-      <w:r>
-        <w:rPr>
-          <w:rFonts w:ascii="Segoe UI Light" w:hAnsi="Segoe UI Light" w:cs="Segoe UI Light"/>
-          <w:sz w:val="22"/>
-          <w:szCs w:val="22"/>
-        </w:rPr>
-        <w:t>Garrels</w:t>
-      </w:r>
-      <w:proofErr w:type="spellEnd"/>
-      <w:r>
-        <w:rPr>
-          <w:rFonts w:ascii="Segoe UI Light" w:hAnsi="Segoe UI Light" w:cs="Segoe UI Light"/>
-          <w:sz w:val="22"/>
-          <w:szCs w:val="22"/>
-        </w:rPr>
-        <w:t xml:space="preserve">, </w:t>
+        <w:t xml:space="preserve">[IL] Introduction to Linux [IL], by Machtelt Garrels, </w:t>
       </w:r>
     </w:p>
     <w:p>
@@ -1541,6 +1392,60 @@
           <w:szCs w:val="22"/>
         </w:rPr>
         <w:t>(10%)</w:t>
+      </w:r>
+    </w:p>
+    <w:p>
+      <w:pPr>
+        <w:pStyle w:val="Default"/>
+        <w:spacing w:after="23"/>
+        <w:rPr>
+          <w:rFonts w:ascii="Segoe UI Light" w:hAnsi="Segoe UI Light" w:cs="Segoe UI Light"/>
+          <w:sz w:val="22"/>
+          <w:szCs w:val="22"/>
+        </w:rPr>
+      </w:pPr>
+    </w:p>
+    <w:p>
+      <w:pPr>
+        <w:pStyle w:val="Default"/>
+        <w:spacing w:after="23"/>
+        <w:rPr>
+          <w:rFonts w:ascii="Segoe UI Light" w:hAnsi="Segoe UI Light" w:cs="Segoe UI Light"/>
+          <w:sz w:val="22"/>
+          <w:szCs w:val="22"/>
+        </w:rPr>
+      </w:pPr>
+      <w:r>
+        <w:rPr>
+          <w:rFonts w:ascii="Segoe UI Light" w:hAnsi="Segoe UI Light" w:cs="Segoe UI Light"/>
+          <w:sz w:val="22"/>
+          <w:szCs w:val="22"/>
+        </w:rPr>
+        <w:t>All assignments</w:t>
+      </w:r>
+      <w:r>
+        <w:rPr>
+          <w:rFonts w:ascii="Segoe UI Light" w:hAnsi="Segoe UI Light" w:cs="Segoe UI Light"/>
+          <w:sz w:val="22"/>
+          <w:szCs w:val="22"/>
+        </w:rPr>
+        <w:t xml:space="preserve"> may have additional </w:t>
+      </w:r>
+      <w:r>
+        <w:rPr>
+          <w:rFonts w:ascii="Segoe UI Light" w:hAnsi="Segoe UI Light" w:cs="Segoe UI Light"/>
+          <w:sz w:val="22"/>
+          <w:szCs w:val="22"/>
+        </w:rPr>
+        <w:t>in-</w:t>
+      </w:r>
+      <w:r>
+        <w:rPr>
+          <w:rFonts w:ascii="Segoe UI Light" w:hAnsi="Segoe UI Light" w:cs="Segoe UI Light"/>
+          <w:sz w:val="22"/>
+          <w:szCs w:val="22"/>
+        </w:rPr>
+        <w:t>class discussion components for grading.</w:t>
       </w:r>
     </w:p>
     <w:p>
@@ -2157,25 +2062,16 @@
           <w:sz w:val="22"/>
           <w:szCs w:val="22"/>
         </w:rPr>
-        <w:t xml:space="preserve">All students enrolled at Emory are expected to abide by the Emory College Honor Code. Any type of academic misconduct is not allowed which includes 1) receiving or giving information about the content or conduct of an examination knowing that the release of such information is not allowed and 2) plagiarizing, whether intentionally or unintentionally, in any assignment. For the activities that </w:t>
-      </w:r>
-      <w:proofErr w:type="gramStart"/>
-      <w:r>
-        <w:rPr>
-          <w:rFonts w:ascii="Segoe UI Light" w:hAnsi="Segoe UI Light" w:cs="Segoe UI Light"/>
-          <w:sz w:val="22"/>
-          <w:szCs w:val="22"/>
-        </w:rPr>
-        <w:t>are considered to be</w:t>
-      </w:r>
-      <w:proofErr w:type="gramEnd"/>
-      <w:r>
-        <w:rPr>
-          <w:rFonts w:ascii="Segoe UI Light" w:hAnsi="Segoe UI Light" w:cs="Segoe UI Light"/>
-          <w:sz w:val="22"/>
-          <w:szCs w:val="22"/>
-        </w:rPr>
-        <w:t xml:space="preserve"> academically dishonest, refer to the Honor Code: </w:t>
+        <w:t xml:space="preserve">All students enrolled at Emory are expected to abide by the Emory College Honor Code. Any type of academic misconduct is not allowed which includes 1) receiving or giving information about the content or conduct of an examination knowing that the release of such information is not allowed and </w:t>
+      </w:r>
+      <w:r>
+        <w:rPr>
+          <w:rFonts w:ascii="Segoe UI Light" w:hAnsi="Segoe UI Light" w:cs="Segoe UI Light"/>
+          <w:sz w:val="22"/>
+          <w:szCs w:val="22"/>
+        </w:rPr>
+        <w:lastRenderedPageBreak/>
+        <w:t xml:space="preserve">2) plagiarizing, whether intentionally or unintentionally, in any assignment. For the activities that are considered to be academically dishonest, refer to the Honor Code: </w:t>
       </w:r>
     </w:p>
     <w:p>
@@ -2672,7 +2568,7 @@
                 <w:sz w:val="22"/>
                 <w:szCs w:val="22"/>
               </w:rPr>
-              <w:t>8</w:t>
+              <w:t>7</w:t>
             </w:r>
             <w:r>
               <w:rPr>
@@ -2820,7 +2716,7 @@
                 <w:sz w:val="22"/>
                 <w:szCs w:val="22"/>
               </w:rPr>
-              <w:t>2</w:t>
+              <w:t>1</w:t>
             </w:r>
             <w:r>
               <w:rPr>
@@ -2988,7 +2884,7 @@
                 <w:sz w:val="22"/>
                 <w:szCs w:val="22"/>
               </w:rPr>
-              <w:t>4</w:t>
+              <w:t>3</w:t>
             </w:r>
             <w:r>
               <w:rPr>
@@ -3296,7 +3192,7 @@
                 <w:sz w:val="22"/>
                 <w:szCs w:val="22"/>
               </w:rPr>
-              <w:t>9</w:t>
+              <w:t>10</w:t>
             </w:r>
             <w:r>
               <w:rPr>
@@ -3455,7 +3351,7 @@
                 <w:sz w:val="22"/>
                 <w:szCs w:val="22"/>
               </w:rPr>
-              <w:t>1</w:t>
+              <w:t>4</w:t>
             </w:r>
             <w:r>
               <w:rPr>
@@ -3657,7 +3553,7 @@
                 <w:sz w:val="22"/>
                 <w:szCs w:val="22"/>
               </w:rPr>
-              <w:t>6</w:t>
+              <w:t>5</w:t>
             </w:r>
             <w:r>
               <w:rPr>
@@ -3803,7 +3699,7 @@
                 <w:sz w:val="22"/>
                 <w:szCs w:val="22"/>
               </w:rPr>
-              <w:t>7</w:t>
+              <w:t>6</w:t>
             </w:r>
             <w:r>
               <w:rPr>
@@ -3952,7 +3848,7 @@
                 <w:sz w:val="22"/>
                 <w:szCs w:val="22"/>
               </w:rPr>
-              <w:t>8</w:t>
+              <w:t>7</w:t>
             </w:r>
             <w:r>
               <w:rPr>
@@ -4111,7 +4007,7 @@
                 <w:sz w:val="22"/>
                 <w:szCs w:val="22"/>
               </w:rPr>
-              <w:t>3</w:t>
+              <w:t>2</w:t>
             </w:r>
             <w:r>
               <w:rPr>
@@ -4264,7 +4160,7 @@
                 <w:sz w:val="22"/>
                 <w:szCs w:val="22"/>
               </w:rPr>
-              <w:t>5</w:t>
+              <w:t>4</w:t>
             </w:r>
             <w:r>
               <w:rPr>
@@ -4412,7 +4308,7 @@
                 <w:sz w:val="22"/>
                 <w:szCs w:val="22"/>
               </w:rPr>
-              <w:t>30</w:t>
+              <w:t>29</w:t>
             </w:r>
             <w:r>
               <w:rPr>
@@ -4430,7 +4326,7 @@
                 <w:sz w:val="22"/>
                 <w:szCs w:val="22"/>
               </w:rPr>
-              <w:t>Sept</w:t>
+              <w:t>Sep</w:t>
             </w:r>
           </w:p>
         </w:tc>
@@ -4563,7 +4459,7 @@
                 <w:sz w:val="22"/>
                 <w:szCs w:val="22"/>
               </w:rPr>
-              <w:t>1</w:t>
+              <w:t>30</w:t>
             </w:r>
             <w:r>
               <w:rPr>
@@ -4572,7 +4468,16 @@
                 <w:sz w:val="22"/>
                 <w:szCs w:val="22"/>
               </w:rPr>
-              <w:t>-Oct</w:t>
+              <w:t>-</w:t>
+            </w:r>
+            <w:r>
+              <w:rPr>
+                <w:rFonts w:ascii="Segoe UI Light" w:hAnsi="Segoe UI Light" w:cs="Segoe UI Light"/>
+                <w:color w:val="0070C0"/>
+                <w:sz w:val="22"/>
+                <w:szCs w:val="22"/>
+              </w:rPr>
+              <w:t>Sep</w:t>
             </w:r>
           </w:p>
         </w:tc>
@@ -4715,7 +4620,7 @@
                 <w:sz w:val="22"/>
                 <w:szCs w:val="22"/>
               </w:rPr>
-              <w:t>2</w:t>
+              <w:t>1</w:t>
             </w:r>
             <w:r>
               <w:rPr>
@@ -4919,7 +4824,7 @@
                 <w:sz w:val="22"/>
                 <w:szCs w:val="22"/>
               </w:rPr>
-              <w:t>7</w:t>
+              <w:t>6</w:t>
             </w:r>
             <w:r>
               <w:rPr>
@@ -4993,6 +4898,44 @@
                 <w:szCs w:val="22"/>
               </w:rPr>
               <w:t xml:space="preserve">Data analysis with OLS estimator </w:t>
+            </w:r>
+          </w:p>
+          <w:p>
+            <w:pPr>
+              <w:jc w:val="both"/>
+              <w:rPr>
+                <w:rFonts w:ascii="Segoe UI Light" w:hAnsi="Segoe UI Light" w:cs="Segoe UI Light"/>
+                <w:color w:val="000000"/>
+                <w:sz w:val="22"/>
+                <w:szCs w:val="22"/>
+              </w:rPr>
+            </w:pPr>
+            <w:r>
+              <w:rPr>
+                <w:rFonts w:ascii="Segoe UI Light" w:hAnsi="Segoe UI Light" w:cs="Segoe UI Light"/>
+                <w:b/>
+                <w:bCs/>
+                <w:color w:val="70AD47" w:themeColor="accent6"/>
+              </w:rPr>
+              <w:t xml:space="preserve">(No class, Self-Study, Video </w:t>
+            </w:r>
+            <w:r>
+              <w:rPr>
+                <w:rFonts w:ascii="Segoe UI Light" w:hAnsi="Segoe UI Light" w:cs="Segoe UI Light"/>
+                <w:b/>
+                <w:bCs/>
+                <w:color w:val="70AD47" w:themeColor="accent6"/>
+              </w:rPr>
+              <w:t>Recording</w:t>
+            </w:r>
+            <w:r>
+              <w:rPr>
+                <w:rFonts w:ascii="Segoe UI Light" w:hAnsi="Segoe UI Light" w:cs="Segoe UI Light"/>
+                <w:b/>
+                <w:bCs/>
+                <w:color w:val="70AD47" w:themeColor="accent6"/>
+              </w:rPr>
+              <w:t>)</w:t>
             </w:r>
           </w:p>
         </w:tc>
@@ -5052,7 +4995,7 @@
                 <w:sz w:val="22"/>
                 <w:szCs w:val="22"/>
               </w:rPr>
-              <w:t>8</w:t>
+              <w:t>7</w:t>
             </w:r>
             <w:r>
               <w:rPr>
@@ -5153,6 +5096,7 @@
                 <w:sz w:val="22"/>
                 <w:szCs w:val="22"/>
               </w:rPr>
+              <w:lastRenderedPageBreak/>
               <w:t> </w:t>
             </w:r>
           </w:p>
@@ -5186,7 +5130,7 @@
                 <w:sz w:val="22"/>
                 <w:szCs w:val="22"/>
               </w:rPr>
-              <w:t>9</w:t>
+              <w:t>8</w:t>
             </w:r>
             <w:r>
               <w:rPr>
@@ -5260,6 +5204,44 @@
                 <w:szCs w:val="22"/>
               </w:rPr>
               <w:t>Data analysis with randomized experiment</w:t>
+            </w:r>
+          </w:p>
+          <w:p>
+            <w:pPr>
+              <w:jc w:val="both"/>
+              <w:rPr>
+                <w:rFonts w:ascii="Segoe UI Light" w:hAnsi="Segoe UI Light" w:cs="Segoe UI Light"/>
+                <w:color w:val="000000"/>
+                <w:sz w:val="22"/>
+                <w:szCs w:val="22"/>
+              </w:rPr>
+            </w:pPr>
+            <w:r>
+              <w:rPr>
+                <w:rFonts w:ascii="Segoe UI Light" w:hAnsi="Segoe UI Light" w:cs="Segoe UI Light"/>
+                <w:b/>
+                <w:bCs/>
+                <w:color w:val="70AD47" w:themeColor="accent6"/>
+              </w:rPr>
+              <w:t xml:space="preserve">(No class, Self-Study, Video </w:t>
+            </w:r>
+            <w:r>
+              <w:rPr>
+                <w:rFonts w:ascii="Segoe UI Light" w:hAnsi="Segoe UI Light" w:cs="Segoe UI Light"/>
+                <w:b/>
+                <w:bCs/>
+                <w:color w:val="70AD47" w:themeColor="accent6"/>
+              </w:rPr>
+              <w:t>Recording</w:t>
+            </w:r>
+            <w:r>
+              <w:rPr>
+                <w:rFonts w:ascii="Segoe UI Light" w:hAnsi="Segoe UI Light" w:cs="Segoe UI Light"/>
+                <w:b/>
+                <w:bCs/>
+                <w:color w:val="70AD47" w:themeColor="accent6"/>
+              </w:rPr>
+              <w:t>)</w:t>
             </w:r>
           </w:p>
         </w:tc>
@@ -5335,7 +5317,25 @@
                 <w:sz w:val="22"/>
                 <w:szCs w:val="22"/>
               </w:rPr>
-              <w:t>14-Oct</w:t>
+              <w:t>1</w:t>
+            </w:r>
+            <w:r>
+              <w:rPr>
+                <w:rFonts w:ascii="Segoe UI Light" w:hAnsi="Segoe UI Light" w:cs="Segoe UI Light"/>
+                <w:color w:val="000000"/>
+                <w:sz w:val="22"/>
+                <w:szCs w:val="22"/>
+              </w:rPr>
+              <w:t>3</w:t>
+            </w:r>
+            <w:r>
+              <w:rPr>
+                <w:rFonts w:ascii="Segoe UI Light" w:hAnsi="Segoe UI Light" w:cs="Segoe UI Light"/>
+                <w:color w:val="000000"/>
+                <w:sz w:val="22"/>
+                <w:szCs w:val="22"/>
+              </w:rPr>
+              <w:t>-Oct</w:t>
             </w:r>
           </w:p>
         </w:tc>
@@ -5481,7 +5481,25 @@
                 <w:sz w:val="22"/>
                 <w:szCs w:val="22"/>
               </w:rPr>
-              <w:t>16-Oct</w:t>
+              <w:t>1</w:t>
+            </w:r>
+            <w:r>
+              <w:rPr>
+                <w:rFonts w:ascii="Segoe UI Light" w:hAnsi="Segoe UI Light" w:cs="Segoe UI Light"/>
+                <w:color w:val="000000"/>
+                <w:sz w:val="22"/>
+                <w:szCs w:val="22"/>
+              </w:rPr>
+              <w:t>5</w:t>
+            </w:r>
+            <w:r>
+              <w:rPr>
+                <w:rFonts w:ascii="Segoe UI Light" w:hAnsi="Segoe UI Light" w:cs="Segoe UI Light"/>
+                <w:color w:val="000000"/>
+                <w:sz w:val="22"/>
+                <w:szCs w:val="22"/>
+              </w:rPr>
+              <w:t>-Oct</w:t>
             </w:r>
           </w:p>
         </w:tc>
@@ -5588,8 +5606,7 @@
                 <w:sz w:val="22"/>
                 <w:szCs w:val="22"/>
               </w:rPr>
-              <w:lastRenderedPageBreak/>
-              <w:t> </w:t>
+              <w:t>Week 9</w:t>
             </w:r>
           </w:p>
         </w:tc>
@@ -5603,17 +5620,45 @@
               <w:right w:val="nil"/>
             </w:tcBorders>
             <w:vAlign w:val="center"/>
+            <w:hideMark/>
           </w:tcPr>
           <w:p>
             <w:pPr>
               <w:jc w:val="center"/>
               <w:rPr>
                 <w:rFonts w:ascii="Segoe UI Light" w:hAnsi="Segoe UI Light" w:cs="Segoe UI Light"/>
-                <w:color w:val="0070C0"/>
-                <w:sz w:val="22"/>
-                <w:szCs w:val="22"/>
-              </w:rPr>
-            </w:pPr>
+                <w:color w:val="000000"/>
+                <w:sz w:val="22"/>
+                <w:szCs w:val="22"/>
+              </w:rPr>
+            </w:pPr>
+            <w:r>
+              <w:rPr>
+                <w:rFonts w:ascii="Segoe UI Light" w:hAnsi="Segoe UI Light" w:cs="Segoe UI Light"/>
+                <w:color w:val="000000"/>
+                <w:sz w:val="22"/>
+                <w:szCs w:val="22"/>
+              </w:rPr>
+              <w:t>2</w:t>
+            </w:r>
+            <w:r>
+              <w:rPr>
+                <w:rFonts w:ascii="Segoe UI Light" w:hAnsi="Segoe UI Light" w:cs="Segoe UI Light"/>
+                <w:color w:val="000000"/>
+                <w:sz w:val="22"/>
+                <w:szCs w:val="22"/>
+              </w:rPr>
+              <w:t>0</w:t>
+            </w:r>
+            <w:r>
+              <w:rPr>
+                <w:rFonts w:ascii="Segoe UI Light" w:hAnsi="Segoe UI Light" w:cs="Segoe UI Light"/>
+                <w:color w:val="000000"/>
+                <w:sz w:val="22"/>
+                <w:szCs w:val="22"/>
+              </w:rPr>
+              <w:t>-Oct</w:t>
+            </w:r>
           </w:p>
         </w:tc>
         <w:tc>
@@ -5631,11 +5676,29 @@
               <w:jc w:val="center"/>
               <w:rPr>
                 <w:rFonts w:ascii="Segoe UI Light" w:hAnsi="Segoe UI Light" w:cs="Segoe UI Light"/>
-                <w:color w:val="0070C0"/>
-                <w:sz w:val="22"/>
-                <w:szCs w:val="22"/>
-              </w:rPr>
-            </w:pPr>
+                <w:color w:val="000000"/>
+                <w:sz w:val="22"/>
+                <w:szCs w:val="22"/>
+              </w:rPr>
+            </w:pPr>
+            <w:r>
+              <w:rPr>
+                <w:rFonts w:ascii="Segoe UI Light" w:hAnsi="Segoe UI Light" w:cs="Segoe UI Light"/>
+                <w:color w:val="000000"/>
+                <w:sz w:val="22"/>
+                <w:szCs w:val="22"/>
+              </w:rPr>
+              <w:t>1</w:t>
+            </w:r>
+            <w:r>
+              <w:rPr>
+                <w:rFonts w:ascii="Segoe UI Light" w:hAnsi="Segoe UI Light" w:cs="Segoe UI Light"/>
+                <w:color w:val="000000"/>
+                <w:sz w:val="22"/>
+                <w:szCs w:val="22"/>
+              </w:rPr>
+              <w:t>4</w:t>
+            </w:r>
           </w:p>
         </w:tc>
         <w:tc>
@@ -5648,16 +5711,36 @@
               <w:right w:val="single" w:sz="8" w:space="0" w:color="auto"/>
             </w:tcBorders>
             <w:vAlign w:val="center"/>
-          </w:tcPr>
-          <w:p>
-            <w:pPr>
-              <w:rPr>
-                <w:rFonts w:ascii="Segoe UI Light" w:hAnsi="Segoe UI Light" w:cs="Segoe UI Light"/>
-                <w:color w:val="0070C0"/>
-                <w:sz w:val="22"/>
-                <w:szCs w:val="22"/>
-              </w:rPr>
-            </w:pPr>
+            <w:hideMark/>
+          </w:tcPr>
+          <w:p>
+            <w:pPr>
+              <w:jc w:val="both"/>
+              <w:rPr>
+                <w:rFonts w:ascii="Segoe UI Light" w:hAnsi="Segoe UI Light" w:cs="Segoe UI Light"/>
+                <w:color w:val="000000"/>
+                <w:sz w:val="22"/>
+                <w:szCs w:val="22"/>
+              </w:rPr>
+            </w:pPr>
+            <w:r>
+              <w:rPr>
+                <w:rFonts w:ascii="Segoe UI Light" w:hAnsi="Segoe UI Light" w:cs="Segoe UI Light"/>
+                <w:color w:val="000000"/>
+                <w:sz w:val="22"/>
+                <w:szCs w:val="22"/>
+              </w:rPr>
+              <w:t xml:space="preserve">Example 1: </w:t>
+            </w:r>
+            <w:r>
+              <w:rPr>
+                <w:rFonts w:ascii="Segoe UI Light" w:hAnsi="Segoe UI Light" w:cs="Segoe UI Light"/>
+                <w:color w:val="000000"/>
+                <w:sz w:val="22"/>
+                <w:szCs w:val="22"/>
+              </w:rPr>
+              <w:t>Regression Trees and Random Forests</w:t>
+            </w:r>
           </w:p>
         </w:tc>
       </w:tr>
@@ -5677,7 +5760,6 @@
             </w:tcBorders>
             <w:shd w:val="clear" w:color="000000" w:fill="FFFFFF"/>
             <w:vAlign w:val="center"/>
-            <w:hideMark/>
           </w:tcPr>
           <w:p>
             <w:pPr>
@@ -5691,17 +5773,6 @@
                 <w:szCs w:val="22"/>
               </w:rPr>
             </w:pPr>
-            <w:r>
-              <w:rPr>
-                <w:rFonts w:ascii="Segoe UI Light" w:hAnsi="Segoe UI Light" w:cs="Segoe UI Light"/>
-                <w:b/>
-                <w:bCs/>
-                <w:color w:val="000000"/>
-                <w:sz w:val="22"/>
-                <w:szCs w:val="22"/>
-              </w:rPr>
-              <w:t>Week 9</w:t>
-            </w:r>
           </w:p>
         </w:tc>
         <w:tc>
@@ -5714,7 +5785,6 @@
               <w:right w:val="nil"/>
             </w:tcBorders>
             <w:vAlign w:val="center"/>
-            <w:hideMark/>
           </w:tcPr>
           <w:p>
             <w:pPr>
@@ -5729,7 +5799,7 @@
             <w:r>
               <w:rPr>
                 <w:rFonts w:ascii="Segoe UI Light" w:hAnsi="Segoe UI Light" w:cs="Segoe UI Light"/>
-                <w:color w:val="000000"/>
+                <w:color w:val="0070C0"/>
                 <w:sz w:val="22"/>
                 <w:szCs w:val="22"/>
               </w:rPr>
@@ -5738,7 +5808,7 @@
             <w:r>
               <w:rPr>
                 <w:rFonts w:ascii="Segoe UI Light" w:hAnsi="Segoe UI Light" w:cs="Segoe UI Light"/>
-                <w:color w:val="000000"/>
+                <w:color w:val="0070C0"/>
                 <w:sz w:val="22"/>
                 <w:szCs w:val="22"/>
               </w:rPr>
@@ -5747,7 +5817,7 @@
             <w:r>
               <w:rPr>
                 <w:rFonts w:ascii="Segoe UI Light" w:hAnsi="Segoe UI Light" w:cs="Segoe UI Light"/>
-                <w:color w:val="000000"/>
+                <w:color w:val="0070C0"/>
                 <w:sz w:val="22"/>
                 <w:szCs w:val="22"/>
               </w:rPr>
@@ -5775,24 +5845,6 @@
                 <w:szCs w:val="22"/>
               </w:rPr>
             </w:pPr>
-            <w:r>
-              <w:rPr>
-                <w:rFonts w:ascii="Segoe UI Light" w:hAnsi="Segoe UI Light" w:cs="Segoe UI Light"/>
-                <w:color w:val="000000"/>
-                <w:sz w:val="22"/>
-                <w:szCs w:val="22"/>
-              </w:rPr>
-              <w:t>1</w:t>
-            </w:r>
-            <w:r>
-              <w:rPr>
-                <w:rFonts w:ascii="Segoe UI Light" w:hAnsi="Segoe UI Light" w:cs="Segoe UI Light"/>
-                <w:color w:val="000000"/>
-                <w:sz w:val="22"/>
-                <w:szCs w:val="22"/>
-              </w:rPr>
-              <w:t>4</w:t>
-            </w:r>
           </w:p>
         </w:tc>
         <w:tc>
@@ -5805,7 +5857,6 @@
               <w:right w:val="single" w:sz="8" w:space="0" w:color="auto"/>
             </w:tcBorders>
             <w:vAlign w:val="center"/>
-            <w:hideMark/>
           </w:tcPr>
           <w:p>
             <w:pPr>
@@ -5820,20 +5871,11 @@
             <w:r>
               <w:rPr>
                 <w:rFonts w:ascii="Segoe UI Light" w:hAnsi="Segoe UI Light" w:cs="Segoe UI Light"/>
-                <w:color w:val="000000"/>
-                <w:sz w:val="22"/>
-                <w:szCs w:val="22"/>
-              </w:rPr>
-              <w:t xml:space="preserve">Example 1: </w:t>
-            </w:r>
-            <w:r>
-              <w:rPr>
-                <w:rFonts w:ascii="Segoe UI Light" w:hAnsi="Segoe UI Light" w:cs="Segoe UI Light"/>
-                <w:color w:val="000000"/>
-                <w:sz w:val="22"/>
-                <w:szCs w:val="22"/>
-              </w:rPr>
-              <w:t>Regression Trees and Random Forests</w:t>
+                <w:color w:val="0070C0"/>
+                <w:sz w:val="22"/>
+                <w:szCs w:val="22"/>
+              </w:rPr>
+              <w:t>Project 1 due (10 p.m.)</w:t>
             </w:r>
           </w:p>
         </w:tc>
@@ -5854,6 +5896,7 @@
             </w:tcBorders>
             <w:shd w:val="clear" w:color="000000" w:fill="FFFFFF"/>
             <w:vAlign w:val="center"/>
+            <w:hideMark/>
           </w:tcPr>
           <w:p>
             <w:pPr>
@@ -5867,6 +5910,17 @@
                 <w:szCs w:val="22"/>
               </w:rPr>
             </w:pPr>
+            <w:r>
+              <w:rPr>
+                <w:rFonts w:ascii="Segoe UI Light" w:hAnsi="Segoe UI Light" w:cs="Segoe UI Light"/>
+                <w:b/>
+                <w:bCs/>
+                <w:color w:val="000000"/>
+                <w:sz w:val="22"/>
+                <w:szCs w:val="22"/>
+              </w:rPr>
+              <w:t> </w:t>
+            </w:r>
           </w:p>
         </w:tc>
         <w:tc>
@@ -5879,6 +5933,7 @@
               <w:right w:val="nil"/>
             </w:tcBorders>
             <w:vAlign w:val="center"/>
+            <w:hideMark/>
           </w:tcPr>
           <w:p>
             <w:pPr>
@@ -5893,7 +5948,7 @@
             <w:r>
               <w:rPr>
                 <w:rFonts w:ascii="Segoe UI Light" w:hAnsi="Segoe UI Light" w:cs="Segoe UI Light"/>
-                <w:color w:val="0070C0"/>
+                <w:color w:val="000000"/>
                 <w:sz w:val="22"/>
                 <w:szCs w:val="22"/>
               </w:rPr>
@@ -5902,7 +5957,7 @@
             <w:r>
               <w:rPr>
                 <w:rFonts w:ascii="Segoe UI Light" w:hAnsi="Segoe UI Light" w:cs="Segoe UI Light"/>
-                <w:color w:val="0070C0"/>
+                <w:color w:val="000000"/>
                 <w:sz w:val="22"/>
                 <w:szCs w:val="22"/>
               </w:rPr>
@@ -5911,7 +5966,7 @@
             <w:r>
               <w:rPr>
                 <w:rFonts w:ascii="Segoe UI Light" w:hAnsi="Segoe UI Light" w:cs="Segoe UI Light"/>
-                <w:color w:val="0070C0"/>
+                <w:color w:val="000000"/>
                 <w:sz w:val="22"/>
                 <w:szCs w:val="22"/>
               </w:rPr>
@@ -5939,6 +5994,15 @@
                 <w:szCs w:val="22"/>
               </w:rPr>
             </w:pPr>
+            <w:r>
+              <w:rPr>
+                <w:rFonts w:ascii="Segoe UI Light" w:hAnsi="Segoe UI Light" w:cs="Segoe UI Light"/>
+                <w:color w:val="000000"/>
+                <w:sz w:val="22"/>
+                <w:szCs w:val="22"/>
+              </w:rPr>
+              <w:t>15</w:t>
+            </w:r>
           </w:p>
         </w:tc>
         <w:tc>
@@ -5965,11 +6029,11 @@
             <w:r>
               <w:rPr>
                 <w:rFonts w:ascii="Segoe UI Light" w:hAnsi="Segoe UI Light" w:cs="Segoe UI Light"/>
-                <w:color w:val="0070C0"/>
-                <w:sz w:val="22"/>
-                <w:szCs w:val="22"/>
-              </w:rPr>
-              <w:t>Project 1 due (10 p.m.)</w:t>
+                <w:color w:val="000000"/>
+                <w:sz w:val="22"/>
+                <w:szCs w:val="22"/>
+              </w:rPr>
+              <w:t>Cross-validation</w:t>
             </w:r>
           </w:p>
         </w:tc>
@@ -5988,13 +6052,11 @@
               <w:bottom w:val="single" w:sz="8" w:space="0" w:color="auto"/>
               <w:right w:val="nil"/>
             </w:tcBorders>
-            <w:shd w:val="clear" w:color="000000" w:fill="FFFFFF"/>
             <w:vAlign w:val="center"/>
             <w:hideMark/>
           </w:tcPr>
           <w:p>
             <w:pPr>
-              <w:jc w:val="both"/>
               <w:rPr>
                 <w:rFonts w:ascii="Segoe UI Light" w:hAnsi="Segoe UI Light" w:cs="Segoe UI Light"/>
                 <w:b/>
@@ -6013,7 +6075,7 @@
                 <w:sz w:val="22"/>
                 <w:szCs w:val="22"/>
               </w:rPr>
-              <w:t> </w:t>
+              <w:t>Week 10</w:t>
             </w:r>
           </w:p>
         </w:tc>
@@ -6055,7 +6117,7 @@
                 <w:sz w:val="22"/>
                 <w:szCs w:val="22"/>
               </w:rPr>
-              <w:t>3</w:t>
+              <w:t>7</w:t>
             </w:r>
             <w:r>
               <w:rPr>
@@ -6095,7 +6157,7 @@
                 <w:sz w:val="22"/>
                 <w:szCs w:val="22"/>
               </w:rPr>
-              <w:t>15</w:t>
+              <w:t>16</w:t>
             </w:r>
           </w:p>
         </w:tc>
@@ -6127,7 +6189,7 @@
                 <w:sz w:val="22"/>
                 <w:szCs w:val="22"/>
               </w:rPr>
-              <w:t>Cross-validation</w:t>
+              <w:t>Classification Metrics</w:t>
             </w:r>
           </w:p>
         </w:tc>
@@ -6169,7 +6231,7 @@
                 <w:sz w:val="22"/>
                 <w:szCs w:val="22"/>
               </w:rPr>
-              <w:t>Week 10</w:t>
+              <w:t> </w:t>
             </w:r>
           </w:p>
         </w:tc>
@@ -6202,16 +6264,7 @@
                 <w:sz w:val="22"/>
                 <w:szCs w:val="22"/>
               </w:rPr>
-              <w:t>2</w:t>
-            </w:r>
-            <w:r>
-              <w:rPr>
-                <w:rFonts w:ascii="Segoe UI Light" w:hAnsi="Segoe UI Light" w:cs="Segoe UI Light"/>
-                <w:color w:val="000000"/>
-                <w:sz w:val="22"/>
-                <w:szCs w:val="22"/>
-              </w:rPr>
-              <w:t>8</w:t>
+              <w:t>29</w:t>
             </w:r>
             <w:r>
               <w:rPr>
@@ -6251,7 +6304,7 @@
                 <w:sz w:val="22"/>
                 <w:szCs w:val="22"/>
               </w:rPr>
-              <w:t>16</w:t>
+              <w:t>17</w:t>
             </w:r>
           </w:p>
         </w:tc>
@@ -6283,7 +6336,7 @@
                 <w:sz w:val="22"/>
                 <w:szCs w:val="22"/>
               </w:rPr>
-              <w:t>Classification Metrics</w:t>
+              <w:t xml:space="preserve">Example 2: Neural Networks </w:t>
             </w:r>
           </w:p>
         </w:tc>
@@ -6303,7 +6356,6 @@
               <w:right w:val="nil"/>
             </w:tcBorders>
             <w:vAlign w:val="center"/>
-            <w:hideMark/>
           </w:tcPr>
           <w:p>
             <w:pPr>
@@ -6316,17 +6368,6 @@
                 <w:szCs w:val="22"/>
               </w:rPr>
             </w:pPr>
-            <w:r>
-              <w:rPr>
-                <w:rFonts w:ascii="Segoe UI Light" w:hAnsi="Segoe UI Light" w:cs="Segoe UI Light"/>
-                <w:b/>
-                <w:bCs/>
-                <w:color w:val="000000"/>
-                <w:sz w:val="22"/>
-                <w:szCs w:val="22"/>
-              </w:rPr>
-              <w:t> </w:t>
-            </w:r>
           </w:p>
         </w:tc>
         <w:tc>
@@ -6339,7 +6380,6 @@
               <w:right w:val="nil"/>
             </w:tcBorders>
             <w:vAlign w:val="center"/>
-            <w:hideMark/>
           </w:tcPr>
           <w:p>
             <w:pPr>
@@ -6354,25 +6394,16 @@
             <w:r>
               <w:rPr>
                 <w:rFonts w:ascii="Segoe UI Light" w:hAnsi="Segoe UI Light" w:cs="Segoe UI Light"/>
-                <w:color w:val="000000"/>
-                <w:sz w:val="22"/>
-                <w:szCs w:val="22"/>
-              </w:rPr>
-              <w:t>3</w:t>
-            </w:r>
-            <w:r>
-              <w:rPr>
-                <w:rFonts w:ascii="Segoe UI Light" w:hAnsi="Segoe UI Light" w:cs="Segoe UI Light"/>
-                <w:color w:val="000000"/>
-                <w:sz w:val="22"/>
-                <w:szCs w:val="22"/>
-              </w:rPr>
-              <w:t>0</w:t>
-            </w:r>
-            <w:r>
-              <w:rPr>
-                <w:rFonts w:ascii="Segoe UI Light" w:hAnsi="Segoe UI Light" w:cs="Segoe UI Light"/>
-                <w:color w:val="000000"/>
+                <w:color w:val="0070C0"/>
+                <w:sz w:val="22"/>
+                <w:szCs w:val="22"/>
+              </w:rPr>
+              <w:t>30</w:t>
+            </w:r>
+            <w:r>
+              <w:rPr>
+                <w:rFonts w:ascii="Segoe UI Light" w:hAnsi="Segoe UI Light" w:cs="Segoe UI Light"/>
+                <w:color w:val="0070C0"/>
                 <w:sz w:val="22"/>
                 <w:szCs w:val="22"/>
               </w:rPr>
@@ -6400,15 +6431,6 @@
                 <w:szCs w:val="22"/>
               </w:rPr>
             </w:pPr>
-            <w:r>
-              <w:rPr>
-                <w:rFonts w:ascii="Segoe UI Light" w:hAnsi="Segoe UI Light" w:cs="Segoe UI Light"/>
-                <w:color w:val="000000"/>
-                <w:sz w:val="22"/>
-                <w:szCs w:val="22"/>
-              </w:rPr>
-              <w:t>17</w:t>
-            </w:r>
           </w:p>
         </w:tc>
         <w:tc>
@@ -6435,11 +6457,11 @@
             <w:r>
               <w:rPr>
                 <w:rFonts w:ascii="Segoe UI Light" w:hAnsi="Segoe UI Light" w:cs="Segoe UI Light"/>
-                <w:color w:val="000000"/>
-                <w:sz w:val="22"/>
-                <w:szCs w:val="22"/>
-              </w:rPr>
-              <w:t xml:space="preserve">Example 2: Neural Networks </w:t>
+                <w:color w:val="0070C0"/>
+                <w:sz w:val="22"/>
+                <w:szCs w:val="22"/>
+              </w:rPr>
+              <w:t>Project 2 due (10 p.m.)</w:t>
             </w:r>
           </w:p>
         </w:tc>
@@ -6455,10 +6477,11 @@
             <w:tcBorders>
               <w:top w:val="nil"/>
               <w:left w:val="single" w:sz="8" w:space="0" w:color="auto"/>
-              <w:bottom w:val="single" w:sz="8" w:space="0" w:color="auto"/>
+              <w:bottom w:val="nil"/>
               <w:right w:val="nil"/>
             </w:tcBorders>
             <w:vAlign w:val="center"/>
+            <w:hideMark/>
           </w:tcPr>
           <w:p>
             <w:pPr>
@@ -6471,6 +6494,17 @@
                 <w:szCs w:val="22"/>
               </w:rPr>
             </w:pPr>
+            <w:r>
+              <w:rPr>
+                <w:rFonts w:ascii="Segoe UI Light" w:hAnsi="Segoe UI Light" w:cs="Segoe UI Light"/>
+                <w:b/>
+                <w:bCs/>
+                <w:color w:val="000000"/>
+                <w:sz w:val="22"/>
+                <w:szCs w:val="22"/>
+              </w:rPr>
+              <w:t>Week 11</w:t>
+            </w:r>
           </w:p>
         </w:tc>
         <w:tc>
@@ -6479,10 +6513,11 @@
             <w:tcBorders>
               <w:top w:val="nil"/>
               <w:left w:val="nil"/>
-              <w:bottom w:val="single" w:sz="8" w:space="0" w:color="auto"/>
+              <w:bottom w:val="nil"/>
               <w:right w:val="nil"/>
             </w:tcBorders>
             <w:vAlign w:val="center"/>
+            <w:hideMark/>
           </w:tcPr>
           <w:p>
             <w:pPr>
@@ -6497,11 +6532,20 @@
             <w:r>
               <w:rPr>
                 <w:rFonts w:ascii="Segoe UI Light" w:hAnsi="Segoe UI Light" w:cs="Segoe UI Light"/>
-                <w:color w:val="0070C0"/>
-                <w:sz w:val="22"/>
-                <w:szCs w:val="22"/>
-              </w:rPr>
-              <w:t>31-Oct</w:t>
+                <w:color w:val="000000"/>
+                <w:sz w:val="22"/>
+                <w:szCs w:val="22"/>
+              </w:rPr>
+              <w:t>3</w:t>
+            </w:r>
+            <w:r>
+              <w:rPr>
+                <w:rFonts w:ascii="Segoe UI Light" w:hAnsi="Segoe UI Light" w:cs="Segoe UI Light"/>
+                <w:color w:val="000000"/>
+                <w:sz w:val="22"/>
+                <w:szCs w:val="22"/>
+              </w:rPr>
+              <w:t>-Nov</w:t>
             </w:r>
           </w:p>
         </w:tc>
@@ -6525,6 +6569,15 @@
                 <w:szCs w:val="22"/>
               </w:rPr>
             </w:pPr>
+            <w:r>
+              <w:rPr>
+                <w:rFonts w:ascii="Segoe UI Light" w:hAnsi="Segoe UI Light" w:cs="Segoe UI Light"/>
+                <w:color w:val="000000"/>
+                <w:sz w:val="22"/>
+                <w:szCs w:val="22"/>
+              </w:rPr>
+              <w:t>18</w:t>
+            </w:r>
           </w:p>
         </w:tc>
         <w:tc>
@@ -6540,22 +6593,21 @@
           </w:tcPr>
           <w:p>
             <w:pPr>
-              <w:jc w:val="both"/>
-              <w:rPr>
-                <w:rFonts w:ascii="Segoe UI Light" w:hAnsi="Segoe UI Light" w:cs="Segoe UI Light"/>
-                <w:color w:val="000000"/>
-                <w:sz w:val="22"/>
-                <w:szCs w:val="22"/>
-              </w:rPr>
-            </w:pPr>
-            <w:r>
-              <w:rPr>
-                <w:rFonts w:ascii="Segoe UI Light" w:hAnsi="Segoe UI Light" w:cs="Segoe UI Light"/>
-                <w:color w:val="0070C0"/>
-                <w:sz w:val="22"/>
-                <w:szCs w:val="22"/>
-              </w:rPr>
-              <w:t>Project 2 due (10 p.m.)</w:t>
+              <w:rPr>
+                <w:rFonts w:ascii="Segoe UI Light" w:hAnsi="Segoe UI Light" w:cs="Segoe UI Light"/>
+                <w:color w:val="000000"/>
+                <w:sz w:val="22"/>
+                <w:szCs w:val="22"/>
+              </w:rPr>
+            </w:pPr>
+            <w:r>
+              <w:rPr>
+                <w:rFonts w:ascii="Segoe UI Light" w:hAnsi="Segoe UI Light" w:cs="Segoe UI Light"/>
+                <w:color w:val="000000"/>
+                <w:sz w:val="22"/>
+                <w:szCs w:val="22"/>
+              </w:rPr>
+              <w:t>Example 3: PCA and K-means clustering</w:t>
             </w:r>
           </w:p>
         </w:tc>
@@ -6569,9 +6621,9 @@
           <w:tcPr>
             <w:tcW w:w="1064" w:type="dxa"/>
             <w:tcBorders>
-              <w:top w:val="nil"/>
+              <w:top w:val="single" w:sz="8" w:space="0" w:color="auto"/>
               <w:left w:val="single" w:sz="8" w:space="0" w:color="auto"/>
-              <w:bottom w:val="nil"/>
+              <w:bottom w:val="single" w:sz="8" w:space="0" w:color="auto"/>
               <w:right w:val="nil"/>
             </w:tcBorders>
             <w:vAlign w:val="center"/>
@@ -6581,23 +6633,19 @@
             <w:pPr>
               <w:rPr>
                 <w:rFonts w:ascii="Segoe UI Light" w:hAnsi="Segoe UI Light" w:cs="Segoe UI Light"/>
-                <w:b/>
-                <w:bCs/>
-                <w:color w:val="000000"/>
-                <w:sz w:val="22"/>
-                <w:szCs w:val="22"/>
-              </w:rPr>
-            </w:pPr>
-            <w:r>
-              <w:rPr>
-                <w:rFonts w:ascii="Segoe UI Light" w:hAnsi="Segoe UI Light" w:cs="Segoe UI Light"/>
-                <w:b/>
-                <w:bCs/>
-                <w:color w:val="000000"/>
-                <w:sz w:val="22"/>
-                <w:szCs w:val="22"/>
-              </w:rPr>
-              <w:t>Week 11</w:t>
+                <w:color w:val="000000"/>
+                <w:sz w:val="22"/>
+                <w:szCs w:val="22"/>
+              </w:rPr>
+            </w:pPr>
+            <w:r>
+              <w:rPr>
+                <w:rFonts w:ascii="Segoe UI Light" w:hAnsi="Segoe UI Light" w:cs="Segoe UI Light"/>
+                <w:color w:val="000000"/>
+                <w:sz w:val="22"/>
+                <w:szCs w:val="22"/>
+              </w:rPr>
+              <w:t> </w:t>
             </w:r>
           </w:p>
         </w:tc>
@@ -6605,9 +6653,9 @@
           <w:tcPr>
             <w:tcW w:w="1072" w:type="dxa"/>
             <w:tcBorders>
-              <w:top w:val="nil"/>
+              <w:top w:val="single" w:sz="8" w:space="0" w:color="auto"/>
               <w:left w:val="nil"/>
-              <w:bottom w:val="nil"/>
+              <w:bottom w:val="single" w:sz="8" w:space="0" w:color="auto"/>
               <w:right w:val="nil"/>
             </w:tcBorders>
             <w:vAlign w:val="center"/>
@@ -6630,7 +6678,7 @@
                 <w:sz w:val="22"/>
                 <w:szCs w:val="22"/>
               </w:rPr>
-              <w:t>4</w:t>
+              <w:t>5</w:t>
             </w:r>
             <w:r>
               <w:rPr>
@@ -6670,7 +6718,7 @@
                 <w:sz w:val="22"/>
                 <w:szCs w:val="22"/>
               </w:rPr>
-              <w:t>18</w:t>
+              <w:t>19</w:t>
             </w:r>
           </w:p>
         </w:tc>
@@ -6701,7 +6749,7 @@
                 <w:sz w:val="22"/>
                 <w:szCs w:val="22"/>
               </w:rPr>
-              <w:t>Example 3: PCA and K-means clustering</w:t>
+              <w:t xml:space="preserve">Machine Learning Pipelines </w:t>
             </w:r>
           </w:p>
         </w:tc>
@@ -6721,20 +6769,21 @@
               <w:right w:val="nil"/>
             </w:tcBorders>
             <w:vAlign w:val="center"/>
-            <w:hideMark/>
-          </w:tcPr>
-          <w:p>
-            <w:pPr>
-              <w:rPr>
-                <w:rFonts w:ascii="Segoe UI Light" w:hAnsi="Segoe UI Light" w:cs="Segoe UI Light"/>
-                <w:color w:val="000000"/>
-                <w:sz w:val="22"/>
-                <w:szCs w:val="22"/>
-              </w:rPr>
-            </w:pPr>
-            <w:r>
-              <w:rPr>
-                <w:rFonts w:ascii="Segoe UI Light" w:hAnsi="Segoe UI Light" w:cs="Segoe UI Light"/>
+          </w:tcPr>
+          <w:p>
+            <w:pPr>
+              <w:rPr>
+                <w:rFonts w:ascii="Segoe UI Light" w:hAnsi="Segoe UI Light" w:cs="Segoe UI Light"/>
+                <w:color w:val="000000"/>
+                <w:sz w:val="22"/>
+                <w:szCs w:val="22"/>
+              </w:rPr>
+            </w:pPr>
+            <w:r>
+              <w:rPr>
+                <w:rFonts w:ascii="Segoe UI Light" w:hAnsi="Segoe UI Light" w:cs="Segoe UI Light"/>
+                <w:b/>
+                <w:bCs/>
                 <w:color w:val="000000"/>
                 <w:sz w:val="22"/>
                 <w:szCs w:val="22"/>
@@ -6753,7 +6802,6 @@
               <w:right w:val="nil"/>
             </w:tcBorders>
             <w:vAlign w:val="center"/>
-            <w:hideMark/>
           </w:tcPr>
           <w:p>
             <w:pPr>
@@ -6768,7 +6816,7 @@
             <w:r>
               <w:rPr>
                 <w:rFonts w:ascii="Segoe UI Light" w:hAnsi="Segoe UI Light" w:cs="Segoe UI Light"/>
-                <w:color w:val="000000"/>
+                <w:color w:val="0070C0"/>
                 <w:sz w:val="22"/>
                 <w:szCs w:val="22"/>
               </w:rPr>
@@ -6777,7 +6825,7 @@
             <w:r>
               <w:rPr>
                 <w:rFonts w:ascii="Segoe UI Light" w:hAnsi="Segoe UI Light" w:cs="Segoe UI Light"/>
-                <w:color w:val="000000"/>
+                <w:color w:val="0070C0"/>
                 <w:sz w:val="22"/>
                 <w:szCs w:val="22"/>
               </w:rPr>
@@ -6800,20 +6848,11 @@
               <w:jc w:val="center"/>
               <w:rPr>
                 <w:rFonts w:ascii="Segoe UI Light" w:hAnsi="Segoe UI Light" w:cs="Segoe UI Light"/>
-                <w:color w:val="000000"/>
-                <w:sz w:val="22"/>
-                <w:szCs w:val="22"/>
-              </w:rPr>
-            </w:pPr>
-            <w:r>
-              <w:rPr>
-                <w:rFonts w:ascii="Segoe UI Light" w:hAnsi="Segoe UI Light" w:cs="Segoe UI Light"/>
-                <w:color w:val="000000"/>
-                <w:sz w:val="22"/>
-                <w:szCs w:val="22"/>
-              </w:rPr>
-              <w:t>19</w:t>
-            </w:r>
+                <w:color w:val="0070C0"/>
+                <w:sz w:val="22"/>
+                <w:szCs w:val="22"/>
+              </w:rPr>
+            </w:pPr>
           </w:p>
         </w:tc>
         <w:tc>
@@ -6839,11 +6878,11 @@
             <w:r>
               <w:rPr>
                 <w:rFonts w:ascii="Segoe UI Light" w:hAnsi="Segoe UI Light" w:cs="Segoe UI Light"/>
-                <w:color w:val="000000"/>
-                <w:sz w:val="22"/>
-                <w:szCs w:val="22"/>
-              </w:rPr>
-              <w:t xml:space="preserve">Machine Learning Pipelines </w:t>
+                <w:color w:val="0070C0"/>
+                <w:sz w:val="22"/>
+                <w:szCs w:val="22"/>
+              </w:rPr>
+              <w:t>Assignment 5 due (10 p.m.)</w:t>
             </w:r>
           </w:p>
         </w:tc>
@@ -6857,23 +6896,16 @@
           <w:tcPr>
             <w:tcW w:w="1064" w:type="dxa"/>
             <w:tcBorders>
-              <w:top w:val="single" w:sz="8" w:space="0" w:color="auto"/>
+              <w:top w:val="nil"/>
               <w:left w:val="single" w:sz="8" w:space="0" w:color="auto"/>
               <w:bottom w:val="single" w:sz="8" w:space="0" w:color="auto"/>
               <w:right w:val="nil"/>
             </w:tcBorders>
             <w:vAlign w:val="center"/>
-          </w:tcPr>
-          <w:p>
-            <w:pPr>
-              <w:rPr>
-                <w:rFonts w:ascii="Segoe UI Light" w:hAnsi="Segoe UI Light" w:cs="Segoe UI Light"/>
-                <w:color w:val="000000"/>
-                <w:sz w:val="22"/>
-                <w:szCs w:val="22"/>
-              </w:rPr>
-            </w:pPr>
-            <w:r>
+            <w:hideMark/>
+          </w:tcPr>
+          <w:p>
+            <w:pPr>
               <w:rPr>
                 <w:rFonts w:ascii="Segoe UI Light" w:hAnsi="Segoe UI Light" w:cs="Segoe UI Light"/>
                 <w:b/>
@@ -6882,7 +6914,17 @@
                 <w:sz w:val="22"/>
                 <w:szCs w:val="22"/>
               </w:rPr>
-              <w:t> </w:t>
+            </w:pPr>
+            <w:r>
+              <w:rPr>
+                <w:rFonts w:ascii="Segoe UI Light" w:hAnsi="Segoe UI Light" w:cs="Segoe UI Light"/>
+                <w:b/>
+                <w:bCs/>
+                <w:color w:val="000000"/>
+                <w:sz w:val="22"/>
+                <w:szCs w:val="22"/>
+              </w:rPr>
+              <w:t>Week 12</w:t>
             </w:r>
           </w:p>
         </w:tc>
@@ -6890,12 +6932,13 @@
           <w:tcPr>
             <w:tcW w:w="1072" w:type="dxa"/>
             <w:tcBorders>
-              <w:top w:val="single" w:sz="8" w:space="0" w:color="auto"/>
+              <w:top w:val="nil"/>
               <w:left w:val="nil"/>
               <w:bottom w:val="single" w:sz="8" w:space="0" w:color="auto"/>
               <w:right w:val="nil"/>
             </w:tcBorders>
             <w:vAlign w:val="center"/>
+            <w:hideMark/>
           </w:tcPr>
           <w:p>
             <w:pPr>
@@ -6910,16 +6953,16 @@
             <w:r>
               <w:rPr>
                 <w:rFonts w:ascii="Segoe UI Light" w:hAnsi="Segoe UI Light" w:cs="Segoe UI Light"/>
-                <w:color w:val="0070C0"/>
-                <w:sz w:val="22"/>
-                <w:szCs w:val="22"/>
-              </w:rPr>
-              <w:t>7</w:t>
-            </w:r>
-            <w:r>
-              <w:rPr>
-                <w:rFonts w:ascii="Segoe UI Light" w:hAnsi="Segoe UI Light" w:cs="Segoe UI Light"/>
-                <w:color w:val="0070C0"/>
+                <w:color w:val="000000"/>
+                <w:sz w:val="22"/>
+                <w:szCs w:val="22"/>
+              </w:rPr>
+              <w:t>10</w:t>
+            </w:r>
+            <w:r>
+              <w:rPr>
+                <w:rFonts w:ascii="Segoe UI Light" w:hAnsi="Segoe UI Light" w:cs="Segoe UI Light"/>
+                <w:color w:val="000000"/>
                 <w:sz w:val="22"/>
                 <w:szCs w:val="22"/>
               </w:rPr>
@@ -6942,11 +6985,20 @@
               <w:jc w:val="center"/>
               <w:rPr>
                 <w:rFonts w:ascii="Segoe UI Light" w:hAnsi="Segoe UI Light" w:cs="Segoe UI Light"/>
-                <w:color w:val="0070C0"/>
-                <w:sz w:val="22"/>
-                <w:szCs w:val="22"/>
-              </w:rPr>
-            </w:pPr>
+                <w:color w:val="000000"/>
+                <w:sz w:val="22"/>
+                <w:szCs w:val="22"/>
+              </w:rPr>
+            </w:pPr>
+            <w:r>
+              <w:rPr>
+                <w:rFonts w:ascii="Segoe UI Light" w:hAnsi="Segoe UI Light" w:cs="Segoe UI Light"/>
+                <w:color w:val="000000"/>
+                <w:sz w:val="22"/>
+                <w:szCs w:val="22"/>
+              </w:rPr>
+              <w:t>20</w:t>
+            </w:r>
           </w:p>
         </w:tc>
         <w:tc>
@@ -6972,11 +7024,11 @@
             <w:r>
               <w:rPr>
                 <w:rFonts w:ascii="Segoe UI Light" w:hAnsi="Segoe UI Light" w:cs="Segoe UI Light"/>
-                <w:color w:val="0070C0"/>
-                <w:sz w:val="22"/>
-                <w:szCs w:val="22"/>
-              </w:rPr>
-              <w:t>Assignment 5 due (10 p.m.)</w:t>
+                <w:color w:val="000000"/>
+                <w:sz w:val="22"/>
+                <w:szCs w:val="22"/>
+              </w:rPr>
+              <w:t xml:space="preserve">Text Analysis </w:t>
             </w:r>
           </w:p>
         </w:tc>
@@ -7018,7 +7070,7 @@
                 <w:sz w:val="22"/>
                 <w:szCs w:val="22"/>
               </w:rPr>
-              <w:t>Week 12</w:t>
+              <w:t> </w:t>
             </w:r>
           </w:p>
         </w:tc>
@@ -7060,7 +7112,7 @@
                 <w:sz w:val="22"/>
                 <w:szCs w:val="22"/>
               </w:rPr>
-              <w:t>1</w:t>
+              <w:t>2</w:t>
             </w:r>
             <w:r>
               <w:rPr>
@@ -7100,7 +7152,7 @@
                 <w:sz w:val="22"/>
                 <w:szCs w:val="22"/>
               </w:rPr>
-              <w:t>20</w:t>
+              <w:t>21</w:t>
             </w:r>
           </w:p>
         </w:tc>
@@ -7114,24 +7166,25 @@
               <w:right w:val="single" w:sz="8" w:space="0" w:color="auto"/>
             </w:tcBorders>
             <w:vAlign w:val="center"/>
-          </w:tcPr>
-          <w:p>
-            <w:pPr>
-              <w:rPr>
-                <w:rFonts w:ascii="Segoe UI Light" w:hAnsi="Segoe UI Light" w:cs="Segoe UI Light"/>
-                <w:color w:val="000000"/>
-                <w:sz w:val="22"/>
-                <w:szCs w:val="22"/>
-              </w:rPr>
-            </w:pPr>
-            <w:r>
-              <w:rPr>
-                <w:rFonts w:ascii="Segoe UI Light" w:hAnsi="Segoe UI Light" w:cs="Segoe UI Light"/>
-                <w:color w:val="000000"/>
-                <w:sz w:val="22"/>
-                <w:szCs w:val="22"/>
-              </w:rPr>
-              <w:t xml:space="preserve">Text Analysis </w:t>
+            <w:hideMark/>
+          </w:tcPr>
+          <w:p>
+            <w:pPr>
+              <w:rPr>
+                <w:rFonts w:ascii="Segoe UI Light" w:hAnsi="Segoe UI Light" w:cs="Segoe UI Light"/>
+                <w:color w:val="000000"/>
+                <w:sz w:val="22"/>
+                <w:szCs w:val="22"/>
+              </w:rPr>
+            </w:pPr>
+            <w:r>
+              <w:rPr>
+                <w:rFonts w:ascii="Segoe UI Light" w:hAnsi="Segoe UI Light" w:cs="Segoe UI Light"/>
+                <w:color w:val="000000"/>
+                <w:sz w:val="22"/>
+                <w:szCs w:val="22"/>
+              </w:rPr>
+              <w:t>Introduction to SQL</w:t>
             </w:r>
           </w:p>
         </w:tc>
@@ -7143,18 +7196,19 @@
         </w:trPr>
         <w:tc>
           <w:tcPr>
-            <w:tcW w:w="1064" w:type="dxa"/>
-            <w:tcBorders>
-              <w:top w:val="nil"/>
+            <w:tcW w:w="9135" w:type="dxa"/>
+            <w:gridSpan w:val="4"/>
+            <w:tcBorders>
+              <w:top w:val="single" w:sz="8" w:space="0" w:color="auto"/>
               <w:left w:val="single" w:sz="8" w:space="0" w:color="auto"/>
               <w:bottom w:val="single" w:sz="8" w:space="0" w:color="auto"/>
-              <w:right w:val="nil"/>
-            </w:tcBorders>
-            <w:vAlign w:val="center"/>
-            <w:hideMark/>
-          </w:tcPr>
-          <w:p>
-            <w:pPr>
+              <w:right w:val="single" w:sz="8" w:space="0" w:color="000000"/>
+            </w:tcBorders>
+            <w:shd w:val="clear" w:color="000000" w:fill="AEAAAA"/>
+          </w:tcPr>
+          <w:p>
+            <w:pPr>
+              <w:jc w:val="center"/>
               <w:rPr>
                 <w:rFonts w:ascii="Segoe UI Light" w:hAnsi="Segoe UI Light" w:cs="Segoe UI Light"/>
                 <w:b/>
@@ -7173,141 +7227,7 @@
                 <w:sz w:val="22"/>
                 <w:szCs w:val="22"/>
               </w:rPr>
-              <w:t> </w:t>
-            </w:r>
-          </w:p>
-        </w:tc>
-        <w:tc>
-          <w:tcPr>
-            <w:tcW w:w="1072" w:type="dxa"/>
-            <w:tcBorders>
-              <w:top w:val="nil"/>
-              <w:left w:val="nil"/>
-              <w:bottom w:val="single" w:sz="8" w:space="0" w:color="auto"/>
-              <w:right w:val="nil"/>
-            </w:tcBorders>
-            <w:vAlign w:val="center"/>
-            <w:hideMark/>
-          </w:tcPr>
-          <w:p>
-            <w:pPr>
-              <w:jc w:val="center"/>
-              <w:rPr>
-                <w:rFonts w:ascii="Segoe UI Light" w:hAnsi="Segoe UI Light" w:cs="Segoe UI Light"/>
-                <w:color w:val="000000"/>
-                <w:sz w:val="22"/>
-                <w:szCs w:val="22"/>
-              </w:rPr>
-            </w:pPr>
-            <w:r>
-              <w:rPr>
-                <w:rFonts w:ascii="Segoe UI Light" w:hAnsi="Segoe UI Light" w:cs="Segoe UI Light"/>
-                <w:color w:val="000000"/>
-                <w:sz w:val="22"/>
-                <w:szCs w:val="22"/>
-              </w:rPr>
-              <w:t>1</w:t>
-            </w:r>
-            <w:r>
-              <w:rPr>
-                <w:rFonts w:ascii="Segoe UI Light" w:hAnsi="Segoe UI Light" w:cs="Segoe UI Light"/>
-                <w:color w:val="000000"/>
-                <w:sz w:val="22"/>
-                <w:szCs w:val="22"/>
-              </w:rPr>
-              <w:t>3</w:t>
-            </w:r>
-            <w:r>
-              <w:rPr>
-                <w:rFonts w:ascii="Segoe UI Light" w:hAnsi="Segoe UI Light" w:cs="Segoe UI Light"/>
-                <w:color w:val="000000"/>
-                <w:sz w:val="22"/>
-                <w:szCs w:val="22"/>
-              </w:rPr>
-              <w:t>-Nov</w:t>
-            </w:r>
-          </w:p>
-        </w:tc>
-        <w:tc>
-          <w:tcPr>
-            <w:tcW w:w="780" w:type="dxa"/>
-            <w:tcBorders>
-              <w:top w:val="nil"/>
-              <w:left w:val="nil"/>
-              <w:bottom w:val="single" w:sz="8" w:space="0" w:color="auto"/>
-              <w:right w:val="nil"/>
-            </w:tcBorders>
-          </w:tcPr>
-          <w:p>
-            <w:pPr>
-              <w:jc w:val="center"/>
-              <w:rPr>
-                <w:rFonts w:ascii="Segoe UI Light" w:hAnsi="Segoe UI Light" w:cs="Segoe UI Light"/>
-                <w:color w:val="000000"/>
-                <w:sz w:val="22"/>
-                <w:szCs w:val="22"/>
-              </w:rPr>
-            </w:pPr>
-            <w:r>
-              <w:rPr>
-                <w:rFonts w:ascii="Segoe UI Light" w:hAnsi="Segoe UI Light" w:cs="Segoe UI Light"/>
-                <w:color w:val="000000"/>
-                <w:sz w:val="22"/>
-                <w:szCs w:val="22"/>
-              </w:rPr>
-              <w:t>21</w:t>
-            </w:r>
-          </w:p>
-        </w:tc>
-        <w:tc>
-          <w:tcPr>
-            <w:tcW w:w="6219" w:type="dxa"/>
-            <w:tcBorders>
-              <w:top w:val="nil"/>
-              <w:left w:val="nil"/>
-              <w:bottom w:val="single" w:sz="8" w:space="0" w:color="auto"/>
-              <w:right w:val="single" w:sz="8" w:space="0" w:color="auto"/>
-            </w:tcBorders>
-            <w:vAlign w:val="center"/>
-            <w:hideMark/>
-          </w:tcPr>
-          <w:p>
-            <w:pPr>
-              <w:rPr>
-                <w:rFonts w:ascii="Segoe UI Light" w:hAnsi="Segoe UI Light" w:cs="Segoe UI Light"/>
-                <w:color w:val="000000"/>
-                <w:sz w:val="22"/>
-                <w:szCs w:val="22"/>
-              </w:rPr>
-            </w:pPr>
-            <w:r>
-              <w:rPr>
-                <w:rFonts w:ascii="Segoe UI Light" w:hAnsi="Segoe UI Light" w:cs="Segoe UI Light"/>
-                <w:color w:val="000000"/>
-                <w:sz w:val="22"/>
-                <w:szCs w:val="22"/>
-              </w:rPr>
-              <w:t xml:space="preserve">Advanced </w:t>
-            </w:r>
-            <w:proofErr w:type="spellStart"/>
-            <w:r>
-              <w:rPr>
-                <w:rFonts w:ascii="Segoe UI Light" w:hAnsi="Segoe UI Light" w:cs="Segoe UI Light"/>
-                <w:color w:val="000000"/>
-                <w:sz w:val="22"/>
-                <w:szCs w:val="22"/>
-              </w:rPr>
-              <w:t>Github</w:t>
-            </w:r>
-            <w:proofErr w:type="spellEnd"/>
-            <w:r>
-              <w:rPr>
-                <w:rFonts w:ascii="Segoe UI Light" w:hAnsi="Segoe UI Light" w:cs="Segoe UI Light"/>
-                <w:color w:val="000000"/>
-                <w:sz w:val="22"/>
-                <w:szCs w:val="22"/>
-              </w:rPr>
-              <w:t xml:space="preserve"> </w:t>
+              <w:t>Module 4: Databases and Production Environment</w:t>
             </w:r>
           </w:p>
         </w:tc>
@@ -7319,19 +7239,20 @@
         </w:trPr>
         <w:tc>
           <w:tcPr>
-            <w:tcW w:w="9135" w:type="dxa"/>
-            <w:gridSpan w:val="4"/>
-            <w:tcBorders>
-              <w:top w:val="single" w:sz="8" w:space="0" w:color="auto"/>
+            <w:tcW w:w="1064" w:type="dxa"/>
+            <w:tcBorders>
+              <w:top w:val="nil"/>
               <w:left w:val="single" w:sz="8" w:space="0" w:color="auto"/>
               <w:bottom w:val="single" w:sz="8" w:space="0" w:color="auto"/>
-              <w:right w:val="single" w:sz="8" w:space="0" w:color="000000"/>
-            </w:tcBorders>
-            <w:shd w:val="clear" w:color="000000" w:fill="AEAAAA"/>
-          </w:tcPr>
-          <w:p>
-            <w:pPr>
-              <w:jc w:val="center"/>
+              <w:right w:val="nil"/>
+            </w:tcBorders>
+            <w:shd w:val="clear" w:color="000000" w:fill="FFFFFF"/>
+            <w:vAlign w:val="center"/>
+            <w:hideMark/>
+          </w:tcPr>
+          <w:p>
+            <w:pPr>
+              <w:jc w:val="both"/>
               <w:rPr>
                 <w:rFonts w:ascii="Segoe UI Light" w:hAnsi="Segoe UI Light" w:cs="Segoe UI Light"/>
                 <w:b/>
@@ -7350,7 +7271,120 @@
                 <w:sz w:val="22"/>
                 <w:szCs w:val="22"/>
               </w:rPr>
-              <w:t>Module 4: Databases and Production Environment</w:t>
+              <w:t>Week 13</w:t>
+            </w:r>
+          </w:p>
+        </w:tc>
+        <w:tc>
+          <w:tcPr>
+            <w:tcW w:w="1072" w:type="dxa"/>
+            <w:tcBorders>
+              <w:top w:val="nil"/>
+              <w:left w:val="nil"/>
+              <w:bottom w:val="single" w:sz="8" w:space="0" w:color="auto"/>
+              <w:right w:val="nil"/>
+            </w:tcBorders>
+            <w:vAlign w:val="center"/>
+            <w:hideMark/>
+          </w:tcPr>
+          <w:p>
+            <w:pPr>
+              <w:jc w:val="center"/>
+              <w:rPr>
+                <w:rFonts w:ascii="Segoe UI Light" w:hAnsi="Segoe UI Light" w:cs="Segoe UI Light"/>
+                <w:color w:val="000000"/>
+                <w:sz w:val="22"/>
+                <w:szCs w:val="22"/>
+              </w:rPr>
+            </w:pPr>
+            <w:r>
+              <w:rPr>
+                <w:rFonts w:ascii="Segoe UI Light" w:hAnsi="Segoe UI Light" w:cs="Segoe UI Light"/>
+                <w:color w:val="000000"/>
+                <w:sz w:val="22"/>
+                <w:szCs w:val="22"/>
+              </w:rPr>
+              <w:t>1</w:t>
+            </w:r>
+            <w:r>
+              <w:rPr>
+                <w:rFonts w:ascii="Segoe UI Light" w:hAnsi="Segoe UI Light" w:cs="Segoe UI Light"/>
+                <w:color w:val="000000"/>
+                <w:sz w:val="22"/>
+                <w:szCs w:val="22"/>
+              </w:rPr>
+              <w:t>8</w:t>
+            </w:r>
+            <w:r>
+              <w:rPr>
+                <w:rFonts w:ascii="Segoe UI Light" w:hAnsi="Segoe UI Light" w:cs="Segoe UI Light"/>
+                <w:color w:val="000000"/>
+                <w:sz w:val="22"/>
+                <w:szCs w:val="22"/>
+              </w:rPr>
+              <w:t>-Nov</w:t>
+            </w:r>
+          </w:p>
+        </w:tc>
+        <w:tc>
+          <w:tcPr>
+            <w:tcW w:w="780" w:type="dxa"/>
+            <w:tcBorders>
+              <w:top w:val="nil"/>
+              <w:left w:val="nil"/>
+              <w:bottom w:val="single" w:sz="8" w:space="0" w:color="auto"/>
+              <w:right w:val="nil"/>
+            </w:tcBorders>
+          </w:tcPr>
+          <w:p>
+            <w:pPr>
+              <w:jc w:val="center"/>
+              <w:rPr>
+                <w:rFonts w:ascii="Segoe UI Light" w:hAnsi="Segoe UI Light" w:cs="Segoe UI Light"/>
+                <w:color w:val="000000"/>
+                <w:sz w:val="22"/>
+                <w:szCs w:val="22"/>
+              </w:rPr>
+            </w:pPr>
+            <w:r>
+              <w:rPr>
+                <w:rFonts w:ascii="Segoe UI Light" w:hAnsi="Segoe UI Light" w:cs="Segoe UI Light"/>
+                <w:color w:val="000000"/>
+                <w:sz w:val="22"/>
+                <w:szCs w:val="22"/>
+              </w:rPr>
+              <w:t>22</w:t>
+            </w:r>
+          </w:p>
+        </w:tc>
+        <w:tc>
+          <w:tcPr>
+            <w:tcW w:w="6219" w:type="dxa"/>
+            <w:tcBorders>
+              <w:top w:val="nil"/>
+              <w:left w:val="nil"/>
+              <w:bottom w:val="single" w:sz="8" w:space="0" w:color="auto"/>
+              <w:right w:val="single" w:sz="8" w:space="0" w:color="auto"/>
+            </w:tcBorders>
+            <w:vAlign w:val="center"/>
+          </w:tcPr>
+          <w:p>
+            <w:pPr>
+              <w:rPr>
+                <w:rFonts w:ascii="Segoe UI Light" w:hAnsi="Segoe UI Light" w:cs="Segoe UI Light"/>
+                <w:color w:val="000000"/>
+                <w:sz w:val="22"/>
+                <w:szCs w:val="22"/>
+              </w:rPr>
+            </w:pPr>
+            <w:r>
+              <w:rPr>
+                <w:rFonts w:ascii="Segoe UI Light" w:hAnsi="Segoe UI Light" w:cs="Segoe UI Light"/>
+                <w:color w:val="000000"/>
+                <w:sz w:val="22"/>
+                <w:szCs w:val="22"/>
+              </w:rPr>
+              <w:t>Running SQL from Python</w:t>
             </w:r>
           </w:p>
         </w:tc>
@@ -7371,7 +7405,6 @@
             </w:tcBorders>
             <w:shd w:val="clear" w:color="000000" w:fill="FFFFFF"/>
             <w:vAlign w:val="center"/>
-            <w:hideMark/>
           </w:tcPr>
           <w:p>
             <w:pPr>
@@ -7385,17 +7418,6 @@
                 <w:szCs w:val="22"/>
               </w:rPr>
             </w:pPr>
-            <w:r>
-              <w:rPr>
-                <w:rFonts w:ascii="Segoe UI Light" w:hAnsi="Segoe UI Light" w:cs="Segoe UI Light"/>
-                <w:b/>
-                <w:bCs/>
-                <w:color w:val="000000"/>
-                <w:sz w:val="22"/>
-                <w:szCs w:val="22"/>
-              </w:rPr>
-              <w:t>Week 13</w:t>
-            </w:r>
           </w:p>
         </w:tc>
         <w:tc>
@@ -7408,7 +7430,6 @@
               <w:right w:val="nil"/>
             </w:tcBorders>
             <w:vAlign w:val="center"/>
-            <w:hideMark/>
           </w:tcPr>
           <w:p>
             <w:pPr>
@@ -7423,7 +7444,7 @@
             <w:r>
               <w:rPr>
                 <w:rFonts w:ascii="Segoe UI Light" w:hAnsi="Segoe UI Light" w:cs="Segoe UI Light"/>
-                <w:color w:val="000000"/>
+                <w:color w:val="0070C0"/>
                 <w:sz w:val="22"/>
                 <w:szCs w:val="22"/>
               </w:rPr>
@@ -7432,7 +7453,7 @@
             <w:r>
               <w:rPr>
                 <w:rFonts w:ascii="Segoe UI Light" w:hAnsi="Segoe UI Light" w:cs="Segoe UI Light"/>
-                <w:color w:val="000000"/>
+                <w:color w:val="0070C0"/>
                 <w:sz w:val="22"/>
                 <w:szCs w:val="22"/>
               </w:rPr>
@@ -7441,7 +7462,7 @@
             <w:r>
               <w:rPr>
                 <w:rFonts w:ascii="Segoe UI Light" w:hAnsi="Segoe UI Light" w:cs="Segoe UI Light"/>
-                <w:color w:val="000000"/>
+                <w:color w:val="0070C0"/>
                 <w:sz w:val="22"/>
                 <w:szCs w:val="22"/>
               </w:rPr>
@@ -7469,15 +7490,6 @@
                 <w:szCs w:val="22"/>
               </w:rPr>
             </w:pPr>
-            <w:r>
-              <w:rPr>
-                <w:rFonts w:ascii="Segoe UI Light" w:hAnsi="Segoe UI Light" w:cs="Segoe UI Light"/>
-                <w:color w:val="000000"/>
-                <w:sz w:val="22"/>
-                <w:szCs w:val="22"/>
-              </w:rPr>
-              <w:t>22</w:t>
-            </w:r>
           </w:p>
         </w:tc>
         <w:tc>
@@ -7503,11 +7515,11 @@
             <w:r>
               <w:rPr>
                 <w:rFonts w:ascii="Segoe UI Light" w:hAnsi="Segoe UI Light" w:cs="Segoe UI Light"/>
-                <w:color w:val="000000"/>
-                <w:sz w:val="22"/>
-                <w:szCs w:val="22"/>
-              </w:rPr>
-              <w:t>Introduction to SQL</w:t>
+                <w:color w:val="0070C0"/>
+                <w:sz w:val="22"/>
+                <w:szCs w:val="22"/>
+              </w:rPr>
+              <w:t>Assignment 6 due (10 p.m.)</w:t>
             </w:r>
           </w:p>
         </w:tc>
@@ -7528,6 +7540,7 @@
             </w:tcBorders>
             <w:shd w:val="clear" w:color="000000" w:fill="FFFFFF"/>
             <w:vAlign w:val="center"/>
+            <w:hideMark/>
           </w:tcPr>
           <w:p>
             <w:pPr>
@@ -7541,6 +7554,17 @@
                 <w:szCs w:val="22"/>
               </w:rPr>
             </w:pPr>
+            <w:r>
+              <w:rPr>
+                <w:rFonts w:ascii="Segoe UI Light" w:hAnsi="Segoe UI Light" w:cs="Segoe UI Light"/>
+                <w:b/>
+                <w:bCs/>
+                <w:color w:val="000000"/>
+                <w:sz w:val="22"/>
+                <w:szCs w:val="22"/>
+              </w:rPr>
+              <w:t> </w:t>
+            </w:r>
           </w:p>
         </w:tc>
         <w:tc>
@@ -7553,6 +7577,7 @@
               <w:right w:val="nil"/>
             </w:tcBorders>
             <w:vAlign w:val="center"/>
+            <w:hideMark/>
           </w:tcPr>
           <w:p>
             <w:pPr>
@@ -7567,11 +7592,11 @@
             <w:r>
               <w:rPr>
                 <w:rFonts w:ascii="Segoe UI Light" w:hAnsi="Segoe UI Light" w:cs="Segoe UI Light"/>
-                <w:color w:val="0070C0"/>
-                <w:sz w:val="22"/>
-                <w:szCs w:val="22"/>
-              </w:rPr>
-              <w:t>19-Nov</w:t>
+                <w:color w:val="000000"/>
+                <w:sz w:val="22"/>
+                <w:szCs w:val="22"/>
+              </w:rPr>
+              <w:t>20-Nov</w:t>
             </w:r>
           </w:p>
         </w:tc>
@@ -7595,6 +7620,15 @@
                 <w:szCs w:val="22"/>
               </w:rPr>
             </w:pPr>
+            <w:r>
+              <w:rPr>
+                <w:rFonts w:ascii="Segoe UI Light" w:hAnsi="Segoe UI Light" w:cs="Segoe UI Light"/>
+                <w:color w:val="000000"/>
+                <w:sz w:val="22"/>
+                <w:szCs w:val="22"/>
+              </w:rPr>
+              <w:t>23</w:t>
+            </w:r>
           </w:p>
         </w:tc>
         <w:tc>
@@ -7620,11 +7654,359 @@
             <w:r>
               <w:rPr>
                 <w:rFonts w:ascii="Segoe UI Light" w:hAnsi="Segoe UI Light" w:cs="Segoe UI Light"/>
-                <w:color w:val="0070C0"/>
-                <w:sz w:val="22"/>
-                <w:szCs w:val="22"/>
-              </w:rPr>
-              <w:t>Assignment 6 due (10 p.m.)</w:t>
+                <w:color w:val="000000"/>
+                <w:sz w:val="22"/>
+                <w:szCs w:val="22"/>
+              </w:rPr>
+              <w:t xml:space="preserve">Advanced </w:t>
+            </w:r>
+            <w:proofErr w:type="spellStart"/>
+            <w:r>
+              <w:rPr>
+                <w:rFonts w:ascii="Segoe UI Light" w:hAnsi="Segoe UI Light" w:cs="Segoe UI Light"/>
+                <w:color w:val="000000"/>
+                <w:sz w:val="22"/>
+                <w:szCs w:val="22"/>
+              </w:rPr>
+              <w:t>Github</w:t>
+            </w:r>
+            <w:proofErr w:type="spellEnd"/>
+          </w:p>
+        </w:tc>
+      </w:tr>
+      <w:tr>
+        <w:trPr>
+          <w:trHeight w:val="420"/>
+          <w:jc w:val="center"/>
+        </w:trPr>
+        <w:tc>
+          <w:tcPr>
+            <w:tcW w:w="1064" w:type="dxa"/>
+            <w:tcBorders>
+              <w:top w:val="nil"/>
+              <w:left w:val="single" w:sz="8" w:space="0" w:color="auto"/>
+              <w:bottom w:val="single" w:sz="8" w:space="0" w:color="auto"/>
+              <w:right w:val="nil"/>
+            </w:tcBorders>
+            <w:shd w:val="clear" w:color="000000" w:fill="FFFFFF"/>
+            <w:vAlign w:val="center"/>
+            <w:hideMark/>
+          </w:tcPr>
+          <w:p>
+            <w:pPr>
+              <w:jc w:val="both"/>
+              <w:rPr>
+                <w:rFonts w:ascii="Segoe UI Light" w:hAnsi="Segoe UI Light" w:cs="Segoe UI Light"/>
+                <w:b/>
+                <w:bCs/>
+                <w:color w:val="000000"/>
+                <w:sz w:val="22"/>
+                <w:szCs w:val="22"/>
+              </w:rPr>
+            </w:pPr>
+            <w:r>
+              <w:rPr>
+                <w:rFonts w:ascii="Segoe UI Light" w:hAnsi="Segoe UI Light" w:cs="Segoe UI Light"/>
+                <w:b/>
+                <w:bCs/>
+                <w:color w:val="000000"/>
+                <w:sz w:val="22"/>
+                <w:szCs w:val="22"/>
+              </w:rPr>
+              <w:t>Week 14</w:t>
+            </w:r>
+          </w:p>
+        </w:tc>
+        <w:tc>
+          <w:tcPr>
+            <w:tcW w:w="1072" w:type="dxa"/>
+            <w:tcBorders>
+              <w:top w:val="nil"/>
+              <w:left w:val="nil"/>
+              <w:bottom w:val="single" w:sz="8" w:space="0" w:color="auto"/>
+              <w:right w:val="nil"/>
+            </w:tcBorders>
+            <w:vAlign w:val="center"/>
+            <w:hideMark/>
+          </w:tcPr>
+          <w:p>
+            <w:pPr>
+              <w:jc w:val="center"/>
+              <w:rPr>
+                <w:rFonts w:ascii="Segoe UI Light" w:hAnsi="Segoe UI Light" w:cs="Segoe UI Light"/>
+                <w:color w:val="000000"/>
+                <w:sz w:val="22"/>
+                <w:szCs w:val="22"/>
+              </w:rPr>
+            </w:pPr>
+            <w:r>
+              <w:rPr>
+                <w:rFonts w:ascii="Segoe UI Light" w:hAnsi="Segoe UI Light" w:cs="Segoe UI Light"/>
+                <w:color w:val="000000"/>
+                <w:sz w:val="22"/>
+                <w:szCs w:val="22"/>
+              </w:rPr>
+              <w:t>2</w:t>
+            </w:r>
+            <w:r>
+              <w:rPr>
+                <w:rFonts w:ascii="Segoe UI Light" w:hAnsi="Segoe UI Light" w:cs="Segoe UI Light"/>
+                <w:color w:val="000000"/>
+                <w:sz w:val="22"/>
+                <w:szCs w:val="22"/>
+              </w:rPr>
+              <w:t>5</w:t>
+            </w:r>
+            <w:r>
+              <w:rPr>
+                <w:rFonts w:ascii="Segoe UI Light" w:hAnsi="Segoe UI Light" w:cs="Segoe UI Light"/>
+                <w:color w:val="000000"/>
+                <w:sz w:val="22"/>
+                <w:szCs w:val="22"/>
+              </w:rPr>
+              <w:t>-Nov</w:t>
+            </w:r>
+          </w:p>
+        </w:tc>
+        <w:tc>
+          <w:tcPr>
+            <w:tcW w:w="780" w:type="dxa"/>
+            <w:tcBorders>
+              <w:top w:val="nil"/>
+              <w:left w:val="nil"/>
+              <w:bottom w:val="single" w:sz="8" w:space="0" w:color="auto"/>
+              <w:right w:val="nil"/>
+            </w:tcBorders>
+          </w:tcPr>
+          <w:p>
+            <w:pPr>
+              <w:jc w:val="center"/>
+              <w:rPr>
+                <w:rFonts w:ascii="Segoe UI Light" w:hAnsi="Segoe UI Light" w:cs="Segoe UI Light"/>
+                <w:color w:val="000000"/>
+                <w:sz w:val="22"/>
+                <w:szCs w:val="22"/>
+              </w:rPr>
+            </w:pPr>
+            <w:r>
+              <w:rPr>
+                <w:rFonts w:ascii="Segoe UI Light" w:hAnsi="Segoe UI Light" w:cs="Segoe UI Light"/>
+                <w:color w:val="000000"/>
+                <w:sz w:val="22"/>
+                <w:szCs w:val="22"/>
+              </w:rPr>
+              <w:t>24</w:t>
+            </w:r>
+          </w:p>
+        </w:tc>
+        <w:tc>
+          <w:tcPr>
+            <w:tcW w:w="6219" w:type="dxa"/>
+            <w:tcBorders>
+              <w:top w:val="nil"/>
+              <w:left w:val="nil"/>
+              <w:bottom w:val="single" w:sz="8" w:space="0" w:color="auto"/>
+              <w:right w:val="single" w:sz="8" w:space="0" w:color="auto"/>
+            </w:tcBorders>
+            <w:vAlign w:val="center"/>
+          </w:tcPr>
+          <w:p>
+            <w:pPr>
+              <w:rPr>
+                <w:rFonts w:ascii="Segoe UI Light" w:hAnsi="Segoe UI Light" w:cs="Segoe UI Light"/>
+                <w:color w:val="000000"/>
+                <w:sz w:val="22"/>
+                <w:szCs w:val="22"/>
+              </w:rPr>
+            </w:pPr>
+            <w:r>
+              <w:rPr>
+                <w:rFonts w:ascii="Segoe UI Light" w:hAnsi="Segoe UI Light" w:cs="Segoe UI Light"/>
+                <w:color w:val="000000"/>
+                <w:sz w:val="22"/>
+                <w:szCs w:val="22"/>
+              </w:rPr>
+              <w:t>Python Classes + Deployment</w:t>
+            </w:r>
+          </w:p>
+          <w:p>
+            <w:pPr>
+              <w:rPr>
+                <w:rFonts w:ascii="Segoe UI Light" w:hAnsi="Segoe UI Light" w:cs="Segoe UI Light"/>
+                <w:b/>
+                <w:bCs/>
+                <w:color w:val="000000"/>
+                <w:sz w:val="22"/>
+                <w:szCs w:val="22"/>
+              </w:rPr>
+            </w:pPr>
+            <w:r>
+              <w:rPr>
+                <w:rFonts w:ascii="Segoe UI Light" w:hAnsi="Segoe UI Light" w:cs="Segoe UI Light"/>
+                <w:b/>
+                <w:bCs/>
+                <w:color w:val="70AD47" w:themeColor="accent6"/>
+                <w:sz w:val="22"/>
+                <w:szCs w:val="22"/>
+              </w:rPr>
+              <w:t>(Zoom</w:t>
+            </w:r>
+            <w:r>
+              <w:rPr>
+                <w:rFonts w:ascii="Segoe UI Light" w:hAnsi="Segoe UI Light" w:cs="Segoe UI Light"/>
+                <w:b/>
+                <w:bCs/>
+                <w:color w:val="70AD47" w:themeColor="accent6"/>
+                <w:sz w:val="22"/>
+                <w:szCs w:val="22"/>
+              </w:rPr>
+              <w:t xml:space="preserve"> Lecture</w:t>
+            </w:r>
+            <w:r>
+              <w:rPr>
+                <w:rFonts w:ascii="Segoe UI Light" w:hAnsi="Segoe UI Light" w:cs="Segoe UI Light"/>
+                <w:b/>
+                <w:bCs/>
+                <w:color w:val="70AD47" w:themeColor="accent6"/>
+                <w:sz w:val="22"/>
+                <w:szCs w:val="22"/>
+              </w:rPr>
+              <w:t>)</w:t>
+            </w:r>
+          </w:p>
+        </w:tc>
+      </w:tr>
+      <w:tr>
+        <w:trPr>
+          <w:trHeight w:val="420"/>
+          <w:jc w:val="center"/>
+        </w:trPr>
+        <w:tc>
+          <w:tcPr>
+            <w:tcW w:w="1064" w:type="dxa"/>
+            <w:tcBorders>
+              <w:top w:val="nil"/>
+              <w:left w:val="single" w:sz="8" w:space="0" w:color="auto"/>
+              <w:bottom w:val="single" w:sz="8" w:space="0" w:color="auto"/>
+              <w:right w:val="nil"/>
+            </w:tcBorders>
+            <w:shd w:val="clear" w:color="000000" w:fill="FFFFFF"/>
+            <w:vAlign w:val="center"/>
+          </w:tcPr>
+          <w:p>
+            <w:pPr>
+              <w:jc w:val="both"/>
+              <w:rPr>
+                <w:rFonts w:ascii="Segoe UI Light" w:hAnsi="Segoe UI Light" w:cs="Segoe UI Light"/>
+                <w:b/>
+                <w:bCs/>
+                <w:color w:val="000000"/>
+                <w:sz w:val="22"/>
+                <w:szCs w:val="22"/>
+              </w:rPr>
+            </w:pPr>
+          </w:p>
+        </w:tc>
+        <w:tc>
+          <w:tcPr>
+            <w:tcW w:w="1072" w:type="dxa"/>
+            <w:tcBorders>
+              <w:top w:val="nil"/>
+              <w:left w:val="nil"/>
+              <w:bottom w:val="single" w:sz="8" w:space="0" w:color="auto"/>
+              <w:right w:val="nil"/>
+            </w:tcBorders>
+            <w:vAlign w:val="center"/>
+          </w:tcPr>
+          <w:p>
+            <w:pPr>
+              <w:jc w:val="center"/>
+              <w:rPr>
+                <w:rFonts w:ascii="Segoe UI Light" w:hAnsi="Segoe UI Light" w:cs="Segoe UI Light"/>
+                <w:color w:val="000000"/>
+                <w:sz w:val="22"/>
+                <w:szCs w:val="22"/>
+              </w:rPr>
+            </w:pPr>
+            <w:r>
+              <w:rPr>
+                <w:rFonts w:ascii="Segoe UI Light" w:hAnsi="Segoe UI Light" w:cs="Segoe UI Light"/>
+                <w:color w:val="000000"/>
+                <w:sz w:val="22"/>
+                <w:szCs w:val="22"/>
+              </w:rPr>
+              <w:t>2</w:t>
+            </w:r>
+            <w:r>
+              <w:rPr>
+                <w:rFonts w:ascii="Segoe UI Light" w:hAnsi="Segoe UI Light" w:cs="Segoe UI Light"/>
+                <w:color w:val="000000"/>
+                <w:sz w:val="22"/>
+                <w:szCs w:val="22"/>
+              </w:rPr>
+              <w:t>6</w:t>
+            </w:r>
+            <w:r>
+              <w:rPr>
+                <w:rFonts w:ascii="Segoe UI Light" w:hAnsi="Segoe UI Light" w:cs="Segoe UI Light"/>
+                <w:color w:val="000000"/>
+                <w:sz w:val="22"/>
+                <w:szCs w:val="22"/>
+              </w:rPr>
+              <w:t>-Nov</w:t>
+            </w:r>
+          </w:p>
+        </w:tc>
+        <w:tc>
+          <w:tcPr>
+            <w:tcW w:w="780" w:type="dxa"/>
+            <w:tcBorders>
+              <w:top w:val="nil"/>
+              <w:left w:val="nil"/>
+              <w:bottom w:val="single" w:sz="8" w:space="0" w:color="auto"/>
+              <w:right w:val="nil"/>
+            </w:tcBorders>
+          </w:tcPr>
+          <w:p>
+            <w:pPr>
+              <w:jc w:val="center"/>
+              <w:rPr>
+                <w:rFonts w:ascii="Segoe UI Light" w:hAnsi="Segoe UI Light" w:cs="Segoe UI Light"/>
+                <w:color w:val="000000"/>
+                <w:sz w:val="22"/>
+                <w:szCs w:val="22"/>
+              </w:rPr>
+            </w:pPr>
+          </w:p>
+        </w:tc>
+        <w:tc>
+          <w:tcPr>
+            <w:tcW w:w="6219" w:type="dxa"/>
+            <w:tcBorders>
+              <w:top w:val="nil"/>
+              <w:left w:val="nil"/>
+              <w:bottom w:val="single" w:sz="8" w:space="0" w:color="auto"/>
+              <w:right w:val="single" w:sz="8" w:space="0" w:color="auto"/>
+            </w:tcBorders>
+            <w:vAlign w:val="center"/>
+          </w:tcPr>
+          <w:p>
+            <w:pPr>
+              <w:rPr>
+                <w:rFonts w:ascii="Segoe UI Light" w:hAnsi="Segoe UI Light" w:cs="Segoe UI Light"/>
+                <w:color w:val="000000"/>
+                <w:sz w:val="22"/>
+                <w:szCs w:val="22"/>
+              </w:rPr>
+            </w:pPr>
+            <w:r>
+              <w:rPr>
+                <w:rFonts w:ascii="Segoe UI Light" w:hAnsi="Segoe UI Light" w:cs="Segoe UI Light"/>
+                <w:color w:val="4472C4" w:themeColor="accent1"/>
+                <w:sz w:val="22"/>
+                <w:szCs w:val="22"/>
+              </w:rPr>
+              <w:t>Project 3 due (10 p.m.)</w:t>
             </w:r>
           </w:p>
         </w:tc>
@@ -7701,7 +8083,7 @@
                 <w:sz w:val="22"/>
                 <w:szCs w:val="22"/>
               </w:rPr>
-              <w:t>20-Nov</w:t>
+              <w:t>27-Nov</w:t>
             </w:r>
           </w:p>
         </w:tc>
@@ -7717,23 +8099,13 @@
           </w:tcPr>
           <w:p>
             <w:pPr>
-              <w:jc w:val="center"/>
-              <w:rPr>
-                <w:rFonts w:ascii="Segoe UI Light" w:hAnsi="Segoe UI Light" w:cs="Segoe UI Light"/>
-                <w:color w:val="000000"/>
-                <w:sz w:val="22"/>
-                <w:szCs w:val="22"/>
-              </w:rPr>
-            </w:pPr>
-            <w:r>
-              <w:rPr>
-                <w:rFonts w:ascii="Segoe UI Light" w:hAnsi="Segoe UI Light" w:cs="Segoe UI Light"/>
-                <w:color w:val="000000"/>
-                <w:sz w:val="22"/>
-                <w:szCs w:val="22"/>
-              </w:rPr>
-              <w:t>23</w:t>
-            </w:r>
+              <w:rPr>
+                <w:rFonts w:ascii="Segoe UI Light" w:hAnsi="Segoe UI Light" w:cs="Segoe UI Light"/>
+                <w:color w:val="000000"/>
+                <w:sz w:val="22"/>
+                <w:szCs w:val="22"/>
+              </w:rPr>
+            </w:pPr>
           </w:p>
         </w:tc>
         <w:tc>
@@ -7746,45 +8118,6 @@
               <w:right w:val="single" w:sz="8" w:space="0" w:color="auto"/>
             </w:tcBorders>
             <w:vAlign w:val="center"/>
-          </w:tcPr>
-          <w:p>
-            <w:pPr>
-              <w:rPr>
-                <w:rFonts w:ascii="Segoe UI Light" w:hAnsi="Segoe UI Light" w:cs="Segoe UI Light"/>
-                <w:color w:val="000000"/>
-                <w:sz w:val="22"/>
-                <w:szCs w:val="22"/>
-              </w:rPr>
-            </w:pPr>
-            <w:r>
-              <w:rPr>
-                <w:rFonts w:ascii="Segoe UI Light" w:hAnsi="Segoe UI Light" w:cs="Segoe UI Light"/>
-                <w:color w:val="000000"/>
-                <w:sz w:val="22"/>
-                <w:szCs w:val="22"/>
-              </w:rPr>
-              <w:t>Running SQL from Python</w:t>
-            </w:r>
-          </w:p>
-        </w:tc>
-      </w:tr>
-      <w:tr>
-        <w:trPr>
-          <w:trHeight w:val="420"/>
-          <w:jc w:val="center"/>
-        </w:trPr>
-        <w:tc>
-          <w:tcPr>
-            <w:tcW w:w="1064" w:type="dxa"/>
-            <w:tcBorders>
-              <w:top w:val="nil"/>
-              <w:left w:val="single" w:sz="8" w:space="0" w:color="auto"/>
-              <w:bottom w:val="single" w:sz="8" w:space="0" w:color="auto"/>
-              <w:right w:val="nil"/>
-            </w:tcBorders>
-            <w:shd w:val="clear" w:color="000000" w:fill="FFFFFF"/>
-            <w:vAlign w:val="center"/>
-            <w:hideMark/>
           </w:tcPr>
           <w:p>
             <w:pPr>
@@ -7793,7 +8126,7 @@
                 <w:rFonts w:ascii="Segoe UI Light" w:hAnsi="Segoe UI Light" w:cs="Segoe UI Light"/>
                 <w:b/>
                 <w:bCs/>
-                <w:color w:val="000000"/>
+                <w:color w:val="70AD47" w:themeColor="accent6"/>
                 <w:sz w:val="22"/>
                 <w:szCs w:val="22"/>
               </w:rPr>
@@ -7803,133 +8136,22 @@
                 <w:rFonts w:ascii="Segoe UI Light" w:hAnsi="Segoe UI Light" w:cs="Segoe UI Light"/>
                 <w:b/>
                 <w:bCs/>
-                <w:color w:val="000000"/>
-                <w:sz w:val="22"/>
-                <w:szCs w:val="22"/>
-              </w:rPr>
-              <w:t>Week 14</w:t>
-            </w:r>
-          </w:p>
-        </w:tc>
-        <w:tc>
-          <w:tcPr>
-            <w:tcW w:w="1072" w:type="dxa"/>
-            <w:tcBorders>
-              <w:top w:val="nil"/>
-              <w:left w:val="nil"/>
-              <w:bottom w:val="single" w:sz="8" w:space="0" w:color="auto"/>
-              <w:right w:val="nil"/>
-            </w:tcBorders>
-            <w:vAlign w:val="center"/>
-            <w:hideMark/>
-          </w:tcPr>
-          <w:p>
-            <w:pPr>
-              <w:jc w:val="center"/>
-              <w:rPr>
-                <w:rFonts w:ascii="Segoe UI Light" w:hAnsi="Segoe UI Light" w:cs="Segoe UI Light"/>
-                <w:color w:val="000000"/>
-                <w:sz w:val="22"/>
-                <w:szCs w:val="22"/>
-              </w:rPr>
-            </w:pPr>
-            <w:r>
-              <w:rPr>
-                <w:rFonts w:ascii="Segoe UI Light" w:hAnsi="Segoe UI Light" w:cs="Segoe UI Light"/>
-                <w:color w:val="000000"/>
-                <w:sz w:val="22"/>
-                <w:szCs w:val="22"/>
-              </w:rPr>
-              <w:t>2</w:t>
-            </w:r>
-            <w:r>
-              <w:rPr>
-                <w:rFonts w:ascii="Segoe UI Light" w:hAnsi="Segoe UI Light" w:cs="Segoe UI Light"/>
-                <w:color w:val="000000"/>
-                <w:sz w:val="22"/>
-                <w:szCs w:val="22"/>
-              </w:rPr>
-              <w:t>5</w:t>
-            </w:r>
-            <w:r>
-              <w:rPr>
-                <w:rFonts w:ascii="Segoe UI Light" w:hAnsi="Segoe UI Light" w:cs="Segoe UI Light"/>
-                <w:color w:val="000000"/>
-                <w:sz w:val="22"/>
-                <w:szCs w:val="22"/>
-              </w:rPr>
-              <w:t>-Nov</w:t>
-            </w:r>
-          </w:p>
-        </w:tc>
-        <w:tc>
-          <w:tcPr>
-            <w:tcW w:w="780" w:type="dxa"/>
-            <w:tcBorders>
-              <w:top w:val="nil"/>
-              <w:left w:val="nil"/>
-              <w:bottom w:val="single" w:sz="8" w:space="0" w:color="auto"/>
-              <w:right w:val="nil"/>
-            </w:tcBorders>
-          </w:tcPr>
-          <w:p>
-            <w:pPr>
-              <w:jc w:val="center"/>
-              <w:rPr>
-                <w:rFonts w:ascii="Segoe UI Light" w:hAnsi="Segoe UI Light" w:cs="Segoe UI Light"/>
-                <w:color w:val="000000"/>
-                <w:sz w:val="22"/>
-                <w:szCs w:val="22"/>
-              </w:rPr>
-            </w:pPr>
-            <w:r>
-              <w:rPr>
-                <w:rFonts w:ascii="Segoe UI Light" w:hAnsi="Segoe UI Light" w:cs="Segoe UI Light"/>
-                <w:color w:val="000000"/>
-                <w:sz w:val="22"/>
-                <w:szCs w:val="22"/>
-              </w:rPr>
-              <w:t>24</w:t>
-            </w:r>
-          </w:p>
-        </w:tc>
-        <w:tc>
-          <w:tcPr>
-            <w:tcW w:w="6219" w:type="dxa"/>
-            <w:tcBorders>
-              <w:top w:val="nil"/>
-              <w:left w:val="nil"/>
-              <w:bottom w:val="single" w:sz="8" w:space="0" w:color="auto"/>
-              <w:right w:val="single" w:sz="8" w:space="0" w:color="auto"/>
-            </w:tcBorders>
-            <w:vAlign w:val="center"/>
-          </w:tcPr>
-          <w:p>
-            <w:pPr>
-              <w:rPr>
-                <w:rFonts w:ascii="Segoe UI Light" w:hAnsi="Segoe UI Light" w:cs="Segoe UI Light"/>
-                <w:color w:val="000000"/>
-                <w:sz w:val="22"/>
-                <w:szCs w:val="22"/>
-              </w:rPr>
-            </w:pPr>
-            <w:r>
-              <w:rPr>
-                <w:rFonts w:ascii="Segoe UI Light" w:hAnsi="Segoe UI Light" w:cs="Segoe UI Light"/>
-                <w:color w:val="000000"/>
-                <w:sz w:val="22"/>
-                <w:szCs w:val="22"/>
-              </w:rPr>
-              <w:t xml:space="preserve">Python Classes + Deployment </w:t>
-            </w:r>
-            <w:r>
-              <w:rPr>
-                <w:rFonts w:ascii="Segoe UI Light" w:hAnsi="Segoe UI Light" w:cs="Segoe UI Light"/>
-                <w:color w:val="000000"/>
-                <w:sz w:val="22"/>
-                <w:szCs w:val="22"/>
-              </w:rPr>
-              <w:t>(Zoom)</w:t>
+                <w:color w:val="70AD47" w:themeColor="accent6"/>
+                <w:sz w:val="22"/>
+                <w:szCs w:val="22"/>
+              </w:rPr>
+              <w:t>THANKSGIVING</w:t>
+            </w:r>
+            <w:r>
+              <w:rPr>
+                <w:rFonts w:ascii="Segoe UI Light" w:hAnsi="Segoe UI Light" w:cs="Segoe UI Light"/>
+                <w:b/>
+                <w:bCs/>
+                <w:color w:val="70AD47" w:themeColor="accent6"/>
+                <w:sz w:val="22"/>
+                <w:szCs w:val="22"/>
+              </w:rPr>
+              <w:t xml:space="preserve"> BREAK (No Class, No Office Hours)</w:t>
             </w:r>
           </w:p>
         </w:tc>
@@ -7973,7 +8195,7 @@
                 <w:sz w:val="22"/>
                 <w:szCs w:val="22"/>
               </w:rPr>
-              <w:t> </w:t>
+              <w:t>Week 15</w:t>
             </w:r>
           </w:p>
         </w:tc>
@@ -8006,25 +8228,7 @@
                 <w:sz w:val="22"/>
                 <w:szCs w:val="22"/>
               </w:rPr>
-              <w:t>2</w:t>
-            </w:r>
-            <w:r>
-              <w:rPr>
-                <w:rFonts w:ascii="Segoe UI Light" w:hAnsi="Segoe UI Light" w:cs="Segoe UI Light"/>
-                <w:color w:val="000000"/>
-                <w:sz w:val="22"/>
-                <w:szCs w:val="22"/>
-              </w:rPr>
-              <w:t>7</w:t>
-            </w:r>
-            <w:r>
-              <w:rPr>
-                <w:rFonts w:ascii="Segoe UI Light" w:hAnsi="Segoe UI Light" w:cs="Segoe UI Light"/>
-                <w:color w:val="000000"/>
-                <w:sz w:val="22"/>
-                <w:szCs w:val="22"/>
-              </w:rPr>
-              <w:t>-Nov</w:t>
+              <w:t>2-Dec</w:t>
             </w:r>
           </w:p>
         </w:tc>
@@ -8040,13 +8244,23 @@
           </w:tcPr>
           <w:p>
             <w:pPr>
-              <w:rPr>
-                <w:rFonts w:ascii="Segoe UI Light" w:hAnsi="Segoe UI Light" w:cs="Segoe UI Light"/>
-                <w:color w:val="000000"/>
-                <w:sz w:val="22"/>
-                <w:szCs w:val="22"/>
-              </w:rPr>
-            </w:pPr>
+              <w:jc w:val="center"/>
+              <w:rPr>
+                <w:rFonts w:ascii="Segoe UI Light" w:hAnsi="Segoe UI Light" w:cs="Segoe UI Light"/>
+                <w:color w:val="000000"/>
+                <w:sz w:val="22"/>
+                <w:szCs w:val="22"/>
+              </w:rPr>
+            </w:pPr>
+            <w:r>
+              <w:rPr>
+                <w:rFonts w:ascii="Segoe UI Light" w:hAnsi="Segoe UI Light" w:cs="Segoe UI Light"/>
+                <w:color w:val="000000"/>
+                <w:sz w:val="22"/>
+                <w:szCs w:val="22"/>
+              </w:rPr>
+              <w:t>25</w:t>
+            </w:r>
           </w:p>
         </w:tc>
         <w:tc>
@@ -8059,6 +8273,64 @@
               <w:right w:val="single" w:sz="8" w:space="0" w:color="auto"/>
             </w:tcBorders>
             <w:vAlign w:val="center"/>
+          </w:tcPr>
+          <w:p>
+            <w:pPr>
+              <w:rPr>
+                <w:rFonts w:ascii="Segoe UI Light" w:hAnsi="Segoe UI Light" w:cs="Segoe UI Light"/>
+                <w:color w:val="000000"/>
+                <w:sz w:val="22"/>
+                <w:szCs w:val="22"/>
+              </w:rPr>
+            </w:pPr>
+            <w:r>
+              <w:rPr>
+                <w:rFonts w:ascii="Segoe UI Light" w:hAnsi="Segoe UI Light" w:cs="Segoe UI Light"/>
+                <w:color w:val="000000"/>
+                <w:sz w:val="22"/>
+                <w:szCs w:val="22"/>
+              </w:rPr>
+              <w:t>Managing virtual environments: Conda, Dockers and containers</w:t>
+            </w:r>
+          </w:p>
+          <w:p>
+            <w:pPr>
+              <w:rPr>
+                <w:rFonts w:ascii="Segoe UI Light" w:hAnsi="Segoe UI Light" w:cs="Segoe UI Light"/>
+                <w:color w:val="000000"/>
+                <w:sz w:val="22"/>
+                <w:szCs w:val="22"/>
+              </w:rPr>
+            </w:pPr>
+            <w:r>
+              <w:rPr>
+                <w:rFonts w:ascii="Segoe UI Light" w:hAnsi="Segoe UI Light" w:cs="Segoe UI Light"/>
+                <w:color w:val="000000"/>
+                <w:sz w:val="22"/>
+                <w:szCs w:val="22"/>
+              </w:rPr>
+              <w:t>In-class workshop</w:t>
+            </w:r>
+          </w:p>
+        </w:tc>
+      </w:tr>
+      <w:tr>
+        <w:trPr>
+          <w:trHeight w:val="40"/>
+          <w:jc w:val="center"/>
+        </w:trPr>
+        <w:tc>
+          <w:tcPr>
+            <w:tcW w:w="1064" w:type="dxa"/>
+            <w:tcBorders>
+              <w:top w:val="nil"/>
+              <w:left w:val="single" w:sz="8" w:space="0" w:color="auto"/>
+              <w:bottom w:val="single" w:sz="8" w:space="0" w:color="auto"/>
+              <w:right w:val="nil"/>
+            </w:tcBorders>
+            <w:shd w:val="clear" w:color="000000" w:fill="FFFFFF"/>
+            <w:vAlign w:val="center"/>
+            <w:hideMark/>
           </w:tcPr>
           <w:p>
             <w:pPr>
@@ -8067,7 +8339,7 @@
                 <w:rFonts w:ascii="Segoe UI Light" w:hAnsi="Segoe UI Light" w:cs="Segoe UI Light"/>
                 <w:b/>
                 <w:bCs/>
-                <w:color w:val="70AD47" w:themeColor="accent6"/>
+                <w:color w:val="000000"/>
                 <w:sz w:val="22"/>
                 <w:szCs w:val="22"/>
               </w:rPr>
@@ -8077,11 +8349,107 @@
                 <w:rFonts w:ascii="Segoe UI Light" w:hAnsi="Segoe UI Light" w:cs="Segoe UI Light"/>
                 <w:b/>
                 <w:bCs/>
-                <w:color w:val="70AD47" w:themeColor="accent6"/>
-                <w:sz w:val="22"/>
-                <w:szCs w:val="22"/>
-              </w:rPr>
-              <w:t>THANSKGIVING BREAK (No Class, No Office Hours)</w:t>
+                <w:color w:val="000000"/>
+                <w:sz w:val="22"/>
+                <w:szCs w:val="22"/>
+              </w:rPr>
+              <w:t> </w:t>
+            </w:r>
+          </w:p>
+        </w:tc>
+        <w:tc>
+          <w:tcPr>
+            <w:tcW w:w="1072" w:type="dxa"/>
+            <w:tcBorders>
+              <w:top w:val="nil"/>
+              <w:left w:val="nil"/>
+              <w:bottom w:val="single" w:sz="8" w:space="0" w:color="auto"/>
+              <w:right w:val="nil"/>
+            </w:tcBorders>
+            <w:vAlign w:val="center"/>
+            <w:hideMark/>
+          </w:tcPr>
+          <w:p>
+            <w:pPr>
+              <w:jc w:val="center"/>
+              <w:rPr>
+                <w:rFonts w:ascii="Segoe UI Light" w:hAnsi="Segoe UI Light" w:cs="Segoe UI Light"/>
+                <w:color w:val="000000"/>
+                <w:sz w:val="22"/>
+                <w:szCs w:val="22"/>
+              </w:rPr>
+            </w:pPr>
+            <w:r>
+              <w:rPr>
+                <w:rFonts w:ascii="Segoe UI Light" w:hAnsi="Segoe UI Light" w:cs="Segoe UI Light"/>
+                <w:color w:val="000000"/>
+                <w:sz w:val="22"/>
+                <w:szCs w:val="22"/>
+              </w:rPr>
+              <w:t>4-Dec</w:t>
+            </w:r>
+          </w:p>
+        </w:tc>
+        <w:tc>
+          <w:tcPr>
+            <w:tcW w:w="780" w:type="dxa"/>
+            <w:tcBorders>
+              <w:top w:val="nil"/>
+              <w:left w:val="nil"/>
+              <w:bottom w:val="single" w:sz="8" w:space="0" w:color="auto"/>
+              <w:right w:val="nil"/>
+            </w:tcBorders>
+          </w:tcPr>
+          <w:p>
+            <w:pPr>
+              <w:jc w:val="center"/>
+              <w:rPr>
+                <w:rFonts w:ascii="Segoe UI Light" w:hAnsi="Segoe UI Light" w:cs="Segoe UI Light"/>
+                <w:color w:val="000000"/>
+                <w:sz w:val="22"/>
+                <w:szCs w:val="22"/>
+              </w:rPr>
+            </w:pPr>
+            <w:r>
+              <w:rPr>
+                <w:rFonts w:ascii="Segoe UI Light" w:hAnsi="Segoe UI Light" w:cs="Segoe UI Light"/>
+                <w:color w:val="000000"/>
+                <w:sz w:val="22"/>
+                <w:szCs w:val="22"/>
+              </w:rPr>
+              <w:t>25</w:t>
+            </w:r>
+          </w:p>
+        </w:tc>
+        <w:tc>
+          <w:tcPr>
+            <w:tcW w:w="6219" w:type="dxa"/>
+            <w:tcBorders>
+              <w:top w:val="nil"/>
+              <w:left w:val="nil"/>
+              <w:bottom w:val="single" w:sz="8" w:space="0" w:color="auto"/>
+              <w:right w:val="single" w:sz="8" w:space="0" w:color="auto"/>
+            </w:tcBorders>
+            <w:vAlign w:val="center"/>
+            <w:hideMark/>
+          </w:tcPr>
+          <w:p>
+            <w:pPr>
+              <w:rPr>
+                <w:rFonts w:ascii="Segoe UI Light" w:hAnsi="Segoe UI Light" w:cs="Segoe UI Light"/>
+                <w:color w:val="000000"/>
+                <w:sz w:val="22"/>
+                <w:szCs w:val="22"/>
+              </w:rPr>
+            </w:pPr>
+            <w:r>
+              <w:rPr>
+                <w:rFonts w:ascii="Segoe UI Light" w:hAnsi="Segoe UI Light" w:cs="Segoe UI Light"/>
+                <w:color w:val="000000"/>
+                <w:sz w:val="22"/>
+                <w:szCs w:val="22"/>
+              </w:rPr>
+              <w:t>In-class workshop</w:t>
             </w:r>
           </w:p>
         </w:tc>
@@ -8125,7 +8493,7 @@
                 <w:sz w:val="22"/>
                 <w:szCs w:val="22"/>
               </w:rPr>
-              <w:t>Week 15</w:t>
+              <w:t>Week 16</w:t>
             </w:r>
           </w:p>
         </w:tc>
@@ -8158,16 +8526,7 @@
                 <w:sz w:val="22"/>
                 <w:szCs w:val="22"/>
               </w:rPr>
-              <w:t>2</w:t>
-            </w:r>
-            <w:r>
-              <w:rPr>
-                <w:rFonts w:ascii="Segoe UI Light" w:hAnsi="Segoe UI Light" w:cs="Segoe UI Light"/>
-                <w:color w:val="000000"/>
-                <w:sz w:val="22"/>
-                <w:szCs w:val="22"/>
-              </w:rPr>
-              <w:t>-Dec</w:t>
+              <w:t>9-Dec</w:t>
             </w:r>
           </w:p>
         </w:tc>
@@ -8198,7 +8557,7 @@
                 <w:sz w:val="22"/>
                 <w:szCs w:val="22"/>
               </w:rPr>
-              <w:t>25</w:t>
+              <w:t>26</w:t>
             </w:r>
           </w:p>
         </w:tc>
@@ -8212,473 +8571,698 @@
               <w:right w:val="single" w:sz="8" w:space="0" w:color="auto"/>
             </w:tcBorders>
             <w:vAlign w:val="center"/>
-          </w:tcPr>
-          <w:p>
-            <w:pPr>
-              <w:rPr>
-                <w:rFonts w:ascii="Segoe UI Light" w:hAnsi="Segoe UI Light" w:cs="Segoe UI Light"/>
-                <w:color w:val="000000"/>
-                <w:sz w:val="22"/>
-                <w:szCs w:val="22"/>
-              </w:rPr>
-            </w:pPr>
-            <w:r>
-              <w:rPr>
-                <w:rFonts w:ascii="Segoe UI Light" w:hAnsi="Segoe UI Light" w:cs="Segoe UI Light"/>
-                <w:color w:val="000000"/>
-                <w:sz w:val="22"/>
-                <w:szCs w:val="22"/>
-              </w:rPr>
-              <w:t xml:space="preserve">Managing virtual environments: </w:t>
-            </w:r>
-            <w:proofErr w:type="spellStart"/>
-            <w:r>
-              <w:rPr>
-                <w:rFonts w:ascii="Segoe UI Light" w:hAnsi="Segoe UI Light" w:cs="Segoe UI Light"/>
-                <w:color w:val="000000"/>
-                <w:sz w:val="22"/>
-                <w:szCs w:val="22"/>
-              </w:rPr>
-              <w:t>Conda</w:t>
-            </w:r>
-            <w:proofErr w:type="spellEnd"/>
-            <w:r>
-              <w:rPr>
-                <w:rFonts w:ascii="Segoe UI Light" w:hAnsi="Segoe UI Light" w:cs="Segoe UI Light"/>
-                <w:color w:val="000000"/>
-                <w:sz w:val="22"/>
-                <w:szCs w:val="22"/>
-              </w:rPr>
-              <w:t>, Dockers and containers</w:t>
-            </w:r>
-          </w:p>
-        </w:tc>
-      </w:tr>
-      <w:tr>
-        <w:trPr>
-          <w:trHeight w:val="360"/>
-          <w:jc w:val="center"/>
-        </w:trPr>
-        <w:tc>
-          <w:tcPr>
-            <w:tcW w:w="1064" w:type="dxa"/>
-            <w:tcBorders>
-              <w:top w:val="nil"/>
-              <w:left w:val="single" w:sz="8" w:space="0" w:color="auto"/>
-              <w:bottom w:val="single" w:sz="8" w:space="0" w:color="auto"/>
-              <w:right w:val="nil"/>
-            </w:tcBorders>
-            <w:shd w:val="clear" w:color="000000" w:fill="FFFFFF"/>
-            <w:vAlign w:val="center"/>
-          </w:tcPr>
-          <w:p>
-            <w:pPr>
-              <w:jc w:val="both"/>
+            <w:hideMark/>
+          </w:tcPr>
+          <w:p>
+            <w:pPr>
+              <w:rPr>
+                <w:rFonts w:ascii="Segoe UI Light" w:hAnsi="Segoe UI Light" w:cs="Segoe UI Light"/>
+                <w:color w:val="000000"/>
+                <w:sz w:val="22"/>
+                <w:szCs w:val="22"/>
+              </w:rPr>
+            </w:pPr>
+            <w:r>
+              <w:rPr>
+                <w:rFonts w:ascii="Segoe UI Light" w:hAnsi="Segoe UI Light" w:cs="Segoe UI Light"/>
+                <w:color w:val="000000"/>
+                <w:sz w:val="22"/>
+                <w:szCs w:val="22"/>
+              </w:rPr>
+              <w:t>In-class workshop</w:t>
+            </w:r>
+          </w:p>
+          <w:p>
+            <w:pPr>
+              <w:rPr>
+                <w:rFonts w:ascii="Segoe UI Light" w:hAnsi="Segoe UI Light" w:cs="Segoe UI Light"/>
+                <w:color w:val="000000"/>
+                <w:sz w:val="22"/>
+                <w:szCs w:val="22"/>
+              </w:rPr>
+            </w:pPr>
+            <w:r>
               <w:rPr>
                 <w:rFonts w:ascii="Segoe UI Light" w:hAnsi="Segoe UI Light" w:cs="Segoe UI Light"/>
                 <w:b/>
                 <w:bCs/>
-                <w:color w:val="000000"/>
-                <w:sz w:val="22"/>
-                <w:szCs w:val="22"/>
-              </w:rPr>
-            </w:pPr>
-          </w:p>
-        </w:tc>
-        <w:tc>
-          <w:tcPr>
-            <w:tcW w:w="1072" w:type="dxa"/>
-            <w:tcBorders>
-              <w:top w:val="nil"/>
-              <w:left w:val="nil"/>
-              <w:bottom w:val="single" w:sz="8" w:space="0" w:color="auto"/>
-              <w:right w:val="nil"/>
-            </w:tcBorders>
-            <w:vAlign w:val="center"/>
-          </w:tcPr>
-          <w:p>
-            <w:pPr>
-              <w:jc w:val="center"/>
-              <w:rPr>
-                <w:rFonts w:ascii="Segoe UI Light" w:hAnsi="Segoe UI Light" w:cs="Segoe UI Light"/>
-                <w:color w:val="000000"/>
-                <w:sz w:val="22"/>
-                <w:szCs w:val="22"/>
-              </w:rPr>
-            </w:pPr>
-            <w:r>
-              <w:rPr>
-                <w:rFonts w:ascii="Segoe UI Light" w:hAnsi="Segoe UI Light" w:cs="Segoe UI Light"/>
-                <w:color w:val="000000"/>
-                <w:sz w:val="22"/>
-                <w:szCs w:val="22"/>
-              </w:rPr>
-              <w:t>2</w:t>
-            </w:r>
-            <w:r>
-              <w:rPr>
-                <w:rFonts w:ascii="Segoe UI Light" w:hAnsi="Segoe UI Light" w:cs="Segoe UI Light"/>
-                <w:color w:val="000000"/>
-                <w:sz w:val="22"/>
-                <w:szCs w:val="22"/>
-              </w:rPr>
-              <w:t>-Dec</w:t>
-            </w:r>
-          </w:p>
-        </w:tc>
-        <w:tc>
-          <w:tcPr>
-            <w:tcW w:w="780" w:type="dxa"/>
-            <w:tcBorders>
-              <w:top w:val="nil"/>
-              <w:left w:val="nil"/>
-              <w:bottom w:val="single" w:sz="8" w:space="0" w:color="auto"/>
-              <w:right w:val="nil"/>
-            </w:tcBorders>
-          </w:tcPr>
-          <w:p>
-            <w:pPr>
-              <w:jc w:val="center"/>
-              <w:rPr>
-                <w:rFonts w:ascii="Segoe UI Light" w:hAnsi="Segoe UI Light" w:cs="Segoe UI Light"/>
-                <w:color w:val="000000"/>
-                <w:sz w:val="22"/>
-                <w:szCs w:val="22"/>
-              </w:rPr>
-            </w:pPr>
-          </w:p>
-        </w:tc>
-        <w:tc>
-          <w:tcPr>
-            <w:tcW w:w="6219" w:type="dxa"/>
-            <w:tcBorders>
-              <w:top w:val="nil"/>
-              <w:left w:val="nil"/>
-              <w:bottom w:val="single" w:sz="8" w:space="0" w:color="auto"/>
-              <w:right w:val="single" w:sz="8" w:space="0" w:color="auto"/>
-            </w:tcBorders>
-            <w:vAlign w:val="center"/>
-          </w:tcPr>
-          <w:p>
-            <w:pPr>
-              <w:rPr>
-                <w:rFonts w:ascii="Segoe UI Light" w:hAnsi="Segoe UI Light" w:cs="Segoe UI Light"/>
-                <w:color w:val="000000"/>
-                <w:sz w:val="22"/>
-                <w:szCs w:val="22"/>
-              </w:rPr>
-            </w:pPr>
-            <w:r>
-              <w:rPr>
-                <w:rFonts w:ascii="Segoe UI Light" w:hAnsi="Segoe UI Light" w:cs="Segoe UI Light"/>
-                <w:color w:val="4472C4" w:themeColor="accent1"/>
-                <w:sz w:val="22"/>
-                <w:szCs w:val="22"/>
-              </w:rPr>
-              <w:t>Project 3 due (10 p.m.)</w:t>
-            </w:r>
-          </w:p>
-        </w:tc>
-      </w:tr>
-      <w:tr>
-        <w:trPr>
-          <w:trHeight w:val="40"/>
-          <w:jc w:val="center"/>
-        </w:trPr>
-        <w:tc>
-          <w:tcPr>
-            <w:tcW w:w="1064" w:type="dxa"/>
-            <w:tcBorders>
-              <w:top w:val="nil"/>
-              <w:left w:val="single" w:sz="8" w:space="0" w:color="auto"/>
-              <w:bottom w:val="single" w:sz="8" w:space="0" w:color="auto"/>
-              <w:right w:val="nil"/>
-            </w:tcBorders>
-            <w:shd w:val="clear" w:color="000000" w:fill="FFFFFF"/>
-            <w:vAlign w:val="center"/>
-            <w:hideMark/>
-          </w:tcPr>
-          <w:p>
-            <w:pPr>
-              <w:jc w:val="both"/>
+                <w:color w:val="70AD47" w:themeColor="accent6"/>
+              </w:rPr>
+              <w:t>(</w:t>
+            </w:r>
+            <w:r>
               <w:rPr>
                 <w:rFonts w:ascii="Segoe UI Light" w:hAnsi="Segoe UI Light" w:cs="Segoe UI Light"/>
                 <w:b/>
                 <w:bCs/>
-                <w:color w:val="000000"/>
-                <w:sz w:val="22"/>
-                <w:szCs w:val="22"/>
-              </w:rPr>
-            </w:pPr>
+                <w:color w:val="70AD47" w:themeColor="accent6"/>
+              </w:rPr>
+              <w:t xml:space="preserve">Zoom </w:t>
+            </w:r>
             <w:r>
               <w:rPr>
                 <w:rFonts w:ascii="Segoe UI Light" w:hAnsi="Segoe UI Light" w:cs="Segoe UI Light"/>
                 <w:b/>
                 <w:bCs/>
-                <w:color w:val="000000"/>
-                <w:sz w:val="22"/>
-                <w:szCs w:val="22"/>
-              </w:rPr>
-              <w:t> </w:t>
-            </w:r>
-          </w:p>
-        </w:tc>
-        <w:tc>
-          <w:tcPr>
-            <w:tcW w:w="1072" w:type="dxa"/>
-            <w:tcBorders>
-              <w:top w:val="nil"/>
-              <w:left w:val="nil"/>
-              <w:bottom w:val="single" w:sz="8" w:space="0" w:color="auto"/>
-              <w:right w:val="nil"/>
-            </w:tcBorders>
-            <w:vAlign w:val="center"/>
-            <w:hideMark/>
-          </w:tcPr>
-          <w:p>
-            <w:pPr>
-              <w:jc w:val="center"/>
-              <w:rPr>
-                <w:rFonts w:ascii="Segoe UI Light" w:hAnsi="Segoe UI Light" w:cs="Segoe UI Light"/>
-                <w:color w:val="000000"/>
-                <w:sz w:val="22"/>
-                <w:szCs w:val="22"/>
-              </w:rPr>
-            </w:pPr>
-            <w:r>
-              <w:rPr>
-                <w:rFonts w:ascii="Segoe UI Light" w:hAnsi="Segoe UI Light" w:cs="Segoe UI Light"/>
-                <w:color w:val="000000"/>
-                <w:sz w:val="22"/>
-                <w:szCs w:val="22"/>
-              </w:rPr>
-              <w:t>4</w:t>
-            </w:r>
-            <w:r>
-              <w:rPr>
-                <w:rFonts w:ascii="Segoe UI Light" w:hAnsi="Segoe UI Light" w:cs="Segoe UI Light"/>
-                <w:color w:val="000000"/>
-                <w:sz w:val="22"/>
-                <w:szCs w:val="22"/>
-              </w:rPr>
-              <w:t>-Dec</w:t>
-            </w:r>
-          </w:p>
-        </w:tc>
-        <w:tc>
-          <w:tcPr>
-            <w:tcW w:w="780" w:type="dxa"/>
-            <w:tcBorders>
-              <w:top w:val="nil"/>
-              <w:left w:val="nil"/>
-              <w:bottom w:val="single" w:sz="8" w:space="0" w:color="auto"/>
-              <w:right w:val="nil"/>
-            </w:tcBorders>
-          </w:tcPr>
-          <w:p>
-            <w:pPr>
-              <w:jc w:val="center"/>
-              <w:rPr>
-                <w:rFonts w:ascii="Segoe UI Light" w:hAnsi="Segoe UI Light" w:cs="Segoe UI Light"/>
-                <w:color w:val="000000"/>
-                <w:sz w:val="22"/>
-                <w:szCs w:val="22"/>
-              </w:rPr>
-            </w:pPr>
-            <w:r>
-              <w:rPr>
-                <w:rFonts w:ascii="Segoe UI Light" w:hAnsi="Segoe UI Light" w:cs="Segoe UI Light"/>
-                <w:color w:val="000000"/>
-                <w:sz w:val="22"/>
-                <w:szCs w:val="22"/>
-              </w:rPr>
-              <w:t>25</w:t>
-            </w:r>
-          </w:p>
-        </w:tc>
-        <w:tc>
-          <w:tcPr>
-            <w:tcW w:w="6219" w:type="dxa"/>
-            <w:tcBorders>
-              <w:top w:val="nil"/>
-              <w:left w:val="nil"/>
-              <w:bottom w:val="single" w:sz="8" w:space="0" w:color="auto"/>
-              <w:right w:val="single" w:sz="8" w:space="0" w:color="auto"/>
-            </w:tcBorders>
-            <w:vAlign w:val="center"/>
-            <w:hideMark/>
-          </w:tcPr>
-          <w:p>
-            <w:pPr>
-              <w:rPr>
-                <w:rFonts w:ascii="Segoe UI Light" w:hAnsi="Segoe UI Light" w:cs="Segoe UI Light"/>
-                <w:color w:val="000000"/>
-                <w:sz w:val="22"/>
-                <w:szCs w:val="22"/>
-              </w:rPr>
-            </w:pPr>
-            <w:r>
-              <w:rPr>
-                <w:rFonts w:ascii="Segoe UI Light" w:hAnsi="Segoe UI Light" w:cs="Segoe UI Light"/>
-                <w:color w:val="000000"/>
-                <w:sz w:val="22"/>
-                <w:szCs w:val="22"/>
-              </w:rPr>
-              <w:t>In-class workshop</w:t>
-            </w:r>
-          </w:p>
-        </w:tc>
-      </w:tr>
-      <w:tr>
-        <w:trPr>
-          <w:trHeight w:val="360"/>
-          <w:jc w:val="center"/>
-        </w:trPr>
-        <w:tc>
-          <w:tcPr>
-            <w:tcW w:w="1064" w:type="dxa"/>
-            <w:tcBorders>
-              <w:top w:val="nil"/>
-              <w:left w:val="single" w:sz="8" w:space="0" w:color="auto"/>
-              <w:bottom w:val="single" w:sz="8" w:space="0" w:color="auto"/>
-              <w:right w:val="nil"/>
-            </w:tcBorders>
-            <w:shd w:val="clear" w:color="000000" w:fill="FFFFFF"/>
-            <w:vAlign w:val="center"/>
-            <w:hideMark/>
-          </w:tcPr>
-          <w:p>
-            <w:pPr>
-              <w:jc w:val="both"/>
-              <w:rPr>
-                <w:rFonts w:ascii="Segoe UI Light" w:hAnsi="Segoe UI Light" w:cs="Segoe UI Light"/>
-                <w:b/>
-                <w:bCs/>
-                <w:color w:val="000000"/>
-                <w:sz w:val="22"/>
-                <w:szCs w:val="22"/>
-              </w:rPr>
-            </w:pPr>
-            <w:r>
-              <w:rPr>
-                <w:rFonts w:ascii="Segoe UI Light" w:hAnsi="Segoe UI Light" w:cs="Segoe UI Light"/>
-                <w:b/>
-                <w:bCs/>
-                <w:color w:val="000000"/>
-                <w:sz w:val="22"/>
-                <w:szCs w:val="22"/>
-              </w:rPr>
-              <w:t>Week 16</w:t>
-            </w:r>
-          </w:p>
-        </w:tc>
-        <w:tc>
-          <w:tcPr>
-            <w:tcW w:w="1072" w:type="dxa"/>
-            <w:tcBorders>
-              <w:top w:val="nil"/>
-              <w:left w:val="nil"/>
-              <w:bottom w:val="single" w:sz="8" w:space="0" w:color="auto"/>
-              <w:right w:val="nil"/>
-            </w:tcBorders>
-            <w:vAlign w:val="center"/>
-            <w:hideMark/>
-          </w:tcPr>
-          <w:p>
-            <w:pPr>
-              <w:jc w:val="center"/>
-              <w:rPr>
-                <w:rFonts w:ascii="Segoe UI Light" w:hAnsi="Segoe UI Light" w:cs="Segoe UI Light"/>
-                <w:color w:val="000000"/>
-                <w:sz w:val="22"/>
-                <w:szCs w:val="22"/>
-              </w:rPr>
-            </w:pPr>
-            <w:r>
-              <w:rPr>
-                <w:rFonts w:ascii="Segoe UI Light" w:hAnsi="Segoe UI Light" w:cs="Segoe UI Light"/>
-                <w:color w:val="000000"/>
-                <w:sz w:val="22"/>
-                <w:szCs w:val="22"/>
-              </w:rPr>
-              <w:t>9</w:t>
-            </w:r>
-            <w:r>
-              <w:rPr>
-                <w:rFonts w:ascii="Segoe UI Light" w:hAnsi="Segoe UI Light" w:cs="Segoe UI Light"/>
-                <w:color w:val="000000"/>
-                <w:sz w:val="22"/>
-                <w:szCs w:val="22"/>
-              </w:rPr>
-              <w:t>-Dec</w:t>
-            </w:r>
-          </w:p>
-        </w:tc>
-        <w:tc>
-          <w:tcPr>
-            <w:tcW w:w="780" w:type="dxa"/>
-            <w:tcBorders>
-              <w:top w:val="nil"/>
-              <w:left w:val="nil"/>
-              <w:bottom w:val="single" w:sz="8" w:space="0" w:color="auto"/>
-              <w:right w:val="nil"/>
-            </w:tcBorders>
-          </w:tcPr>
-          <w:p>
-            <w:pPr>
-              <w:jc w:val="center"/>
-              <w:rPr>
-                <w:rFonts w:ascii="Segoe UI Light" w:hAnsi="Segoe UI Light" w:cs="Segoe UI Light"/>
-                <w:color w:val="000000"/>
-                <w:sz w:val="22"/>
-                <w:szCs w:val="22"/>
-              </w:rPr>
-            </w:pPr>
-            <w:r>
-              <w:rPr>
-                <w:rFonts w:ascii="Segoe UI Light" w:hAnsi="Segoe UI Light" w:cs="Segoe UI Light"/>
-                <w:color w:val="000000"/>
-                <w:sz w:val="22"/>
-                <w:szCs w:val="22"/>
-              </w:rPr>
-              <w:t>26</w:t>
-            </w:r>
-          </w:p>
-        </w:tc>
-        <w:tc>
-          <w:tcPr>
-            <w:tcW w:w="6219" w:type="dxa"/>
-            <w:tcBorders>
-              <w:top w:val="nil"/>
-              <w:left w:val="nil"/>
-              <w:bottom w:val="single" w:sz="8" w:space="0" w:color="auto"/>
-              <w:right w:val="single" w:sz="8" w:space="0" w:color="auto"/>
-            </w:tcBorders>
-            <w:vAlign w:val="center"/>
-            <w:hideMark/>
-          </w:tcPr>
-          <w:p>
-            <w:pPr>
-              <w:rPr>
-                <w:rFonts w:ascii="Segoe UI Light" w:hAnsi="Segoe UI Light" w:cs="Segoe UI Light"/>
-                <w:color w:val="000000"/>
-                <w:sz w:val="22"/>
-                <w:szCs w:val="22"/>
-              </w:rPr>
-            </w:pPr>
-            <w:r>
-              <w:rPr>
-                <w:rFonts w:ascii="Segoe UI Light" w:hAnsi="Segoe UI Light" w:cs="Segoe UI Light"/>
-                <w:color w:val="000000"/>
-                <w:sz w:val="22"/>
-                <w:szCs w:val="22"/>
-              </w:rPr>
-              <w:t>In-class workshop</w:t>
+                <w:color w:val="70AD47" w:themeColor="accent6"/>
+              </w:rPr>
+              <w:t>Lecture)</w:t>
             </w:r>
           </w:p>
         </w:tc>
       </w:tr>
     </w:tbl>
+    <w:p>
+      <w:pPr>
+        <w:rPr>
+          <w:rFonts w:ascii="Segoe UI Light" w:hAnsi="Segoe UI Light" w:cs="Segoe UI Light"/>
+        </w:rPr>
+      </w:pPr>
+    </w:p>
+    <w:p>
+      <w:pPr>
+        <w:jc w:val="both"/>
+        <w:rPr>
+          <w:rFonts w:ascii="Segoe UI Light" w:hAnsi="Segoe UI Light" w:cs="Segoe UI Light"/>
+          <w:b/>
+          <w:bCs/>
+        </w:rPr>
+      </w:pPr>
+      <w:r>
+        <w:rPr>
+          <w:rFonts w:ascii="Segoe UI Light" w:hAnsi="Segoe UI Light" w:cs="Segoe UI Light"/>
+          <w:b/>
+          <w:bCs/>
+        </w:rPr>
+        <w:t>Generative AI Policy:</w:t>
+      </w:r>
+    </w:p>
+    <w:p>
+      <w:pPr>
+        <w:jc w:val="both"/>
+        <w:rPr>
+          <w:rFonts w:ascii="Segoe UI Light" w:hAnsi="Segoe UI Light" w:cs="Segoe UI Light"/>
+        </w:rPr>
+      </w:pPr>
+    </w:p>
+    <w:p>
+      <w:pPr>
+        <w:jc w:val="both"/>
+        <w:rPr>
+          <w:rFonts w:ascii="Segoe UI Light" w:hAnsi="Segoe UI Light" w:cs="Segoe UI Light"/>
+        </w:rPr>
+      </w:pPr>
+      <w:r>
+        <w:rPr>
+          <w:rFonts w:ascii="Segoe UI Light" w:hAnsi="Segoe UI Light" w:cs="Segoe UI Light"/>
+        </w:rPr>
+        <w:t>The use of generative AI in this course is restricted but not prohibited. The restrictions serve multiple, sometimes overlapping, purposes: preserving pedagogical integrity, preserving the integrity of assessment, helping students avoid plagiarism, misrepresentation, and shoddy</w:t>
+      </w:r>
+      <w:r>
+        <w:rPr>
+          <w:rFonts w:ascii="Segoe UI Light" w:hAnsi="Segoe UI Light" w:cs="Segoe UI Light"/>
+        </w:rPr>
+        <w:t xml:space="preserve"> </w:t>
+      </w:r>
+      <w:r>
+        <w:rPr>
+          <w:rFonts w:ascii="Segoe UI Light" w:hAnsi="Segoe UI Light" w:cs="Segoe UI Light"/>
+        </w:rPr>
+        <w:t>work. These restrictions are tailored to this course. Review them carefully.</w:t>
+      </w:r>
+    </w:p>
+    <w:p>
+      <w:pPr>
+        <w:jc w:val="both"/>
+        <w:rPr>
+          <w:rFonts w:ascii="Segoe UI Light" w:hAnsi="Segoe UI Light" w:cs="Segoe UI Light"/>
+        </w:rPr>
+      </w:pPr>
+    </w:p>
+    <w:p>
+      <w:pPr>
+        <w:jc w:val="both"/>
+        <w:rPr>
+          <w:rFonts w:ascii="Segoe UI Light" w:hAnsi="Segoe UI Light" w:cs="Segoe UI Light"/>
+        </w:rPr>
+      </w:pPr>
+      <w:r>
+        <w:rPr>
+          <w:rFonts w:ascii="Segoe UI Light" w:hAnsi="Segoe UI Light" w:cs="Segoe UI Light"/>
+        </w:rPr>
+        <w:lastRenderedPageBreak/>
+        <w:t xml:space="preserve">For this course, students are required to submit reports </w:t>
+      </w:r>
+      <w:r>
+        <w:rPr>
+          <w:rFonts w:ascii="Segoe UI Light" w:hAnsi="Segoe UI Light" w:cs="Segoe UI Light"/>
+        </w:rPr>
+        <w:t>which</w:t>
+      </w:r>
+      <w:r>
+        <w:rPr>
+          <w:rFonts w:ascii="Segoe UI Light" w:hAnsi="Segoe UI Light" w:cs="Segoe UI Light"/>
+        </w:rPr>
+        <w:t xml:space="preserve"> </w:t>
+      </w:r>
+      <w:r>
+        <w:rPr>
+          <w:rFonts w:ascii="Segoe UI Light" w:hAnsi="Segoe UI Light" w:cs="Segoe UI Light"/>
+        </w:rPr>
+        <w:t>include a coding component and a written communication component.</w:t>
+      </w:r>
+      <w:r>
+        <w:rPr>
+          <w:rFonts w:ascii="Segoe UI Light" w:hAnsi="Segoe UI Light" w:cs="Segoe UI Light"/>
+        </w:rPr>
+        <w:t xml:space="preserve"> </w:t>
+      </w:r>
+    </w:p>
+    <w:p>
+      <w:pPr>
+        <w:pStyle w:val="ListParagraph"/>
+        <w:numPr>
+          <w:ilvl w:val="0"/>
+          <w:numId w:val="31"/>
+        </w:numPr>
+        <w:jc w:val="both"/>
+        <w:rPr>
+          <w:rFonts w:ascii="Segoe UI Light" w:hAnsi="Segoe UI Light" w:cs="Segoe UI Light"/>
+        </w:rPr>
+      </w:pPr>
+      <w:r>
+        <w:rPr>
+          <w:rFonts w:ascii="Segoe UI Light" w:hAnsi="Segoe UI Light" w:cs="Segoe UI Light"/>
+        </w:rPr>
+        <w:t>S</w:t>
+      </w:r>
+      <w:r>
+        <w:rPr>
+          <w:rFonts w:ascii="Segoe UI Light" w:hAnsi="Segoe UI Light" w:cs="Segoe UI Light"/>
+        </w:rPr>
+        <w:t xml:space="preserve">tudents are allowed to use AI-assisted tools </w:t>
+      </w:r>
+      <w:r>
+        <w:rPr>
+          <w:rFonts w:ascii="Segoe UI Light" w:hAnsi="Segoe UI Light" w:cs="Segoe UI Light"/>
+        </w:rPr>
+        <w:t xml:space="preserve">to </w:t>
+      </w:r>
+      <w:r>
+        <w:rPr>
+          <w:rFonts w:ascii="Segoe UI Light" w:hAnsi="Segoe UI Light" w:cs="Segoe UI Light"/>
+        </w:rPr>
+        <w:t>write their code un</w:t>
+      </w:r>
+      <w:r>
+        <w:rPr>
+          <w:rFonts w:ascii="Segoe UI Light" w:hAnsi="Segoe UI Light" w:cs="Segoe UI Light"/>
+        </w:rPr>
+        <w:t xml:space="preserve">der </w:t>
+      </w:r>
+      <w:r>
+        <w:rPr>
+          <w:rFonts w:ascii="Segoe UI Light" w:hAnsi="Segoe UI Light" w:cs="Segoe UI Light"/>
+        </w:rPr>
+        <w:t xml:space="preserve">certain restrictions. AI tools can be used to </w:t>
+      </w:r>
+      <w:r>
+        <w:rPr>
+          <w:rFonts w:ascii="Segoe UI Light" w:hAnsi="Segoe UI Light" w:cs="Segoe UI Light"/>
+        </w:rPr>
+        <w:t xml:space="preserve">debug code, </w:t>
+      </w:r>
+      <w:r>
+        <w:rPr>
+          <w:rFonts w:ascii="Segoe UI Light" w:hAnsi="Segoe UI Light" w:cs="Segoe UI Light"/>
+        </w:rPr>
+        <w:t xml:space="preserve">generate </w:t>
+      </w:r>
+      <w:r>
+        <w:rPr>
+          <w:rFonts w:ascii="Segoe UI Light" w:hAnsi="Segoe UI Light" w:cs="Segoe UI Light"/>
+        </w:rPr>
+        <w:t xml:space="preserve">data quality checks, </w:t>
+      </w:r>
+      <w:r>
+        <w:rPr>
+          <w:rFonts w:ascii="Segoe UI Light" w:hAnsi="Segoe UI Light" w:cs="Segoe UI Light"/>
+        </w:rPr>
+        <w:t>format tables, generate figures, and propose new algorithms.</w:t>
+      </w:r>
+      <w:r>
+        <w:rPr>
+          <w:rFonts w:ascii="Segoe UI Light" w:hAnsi="Segoe UI Light" w:cs="Segoe UI Light"/>
+        </w:rPr>
+        <w:t xml:space="preserve"> This use should be restricted to specific portions</w:t>
+      </w:r>
+      <w:r>
+        <w:rPr>
+          <w:rFonts w:ascii="Segoe UI Light" w:hAnsi="Segoe UI Light" w:cs="Segoe UI Light"/>
+        </w:rPr>
+        <w:t xml:space="preserve"> of the assignments and for specific purposes.</w:t>
+      </w:r>
+      <w:r>
+        <w:rPr>
+          <w:rFonts w:ascii="Segoe UI Light" w:hAnsi="Segoe UI Light" w:cs="Segoe UI Light"/>
+        </w:rPr>
+        <w:t xml:space="preserve"> </w:t>
+      </w:r>
+      <w:r>
+        <w:rPr>
+          <w:rFonts w:ascii="Segoe UI Light" w:hAnsi="Segoe UI Light" w:cs="Segoe UI Light"/>
+        </w:rPr>
+        <w:t>Scripts that are</w:t>
+      </w:r>
+      <w:r>
+        <w:rPr>
+          <w:rFonts w:ascii="Segoe UI Light" w:hAnsi="Segoe UI Light" w:cs="Segoe UI Light"/>
+        </w:rPr>
+        <w:t xml:space="preserve"> obviously</w:t>
+      </w:r>
+      <w:r>
+        <w:rPr>
+          <w:rFonts w:ascii="Segoe UI Light" w:hAnsi="Segoe UI Light" w:cs="Segoe UI Light"/>
+        </w:rPr>
+        <w:t xml:space="preserve"> AI generated </w:t>
+      </w:r>
+      <w:r>
+        <w:rPr>
+          <w:rFonts w:ascii="Segoe UI Light" w:hAnsi="Segoe UI Light" w:cs="Segoe UI Light"/>
+        </w:rPr>
+        <w:t xml:space="preserve">in their entirety with minimal editing </w:t>
+      </w:r>
+      <w:r>
+        <w:rPr>
+          <w:rFonts w:ascii="Segoe UI Light" w:hAnsi="Segoe UI Light" w:cs="Segoe UI Light"/>
+        </w:rPr>
+        <w:t xml:space="preserve">may </w:t>
+      </w:r>
+      <w:r>
+        <w:rPr>
+          <w:rFonts w:ascii="Segoe UI Light" w:hAnsi="Segoe UI Light" w:cs="Segoe UI Light"/>
+        </w:rPr>
+        <w:t>merit a failing grade.</w:t>
+      </w:r>
+      <w:r>
+        <w:rPr>
+          <w:rFonts w:ascii="Segoe UI Light" w:hAnsi="Segoe UI Light" w:cs="Segoe UI Light"/>
+        </w:rPr>
+        <w:t xml:space="preserve"> Code explanations in the student’s own words are strongly recommended</w:t>
+      </w:r>
+      <w:r>
+        <w:rPr>
+          <w:rFonts w:ascii="Segoe UI Light" w:hAnsi="Segoe UI Light" w:cs="Segoe UI Light"/>
+        </w:rPr>
+        <w:t xml:space="preserve"> even when part of the code is AI generated</w:t>
+      </w:r>
+      <w:r>
+        <w:rPr>
+          <w:rFonts w:ascii="Segoe UI Light" w:hAnsi="Segoe UI Light" w:cs="Segoe UI Light"/>
+        </w:rPr>
+        <w:t>.</w:t>
+      </w:r>
+      <w:r>
+        <w:rPr>
+          <w:rFonts w:ascii="Segoe UI Light" w:hAnsi="Segoe UI Light" w:cs="Segoe UI Light"/>
+        </w:rPr>
+        <w:t xml:space="preserve"> If in doubt, clarify with the instructor whether a particular AI use is acceptable.</w:t>
+      </w:r>
+    </w:p>
+    <w:p>
+      <w:pPr>
+        <w:pStyle w:val="ListParagraph"/>
+        <w:ind w:left="1080"/>
+        <w:jc w:val="both"/>
+        <w:rPr>
+          <w:rFonts w:ascii="Segoe UI Light" w:hAnsi="Segoe UI Light" w:cs="Segoe UI Light"/>
+        </w:rPr>
+      </w:pPr>
+    </w:p>
+    <w:p>
+      <w:pPr>
+        <w:pStyle w:val="ListParagraph"/>
+        <w:numPr>
+          <w:ilvl w:val="0"/>
+          <w:numId w:val="31"/>
+        </w:numPr>
+        <w:jc w:val="both"/>
+        <w:rPr>
+          <w:rFonts w:ascii="Segoe UI Light" w:hAnsi="Segoe UI Light" w:cs="Segoe UI Light"/>
+        </w:rPr>
+      </w:pPr>
+      <w:r>
+        <w:rPr>
+          <w:rFonts w:ascii="Segoe UI Light" w:hAnsi="Segoe UI Light" w:cs="Segoe UI Light"/>
+        </w:rPr>
+        <w:t>S</w:t>
+      </w:r>
+      <w:r>
+        <w:rPr>
+          <w:rFonts w:ascii="Segoe UI Light" w:hAnsi="Segoe UI Light" w:cs="Segoe UI Light"/>
+        </w:rPr>
+        <w:t>tudents are prohibited from presenting text generated by generative AI as their own in any assessable work product. This means that students may not copy-paste more than 8 consecutive words from any source without specific attribution (superficial changes designed to evade the substance of this rule will be disregarded);</w:t>
+      </w:r>
+      <w:r>
+        <w:rPr>
+          <w:rFonts w:ascii="Segoe UI Light" w:hAnsi="Segoe UI Light" w:cs="Segoe UI Light"/>
+        </w:rPr>
+        <w:t xml:space="preserve"> this rule only applies to the interpretation/description portion of assignments and not the code itself.</w:t>
+      </w:r>
+      <w:r>
+        <w:rPr>
+          <w:rFonts w:ascii="Segoe UI Light" w:hAnsi="Segoe UI Light" w:cs="Segoe UI Light"/>
+        </w:rPr>
+        <w:t xml:space="preserve"> </w:t>
+      </w:r>
+      <w:r>
+        <w:rPr>
+          <w:rFonts w:ascii="Segoe UI Light" w:hAnsi="Segoe UI Light" w:cs="Segoe UI Light"/>
+        </w:rPr>
+        <w:t>S</w:t>
+      </w:r>
+      <w:r>
+        <w:rPr>
+          <w:rFonts w:ascii="Segoe UI Light" w:hAnsi="Segoe UI Light" w:cs="Segoe UI Light"/>
+        </w:rPr>
+        <w:t>tudents may not present specific insights and ideas from external sources without specific attribution to an appropriate source. In addition, students may not include factual information or citations from generative AI that you have not verified. Work containing obvious AI “hallucinations” of citations or quotations will merit a failing grade.</w:t>
+      </w:r>
+    </w:p>
+    <w:p>
+      <w:pPr>
+        <w:jc w:val="both"/>
+        <w:rPr>
+          <w:rFonts w:ascii="Segoe UI Light" w:hAnsi="Segoe UI Light" w:cs="Segoe UI Light"/>
+        </w:rPr>
+      </w:pPr>
+    </w:p>
+    <w:p>
+      <w:pPr>
+        <w:jc w:val="both"/>
+        <w:rPr>
+          <w:rFonts w:ascii="Segoe UI Light" w:hAnsi="Segoe UI Light" w:cs="Segoe UI Light"/>
+        </w:rPr>
+      </w:pPr>
+      <w:r>
+        <w:rPr>
+          <w:rFonts w:ascii="Segoe UI Light" w:hAnsi="Segoe UI Light" w:cs="Segoe UI Light"/>
+        </w:rPr>
+        <w:t xml:space="preserve">Students may use generative AI for research and source discovery provided they do so responsibly and in compliance with the restrictions above. Examples of acceptable uses include asking a generative AI tool for </w:t>
+      </w:r>
+      <w:r>
+        <w:rPr>
+          <w:rFonts w:ascii="Segoe UI Light" w:hAnsi="Segoe UI Light" w:cs="Segoe UI Light"/>
+        </w:rPr>
+        <w:t>new examples, clarification, and suggestions</w:t>
+      </w:r>
+      <w:r>
+        <w:rPr>
+          <w:rFonts w:ascii="Segoe UI Light" w:hAnsi="Segoe UI Light" w:cs="Segoe UI Light"/>
+        </w:rPr>
+        <w:t xml:space="preserve"> </w:t>
+      </w:r>
+      <w:r>
+        <w:rPr>
+          <w:rFonts w:ascii="Segoe UI Light" w:hAnsi="Segoe UI Light" w:cs="Segoe UI Light"/>
+        </w:rPr>
+        <w:t xml:space="preserve">about a statistical method </w:t>
+      </w:r>
+      <w:r>
+        <w:rPr>
+          <w:rFonts w:ascii="Segoe UI Light" w:hAnsi="Segoe UI Light" w:cs="Segoe UI Light"/>
+        </w:rPr>
+        <w:t>relating to a particular topic, or to review a draft of one’s work product and ask for suggested additional sources or authorities.</w:t>
+      </w:r>
+    </w:p>
+    <w:p>
+      <w:pPr>
+        <w:jc w:val="both"/>
+        <w:rPr>
+          <w:rFonts w:ascii="Segoe UI Light" w:hAnsi="Segoe UI Light" w:cs="Segoe UI Light"/>
+        </w:rPr>
+      </w:pPr>
+    </w:p>
+    <w:p>
+      <w:pPr>
+        <w:jc w:val="both"/>
+        <w:rPr>
+          <w:rFonts w:ascii="Segoe UI Light" w:hAnsi="Segoe UI Light" w:cs="Segoe UI Light"/>
+        </w:rPr>
+      </w:pPr>
+      <w:r>
+        <w:rPr>
+          <w:rFonts w:ascii="Segoe UI Light" w:hAnsi="Segoe UI Light" w:cs="Segoe UI Light"/>
+        </w:rPr>
+        <w:t>Students may use generative AI to improve their work product, provided they do so</w:t>
+      </w:r>
+      <w:r>
+        <w:rPr>
+          <w:rFonts w:ascii="Segoe UI Light" w:hAnsi="Segoe UI Light" w:cs="Segoe UI Light"/>
+        </w:rPr>
+        <w:t xml:space="preserve"> </w:t>
+      </w:r>
+      <w:r>
+        <w:rPr>
+          <w:rFonts w:ascii="Segoe UI Light" w:hAnsi="Segoe UI Light" w:cs="Segoe UI Light"/>
+        </w:rPr>
+        <w:t>responsibly and in compliance with the restrictions above. For example, students may use</w:t>
+      </w:r>
+      <w:r>
+        <w:rPr>
+          <w:rFonts w:ascii="Segoe UI Light" w:hAnsi="Segoe UI Light" w:cs="Segoe UI Light"/>
+        </w:rPr>
+        <w:t xml:space="preserve"> </w:t>
+      </w:r>
+      <w:r>
+        <w:rPr>
+          <w:rFonts w:ascii="Segoe UI Light" w:hAnsi="Segoe UI Light" w:cs="Segoe UI Light"/>
+        </w:rPr>
+        <w:t>generative AI for brainstorming/ideation for final paper topics, or to suggest a more logical</w:t>
+      </w:r>
+      <w:r>
+        <w:rPr>
+          <w:rFonts w:ascii="Segoe UI Light" w:hAnsi="Segoe UI Light" w:cs="Segoe UI Light"/>
+        </w:rPr>
+        <w:t xml:space="preserve"> </w:t>
+      </w:r>
+      <w:r>
+        <w:rPr>
+          <w:rFonts w:ascii="Segoe UI Light" w:hAnsi="Segoe UI Light" w:cs="Segoe UI Light"/>
+        </w:rPr>
+        <w:t>structure for the final paper; students may use generative AI to identify weaknesses in</w:t>
+      </w:r>
+      <w:r>
+        <w:rPr>
+          <w:rFonts w:ascii="Segoe UI Light" w:hAnsi="Segoe UI Light" w:cs="Segoe UI Light"/>
+        </w:rPr>
+        <w:t xml:space="preserve"> </w:t>
+      </w:r>
+      <w:r>
+        <w:rPr>
+          <w:rFonts w:ascii="Segoe UI Light" w:hAnsi="Segoe UI Light" w:cs="Segoe UI Light"/>
+        </w:rPr>
+        <w:t xml:space="preserve">arguments, find counter-arguments they may have overlooked, and otherwise critically </w:t>
+      </w:r>
+      <w:r>
+        <w:rPr>
+          <w:rFonts w:ascii="Segoe UI Light" w:hAnsi="Segoe UI Light" w:cs="Segoe UI Light"/>
+        </w:rPr>
+        <w:t xml:space="preserve"> </w:t>
+      </w:r>
+      <w:r>
+        <w:rPr>
+          <w:rFonts w:ascii="Segoe UI Light" w:hAnsi="Segoe UI Light" w:cs="Segoe UI Light"/>
+        </w:rPr>
+        <w:t xml:space="preserve">evaluate their written work. Likewise, students may use generative AI to improve their understanding of complex </w:t>
+      </w:r>
+      <w:r>
+        <w:rPr>
+          <w:rFonts w:ascii="Segoe UI Light" w:hAnsi="Segoe UI Light" w:cs="Segoe UI Light"/>
+        </w:rPr>
+        <w:t>topics</w:t>
+      </w:r>
+      <w:r>
+        <w:rPr>
+          <w:rFonts w:ascii="Segoe UI Light" w:hAnsi="Segoe UI Light" w:cs="Segoe UI Light"/>
+        </w:rPr>
+        <w:t>, including by asking for different types of explanations,</w:t>
+      </w:r>
+      <w:r>
+        <w:rPr>
+          <w:rFonts w:ascii="Segoe UI Light" w:hAnsi="Segoe UI Light" w:cs="Segoe UI Light"/>
+        </w:rPr>
+        <w:t xml:space="preserve"> </w:t>
+      </w:r>
+      <w:r>
+        <w:rPr>
+          <w:rFonts w:ascii="Segoe UI Light" w:hAnsi="Segoe UI Light" w:cs="Segoe UI Light"/>
+        </w:rPr>
+        <w:t>provided they do so responsibly and in compliance with the restrictions above.</w:t>
+      </w:r>
+    </w:p>
+    <w:p>
+      <w:pPr>
+        <w:jc w:val="both"/>
+        <w:rPr>
+          <w:rFonts w:ascii="Segoe UI Light" w:hAnsi="Segoe UI Light" w:cs="Segoe UI Light"/>
+        </w:rPr>
+      </w:pPr>
+    </w:p>
+    <w:p>
+      <w:pPr>
+        <w:jc w:val="both"/>
+        <w:rPr>
+          <w:rFonts w:ascii="Segoe UI Light" w:hAnsi="Segoe UI Light" w:cs="Segoe UI Light"/>
+        </w:rPr>
+      </w:pPr>
+      <w:r>
+        <w:rPr>
+          <w:rFonts w:ascii="Segoe UI Light" w:hAnsi="Segoe UI Light" w:cs="Segoe UI Light"/>
+        </w:rPr>
+        <w:t>Students may use generative AI for detailed assistance with drafting, editing and style, provided they do so responsibly and in compliance with the restrictions above and with</w:t>
+      </w:r>
+      <w:r>
+        <w:rPr>
+          <w:rFonts w:ascii="Segoe UI Light" w:hAnsi="Segoe UI Light" w:cs="Segoe UI Light"/>
+        </w:rPr>
+        <w:t xml:space="preserve"> </w:t>
+      </w:r>
+      <w:r>
+        <w:rPr>
+          <w:rFonts w:ascii="Segoe UI Light" w:hAnsi="Segoe UI Light" w:cs="Segoe UI Light"/>
+        </w:rPr>
+        <w:t xml:space="preserve">appropriate disclosure. For example, a student may draft a passage and then ask generative </w:t>
+      </w:r>
+      <w:r>
+        <w:rPr>
+          <w:rFonts w:ascii="Segoe UI Light" w:hAnsi="Segoe UI Light" w:cs="Segoe UI Light"/>
+        </w:rPr>
+        <w:lastRenderedPageBreak/>
+        <w:t>AI to rewrite it in a particular style (law review, client email, opening argument), or to maintain a particular style but reduce the word count; a student may draft a passage in a language other than English and then ask generative AI for an English translation; a student may use generative AI to suggest more effective transitions and topic sentences, introductions and</w:t>
+      </w:r>
+      <w:r>
+        <w:rPr>
+          <w:rFonts w:ascii="Segoe UI Light" w:hAnsi="Segoe UI Light" w:cs="Segoe UI Light"/>
+        </w:rPr>
+        <w:t xml:space="preserve"> </w:t>
+      </w:r>
+      <w:r>
+        <w:rPr>
+          <w:rFonts w:ascii="Segoe UI Light" w:hAnsi="Segoe UI Light" w:cs="Segoe UI Light"/>
+        </w:rPr>
+        <w:t>conclusions; a student may use generative AI for suggestions as to how to more effectively</w:t>
+      </w:r>
+      <w:r>
+        <w:rPr>
+          <w:rFonts w:ascii="Segoe UI Light" w:hAnsi="Segoe UI Light" w:cs="Segoe UI Light"/>
+        </w:rPr>
+        <w:t xml:space="preserve"> </w:t>
+      </w:r>
+      <w:r>
+        <w:rPr>
+          <w:rFonts w:ascii="Segoe UI Light" w:hAnsi="Segoe UI Light" w:cs="Segoe UI Light"/>
+        </w:rPr>
+        <w:t>integrate quotations into their main text.</w:t>
+      </w:r>
+    </w:p>
+    <w:p>
+      <w:pPr>
+        <w:jc w:val="both"/>
+        <w:rPr>
+          <w:rFonts w:ascii="Segoe UI Light" w:hAnsi="Segoe UI Light" w:cs="Segoe UI Light"/>
+        </w:rPr>
+      </w:pPr>
+    </w:p>
+    <w:p>
+      <w:pPr>
+        <w:jc w:val="both"/>
+        <w:rPr>
+          <w:rFonts w:ascii="Segoe UI Light" w:hAnsi="Segoe UI Light" w:cs="Segoe UI Light"/>
+        </w:rPr>
+      </w:pPr>
+      <w:r>
+        <w:rPr>
+          <w:rFonts w:ascii="Segoe UI Light" w:hAnsi="Segoe UI Light" w:cs="Segoe UI Light"/>
+        </w:rPr>
+        <w:t>Students may use generative AI to support their learning and help them comprehend course materials, provided they do so responsibly and in compliance with the restrictions above. For</w:t>
+      </w:r>
+      <w:r>
+        <w:rPr>
+          <w:rFonts w:ascii="Segoe UI Light" w:hAnsi="Segoe UI Light" w:cs="Segoe UI Light"/>
+        </w:rPr>
+        <w:t xml:space="preserve"> </w:t>
+      </w:r>
+      <w:r>
+        <w:rPr>
+          <w:rFonts w:ascii="Segoe UI Light" w:hAnsi="Segoe UI Light" w:cs="Segoe UI Light"/>
+        </w:rPr>
+        <w:t>example, students may use generative AI as a tutor or a study partner, or to create flashcards, hypotheticals, explanations, quiz questions, etc.; students may use generative AI to summarize and outline course materials; students may use generative AI to suggest answers to non</w:t>
+      </w:r>
+      <w:r>
+        <w:rPr>
+          <w:rFonts w:ascii="Segoe UI Light" w:hAnsi="Segoe UI Light" w:cs="Segoe UI Light"/>
+        </w:rPr>
+        <w:t>-</w:t>
+      </w:r>
+      <w:r>
+        <w:rPr>
+          <w:rFonts w:ascii="Segoe UI Light" w:hAnsi="Segoe UI Light" w:cs="Segoe UI Light"/>
+        </w:rPr>
+        <w:t>assessable problem questions, or to evaluate their answers to non-assessable problem questions.</w:t>
+      </w:r>
+    </w:p>
+    <w:p>
+      <w:pPr>
+        <w:jc w:val="both"/>
+        <w:rPr>
+          <w:rFonts w:ascii="Segoe UI Light" w:hAnsi="Segoe UI Light" w:cs="Segoe UI Light"/>
+        </w:rPr>
+      </w:pPr>
+    </w:p>
+    <w:p>
+      <w:pPr>
+        <w:jc w:val="both"/>
+        <w:rPr>
+          <w:rFonts w:ascii="Segoe UI Light" w:hAnsi="Segoe UI Light" w:cs="Segoe UI Light"/>
+        </w:rPr>
+      </w:pPr>
+      <w:r>
+        <w:rPr>
+          <w:rFonts w:ascii="Segoe UI Light" w:hAnsi="Segoe UI Light" w:cs="Segoe UI Light"/>
+        </w:rPr>
+        <w:t>Permitted uses of generative AI are not necessarily recommended. Direct engagement with primary sources and your own analysis will yield the deepest learning and the most reliable</w:t>
+      </w:r>
+      <w:r>
+        <w:rPr>
+          <w:rFonts w:ascii="Segoe UI Light" w:hAnsi="Segoe UI Light" w:cs="Segoe UI Light"/>
+        </w:rPr>
+        <w:t xml:space="preserve"> </w:t>
+      </w:r>
+      <w:r>
+        <w:rPr>
+          <w:rFonts w:ascii="Segoe UI Light" w:hAnsi="Segoe UI Light" w:cs="Segoe UI Light"/>
+        </w:rPr>
+        <w:t>work product. AI may serve as a useful complement—helping to clarify, organize, or refine</w:t>
+      </w:r>
+      <w:r>
+        <w:rPr>
+          <w:rFonts w:ascii="Segoe UI Light" w:hAnsi="Segoe UI Light" w:cs="Segoe UI Light"/>
+        </w:rPr>
+        <w:t xml:space="preserve"> </w:t>
+      </w:r>
+      <w:r>
+        <w:rPr>
+          <w:rFonts w:ascii="Segoe UI Light" w:hAnsi="Segoe UI Light" w:cs="Segoe UI Light"/>
+        </w:rPr>
+        <w:t>ideas—but it should be employed thoughtfully and never as a substitute for the skills this course is designed to develop</w:t>
+      </w:r>
+      <w:r>
+        <w:rPr>
+          <w:rFonts w:ascii="Segoe UI Light" w:hAnsi="Segoe UI Light" w:cs="Segoe UI Light"/>
+        </w:rPr>
+        <w:t>.</w:t>
+      </w:r>
+    </w:p>
     <w:p>
       <w:pPr>
         <w:rPr>
@@ -8697,7 +9281,7 @@
 </file>
 
 <file path=word/numbering.xml><?xml version="1.0" encoding="utf-8"?>
-<w:numbering xmlns:wpc="http://schemas.microsoft.com/office/word/2010/wordprocessingCanvas" xmlns:cx="http://schemas.microsoft.com/office/drawing/2014/chartex" xmlns:cx1="http://schemas.microsoft.com/office/drawing/2015/9/8/chartex" xmlns:cx2="http://schemas.microsoft.com/office/drawing/2015/10/21/chartex" xmlns:cx3="http://schemas.microsoft.com/office/drawing/2016/5/9/chartex" xmlns:cx4="http://schemas.microsoft.com/office/drawing/2016/5/10/chartex" xmlns:cx5="http://schemas.microsoft.com/office/drawing/2016/5/11/chartex" xmlns:cx6="http://schemas.microsoft.com/office/drawing/2016/5/12/chartex" xmlns:cx7="http://schemas.microsoft.com/office/drawing/2016/5/13/chartex" xmlns:cx8="http://schemas.microsoft.com/office/drawing/2016/5/14/chartex" xmlns:mc="http://schemas.openxmlformats.org/markup-compatibility/2006" xmlns:aink="http://schemas.microsoft.com/office/drawing/2016/ink" xmlns:am3d="http://schemas.microsoft.com/office/drawing/2017/model3d" xmlns:o="urn:schemas-microsoft-com:office:office" xmlns:oel="http://schemas.microsoft.com/office/2019/extlst" xmlns:r="http://schemas.openxmlformats.org/officeDocument/2006/relationships" xmlns:m="http://schemas.openxmlformats.org/officeDocument/2006/math" xmlns:v="urn:schemas-microsoft-com:vml" xmlns:wp14="http://schemas.microsoft.com/office/word/2010/wordprocessingDrawing" xmlns:wp="http://schemas.openxmlformats.org/drawingml/2006/wordprocessingDrawing" xmlns:w10="urn:schemas-microsoft-com:office:word" xmlns:w="http://schemas.openxmlformats.org/wordprocessingml/2006/main" xmlns:w14="http://schemas.microsoft.com/office/word/2010/wordml" xmlns:w15="http://schemas.microsoft.com/office/word/2012/wordml" xmlns:w16cex="http://schemas.microsoft.com/office/word/2018/wordml/cex" xmlns:w16cid="http://schemas.microsoft.com/office/word/2016/wordml/cid" xmlns:w16="http://schemas.microsoft.com/office/word/2018/wordml" xmlns:w16du="http://schemas.microsoft.com/office/word/2023/wordml/word16du" xmlns:w16sdtdh="http://schemas.microsoft.com/office/word/2020/wordml/sdtdatahash" xmlns:w16se="http://schemas.microsoft.com/office/word/2015/wordml/symex" xmlns:wpg="http://schemas.microsoft.com/office/word/2010/wordprocessingGroup" xmlns:wpi="http://schemas.microsoft.com/office/word/2010/wordprocessingInk" xmlns:wne="http://schemas.microsoft.com/office/word/2006/wordml" xmlns:wps="http://schemas.microsoft.com/office/word/2010/wordprocessingShape" mc:Ignorable="w14 w15 w16se w16cid w16 w16cex w16sdtdh w16du wp14">
+<w:numbering xmlns:wpc="http://schemas.microsoft.com/office/word/2010/wordprocessingCanvas" xmlns:cx="http://schemas.microsoft.com/office/drawing/2014/chartex" xmlns:cx1="http://schemas.microsoft.com/office/drawing/2015/9/8/chartex" xmlns:cx2="http://schemas.microsoft.com/office/drawing/2015/10/21/chartex" xmlns:cx3="http://schemas.microsoft.com/office/drawing/2016/5/9/chartex" xmlns:cx4="http://schemas.microsoft.com/office/drawing/2016/5/10/chartex" xmlns:cx5="http://schemas.microsoft.com/office/drawing/2016/5/11/chartex" xmlns:cx6="http://schemas.microsoft.com/office/drawing/2016/5/12/chartex" xmlns:cx7="http://schemas.microsoft.com/office/drawing/2016/5/13/chartex" xmlns:cx8="http://schemas.microsoft.com/office/drawing/2016/5/14/chartex" xmlns:mc="http://schemas.openxmlformats.org/markup-compatibility/2006" xmlns:aink="http://schemas.microsoft.com/office/drawing/2016/ink" xmlns:am3d="http://schemas.microsoft.com/office/drawing/2017/model3d" xmlns:o="urn:schemas-microsoft-com:office:office" xmlns:oel="http://schemas.microsoft.com/office/2019/extlst" xmlns:r="http://schemas.openxmlformats.org/officeDocument/2006/relationships" xmlns:m="http://schemas.openxmlformats.org/officeDocument/2006/math" xmlns:v="urn:schemas-microsoft-com:vml" xmlns:wp14="http://schemas.microsoft.com/office/word/2010/wordprocessingDrawing" xmlns:wp="http://schemas.openxmlformats.org/drawingml/2006/wordprocessingDrawing" xmlns:w10="urn:schemas-microsoft-com:office:word" xmlns:w="http://schemas.openxmlformats.org/wordprocessingml/2006/main" xmlns:w14="http://schemas.microsoft.com/office/word/2010/wordml" xmlns:w15="http://schemas.microsoft.com/office/word/2012/wordml" xmlns:w16cex="http://schemas.microsoft.com/office/word/2018/wordml/cex" xmlns:w16cid="http://schemas.microsoft.com/office/word/2016/wordml/cid" xmlns:w16="http://schemas.microsoft.com/office/word/2018/wordml" xmlns:w16du="http://schemas.microsoft.com/office/word/2023/wordml/word16du" xmlns:w16sdtdh="http://schemas.microsoft.com/office/word/2020/wordml/sdtdatahash" xmlns:w16sdtfl="http://schemas.microsoft.com/office/word/2024/wordml/sdtformatlock" xmlns:w16se="http://schemas.microsoft.com/office/word/2015/wordml/symex" xmlns:wpg="http://schemas.microsoft.com/office/word/2010/wordprocessingGroup" xmlns:wpi="http://schemas.microsoft.com/office/word/2010/wordprocessingInk" xmlns:wne="http://schemas.microsoft.com/office/word/2006/wordml" xmlns:wps="http://schemas.microsoft.com/office/word/2010/wordprocessingShape" mc:Ignorable="w14 w15 w16se w16cid w16 w16cex w16sdtdh w16sdtfl w16du wp14">
   <w:abstractNum w:abstractNumId="0" w15:restartNumberingAfterBreak="0">
     <w:nsid w:val="827B1D55"/>
     <w:multiLevelType w:val="hybridMultilevel"/>
@@ -9679,6 +10263,95 @@
     </w:lvl>
   </w:abstractNum>
   <w:abstractNum w:abstractNumId="18" w15:restartNumberingAfterBreak="0">
+    <w:nsid w:val="0B543AA9"/>
+    <w:multiLevelType w:val="hybridMultilevel"/>
+    <w:tmpl w:val="30B61272"/>
+    <w:lvl w:ilvl="0" w:tplc="19E025B0">
+      <w:start w:val="1"/>
+      <w:numFmt w:val="lowerRoman"/>
+      <w:lvlText w:val="(%1)"/>
+      <w:lvlJc w:val="left"/>
+      <w:pPr>
+        <w:ind w:left="1080" w:hanging="720"/>
+      </w:pPr>
+      <w:rPr>
+        <w:rFonts w:hint="default"/>
+      </w:rPr>
+    </w:lvl>
+    <w:lvl w:ilvl="1" w:tplc="04090019" w:tentative="1">
+      <w:start w:val="1"/>
+      <w:numFmt w:val="lowerLetter"/>
+      <w:lvlText w:val="%2."/>
+      <w:lvlJc w:val="left"/>
+      <w:pPr>
+        <w:ind w:left="1440" w:hanging="360"/>
+      </w:pPr>
+    </w:lvl>
+    <w:lvl w:ilvl="2" w:tplc="0409001B" w:tentative="1">
+      <w:start w:val="1"/>
+      <w:numFmt w:val="lowerRoman"/>
+      <w:lvlText w:val="%3."/>
+      <w:lvlJc w:val="right"/>
+      <w:pPr>
+        <w:ind w:left="2160" w:hanging="180"/>
+      </w:pPr>
+    </w:lvl>
+    <w:lvl w:ilvl="3" w:tplc="0409000F" w:tentative="1">
+      <w:start w:val="1"/>
+      <w:numFmt w:val="decimal"/>
+      <w:lvlText w:val="%4."/>
+      <w:lvlJc w:val="left"/>
+      <w:pPr>
+        <w:ind w:left="2880" w:hanging="360"/>
+      </w:pPr>
+    </w:lvl>
+    <w:lvl w:ilvl="4" w:tplc="04090019" w:tentative="1">
+      <w:start w:val="1"/>
+      <w:numFmt w:val="lowerLetter"/>
+      <w:lvlText w:val="%5."/>
+      <w:lvlJc w:val="left"/>
+      <w:pPr>
+        <w:ind w:left="3600" w:hanging="360"/>
+      </w:pPr>
+    </w:lvl>
+    <w:lvl w:ilvl="5" w:tplc="0409001B" w:tentative="1">
+      <w:start w:val="1"/>
+      <w:numFmt w:val="lowerRoman"/>
+      <w:lvlText w:val="%6."/>
+      <w:lvlJc w:val="right"/>
+      <w:pPr>
+        <w:ind w:left="4320" w:hanging="180"/>
+      </w:pPr>
+    </w:lvl>
+    <w:lvl w:ilvl="6" w:tplc="0409000F" w:tentative="1">
+      <w:start w:val="1"/>
+      <w:numFmt w:val="decimal"/>
+      <w:lvlText w:val="%7."/>
+      <w:lvlJc w:val="left"/>
+      <w:pPr>
+        <w:ind w:left="5040" w:hanging="360"/>
+      </w:pPr>
+    </w:lvl>
+    <w:lvl w:ilvl="7" w:tplc="04090019" w:tentative="1">
+      <w:start w:val="1"/>
+      <w:numFmt w:val="lowerLetter"/>
+      <w:lvlText w:val="%8."/>
+      <w:lvlJc w:val="left"/>
+      <w:pPr>
+        <w:ind w:left="5760" w:hanging="360"/>
+      </w:pPr>
+    </w:lvl>
+    <w:lvl w:ilvl="8" w:tplc="0409001B" w:tentative="1">
+      <w:start w:val="1"/>
+      <w:numFmt w:val="lowerRoman"/>
+      <w:lvlText w:val="%9."/>
+      <w:lvlJc w:val="right"/>
+      <w:pPr>
+        <w:ind w:left="6480" w:hanging="180"/>
+      </w:pPr>
+    </w:lvl>
+  </w:abstractNum>
+  <w:abstractNum w:abstractNumId="19" w15:restartNumberingAfterBreak="0">
     <w:nsid w:val="0CD01A70"/>
     <w:multiLevelType w:val="hybridMultilevel"/>
     <w:tmpl w:val="FFFFFFFF"/>
@@ -9729,7 +10402,7 @@
       <w:lvlJc w:val="left"/>
     </w:lvl>
   </w:abstractNum>
-  <w:abstractNum w:abstractNumId="19" w15:restartNumberingAfterBreak="0">
+  <w:abstractNum w:abstractNumId="20" w15:restartNumberingAfterBreak="0">
     <w:nsid w:val="12C070EC"/>
     <w:multiLevelType w:val="hybridMultilevel"/>
     <w:tmpl w:val="FFFFFFFF"/>
@@ -9780,7 +10453,7 @@
       <w:lvlJc w:val="left"/>
     </w:lvl>
   </w:abstractNum>
-  <w:abstractNum w:abstractNumId="20" w15:restartNumberingAfterBreak="0">
+  <w:abstractNum w:abstractNumId="21" w15:restartNumberingAfterBreak="0">
     <w:nsid w:val="288A6542"/>
     <w:multiLevelType w:val="hybridMultilevel"/>
     <w:tmpl w:val="FFFFFFFF"/>
@@ -9831,7 +10504,7 @@
       <w:lvlJc w:val="left"/>
     </w:lvl>
   </w:abstractNum>
-  <w:abstractNum w:abstractNumId="21" w15:restartNumberingAfterBreak="0">
+  <w:abstractNum w:abstractNumId="22" w15:restartNumberingAfterBreak="0">
     <w:nsid w:val="2A03796E"/>
     <w:multiLevelType w:val="hybridMultilevel"/>
     <w:tmpl w:val="2CB8D49C"/>
@@ -9944,7 +10617,7 @@
       </w:rPr>
     </w:lvl>
   </w:abstractNum>
-  <w:abstractNum w:abstractNumId="22" w15:restartNumberingAfterBreak="0">
+  <w:abstractNum w:abstractNumId="23" w15:restartNumberingAfterBreak="0">
     <w:nsid w:val="40700879"/>
     <w:multiLevelType w:val="hybridMultilevel"/>
     <w:tmpl w:val="FFFFFFFF"/>
@@ -9995,7 +10668,7 @@
       <w:lvlJc w:val="left"/>
     </w:lvl>
   </w:abstractNum>
-  <w:abstractNum w:abstractNumId="23" w15:restartNumberingAfterBreak="0">
+  <w:abstractNum w:abstractNumId="24" w15:restartNumberingAfterBreak="0">
     <w:nsid w:val="466E750D"/>
     <w:multiLevelType w:val="hybridMultilevel"/>
     <w:tmpl w:val="FFFFFFFF"/>
@@ -10046,7 +10719,7 @@
       <w:lvlJc w:val="left"/>
     </w:lvl>
   </w:abstractNum>
-  <w:abstractNum w:abstractNumId="24" w15:restartNumberingAfterBreak="0">
+  <w:abstractNum w:abstractNumId="25" w15:restartNumberingAfterBreak="0">
     <w:nsid w:val="492066DA"/>
     <w:multiLevelType w:val="hybridMultilevel"/>
     <w:tmpl w:val="FFFFFFFF"/>
@@ -10097,7 +10770,7 @@
       <w:lvlJc w:val="left"/>
     </w:lvl>
   </w:abstractNum>
-  <w:abstractNum w:abstractNumId="25" w15:restartNumberingAfterBreak="0">
+  <w:abstractNum w:abstractNumId="26" w15:restartNumberingAfterBreak="0">
     <w:nsid w:val="4A70BAC7"/>
     <w:multiLevelType w:val="hybridMultilevel"/>
     <w:tmpl w:val="FFFFFFFF"/>
@@ -10148,7 +10821,7 @@
       <w:lvlJc w:val="left"/>
     </w:lvl>
   </w:abstractNum>
-  <w:abstractNum w:abstractNumId="26" w15:restartNumberingAfterBreak="0">
+  <w:abstractNum w:abstractNumId="27" w15:restartNumberingAfterBreak="0">
     <w:nsid w:val="664065C0"/>
     <w:multiLevelType w:val="hybridMultilevel"/>
     <w:tmpl w:val="4DD8C268"/>
@@ -10261,7 +10934,7 @@
       </w:rPr>
     </w:lvl>
   </w:abstractNum>
-  <w:abstractNum w:abstractNumId="27" w15:restartNumberingAfterBreak="0">
+  <w:abstractNum w:abstractNumId="28" w15:restartNumberingAfterBreak="0">
     <w:nsid w:val="72214258"/>
     <w:multiLevelType w:val="hybridMultilevel"/>
     <w:tmpl w:val="FFFFFFFF"/>
@@ -10312,7 +10985,7 @@
       <w:lvlJc w:val="left"/>
     </w:lvl>
   </w:abstractNum>
-  <w:abstractNum w:abstractNumId="28" w15:restartNumberingAfterBreak="0">
+  <w:abstractNum w:abstractNumId="29" w15:restartNumberingAfterBreak="0">
     <w:nsid w:val="79B32AF7"/>
     <w:multiLevelType w:val="hybridMultilevel"/>
     <w:tmpl w:val="0A0A73C8"/>
@@ -10425,7 +11098,7 @@
       </w:rPr>
     </w:lvl>
   </w:abstractNum>
-  <w:abstractNum w:abstractNumId="29" w15:restartNumberingAfterBreak="0">
+  <w:abstractNum w:abstractNumId="30" w15:restartNumberingAfterBreak="0">
     <w:nsid w:val="7FEB524D"/>
     <w:multiLevelType w:val="hybridMultilevel"/>
     <w:tmpl w:val="FFFFFFFF"/>
@@ -10483,19 +11156,19 @@
     <w:abstractNumId w:val="5"/>
   </w:num>
   <w:num w:numId="3" w16cid:durableId="1398632627">
-    <w:abstractNumId w:val="27"/>
+    <w:abstractNumId w:val="28"/>
   </w:num>
   <w:num w:numId="4" w16cid:durableId="1695381357">
     <w:abstractNumId w:val="1"/>
   </w:num>
   <w:num w:numId="5" w16cid:durableId="1749427346">
-    <w:abstractNumId w:val="24"/>
+    <w:abstractNumId w:val="25"/>
   </w:num>
   <w:num w:numId="6" w16cid:durableId="738213546">
     <w:abstractNumId w:val="4"/>
   </w:num>
   <w:num w:numId="7" w16cid:durableId="912474372">
-    <w:abstractNumId w:val="29"/>
+    <w:abstractNumId w:val="30"/>
   </w:num>
   <w:num w:numId="8" w16cid:durableId="1825125678">
     <w:abstractNumId w:val="10"/>
@@ -10504,13 +11177,13 @@
     <w:abstractNumId w:val="0"/>
   </w:num>
   <w:num w:numId="10" w16cid:durableId="1078669412">
-    <w:abstractNumId w:val="23"/>
+    <w:abstractNumId w:val="24"/>
   </w:num>
   <w:num w:numId="11" w16cid:durableId="759521766">
     <w:abstractNumId w:val="14"/>
   </w:num>
   <w:num w:numId="12" w16cid:durableId="2096978796">
-    <w:abstractNumId w:val="22"/>
+    <w:abstractNumId w:val="23"/>
   </w:num>
   <w:num w:numId="13" w16cid:durableId="90012613">
     <w:abstractNumId w:val="7"/>
@@ -10525,7 +11198,7 @@
     <w:abstractNumId w:val="12"/>
   </w:num>
   <w:num w:numId="17" w16cid:durableId="1540237107">
-    <w:abstractNumId w:val="18"/>
+    <w:abstractNumId w:val="19"/>
   </w:num>
   <w:num w:numId="18" w16cid:durableId="1186404602">
     <w:abstractNumId w:val="13"/>
@@ -10534,13 +11207,13 @@
     <w:abstractNumId w:val="2"/>
   </w:num>
   <w:num w:numId="20" w16cid:durableId="33432338">
-    <w:abstractNumId w:val="25"/>
+    <w:abstractNumId w:val="26"/>
   </w:num>
   <w:num w:numId="21" w16cid:durableId="692806042">
     <w:abstractNumId w:val="3"/>
   </w:num>
   <w:num w:numId="22" w16cid:durableId="705178037">
-    <w:abstractNumId w:val="20"/>
+    <w:abstractNumId w:val="21"/>
   </w:num>
   <w:num w:numId="23" w16cid:durableId="1046880945">
     <w:abstractNumId w:val="15"/>
@@ -10552,25 +11225,28 @@
     <w:abstractNumId w:val="8"/>
   </w:num>
   <w:num w:numId="26" w16cid:durableId="1908805128">
-    <w:abstractNumId w:val="19"/>
+    <w:abstractNumId w:val="20"/>
   </w:num>
   <w:num w:numId="27" w16cid:durableId="1394037264">
-    <w:abstractNumId w:val="28"/>
+    <w:abstractNumId w:val="29"/>
   </w:num>
   <w:num w:numId="28" w16cid:durableId="1734813672">
     <w:abstractNumId w:val="17"/>
   </w:num>
   <w:num w:numId="29" w16cid:durableId="527453485">
-    <w:abstractNumId w:val="26"/>
+    <w:abstractNumId w:val="27"/>
   </w:num>
   <w:num w:numId="30" w16cid:durableId="471794648">
-    <w:abstractNumId w:val="21"/>
+    <w:abstractNumId w:val="22"/>
+  </w:num>
+  <w:num w:numId="31" w16cid:durableId="2037920494">
+    <w:abstractNumId w:val="18"/>
   </w:num>
 </w:numbering>
 </file>
 
 <file path=word/styles.xml><?xml version="1.0" encoding="utf-8"?>
-<w:styles xmlns:mc="http://schemas.openxmlformats.org/markup-compatibility/2006" xmlns:r="http://schemas.openxmlformats.org/officeDocument/2006/relationships" xmlns:w="http://schemas.openxmlformats.org/wordprocessingml/2006/main" xmlns:w14="http://schemas.microsoft.com/office/word/2010/wordml" xmlns:w15="http://schemas.microsoft.com/office/word/2012/wordml" xmlns:w16cex="http://schemas.microsoft.com/office/word/2018/wordml/cex" xmlns:w16cid="http://schemas.microsoft.com/office/word/2016/wordml/cid" xmlns:w16="http://schemas.microsoft.com/office/word/2018/wordml" xmlns:w16du="http://schemas.microsoft.com/office/word/2023/wordml/word16du" xmlns:w16sdtdh="http://schemas.microsoft.com/office/word/2020/wordml/sdtdatahash" xmlns:w16se="http://schemas.microsoft.com/office/word/2015/wordml/symex" mc:Ignorable="w14 w15 w16se w16cid w16 w16cex w16sdtdh w16du">
+<w:styles xmlns:mc="http://schemas.openxmlformats.org/markup-compatibility/2006" xmlns:r="http://schemas.openxmlformats.org/officeDocument/2006/relationships" xmlns:w="http://schemas.openxmlformats.org/wordprocessingml/2006/main" xmlns:w14="http://schemas.microsoft.com/office/word/2010/wordml" xmlns:w15="http://schemas.microsoft.com/office/word/2012/wordml" xmlns:w16cex="http://schemas.microsoft.com/office/word/2018/wordml/cex" xmlns:w16cid="http://schemas.microsoft.com/office/word/2016/wordml/cid" xmlns:w16="http://schemas.microsoft.com/office/word/2018/wordml" xmlns:w16du="http://schemas.microsoft.com/office/word/2023/wordml/word16du" xmlns:w16sdtdh="http://schemas.microsoft.com/office/word/2020/wordml/sdtdatahash" xmlns:w16sdtfl="http://schemas.microsoft.com/office/word/2024/wordml/sdtformatlock" xmlns:w16se="http://schemas.microsoft.com/office/word/2015/wordml/symex" mc:Ignorable="w14 w15 w16se w16cid w16 w16cex w16sdtdh w16sdtfl w16du">
   <w:docDefaults>
     <w:rPrDefault>
       <w:rPr>
@@ -11205,6 +11881,17 @@
       </w:tcPr>
     </w:tblStylePr>
   </w:style>
+  <w:style w:type="paragraph" w:styleId="ListParagraph">
+    <w:name w:val="List Paragraph"/>
+    <w:basedOn w:val="Normal"/>
+    <w:uiPriority w:val="34"/>
+    <w:qFormat/>
+    <w:rsid w:val="00D728A2"/>
+    <w:pPr>
+      <w:ind w:left="720"/>
+      <w:contextualSpacing/>
+    </w:pPr>
+  </w:style>
 </w:styles>
 </file>
 

</xml_diff>